<commit_message>
Release 1.3.0: QR codes for 2FA and guest link, one-click HTTPS, Plex token from XML address, colour themes, zip threshold, one-at-a-time renaming; fix 2FA setup wiped by re-render
</commit_message>
<xml_diff>
--- a/docs/MediaLedger-Manual.docx
+++ b/docs/MediaLedger-Manual.docx
@@ -42,7 +42,7 @@
           <w:sz w:val="24"/>
           <w:szCs w:val="24"/>
         </w:rPr>
-        <w:t xml:space="preserve">Version 1.2.2</w:t>
+        <w:t xml:space="preserve">Version 1.3.0</w:t>
       </w:r>
     </w:p>
     <w:p>
@@ -688,6 +688,21 @@
     <w:p>
       <w:pPr>
         <w:spacing w:after="40"/>
+        <w:ind w:left="540"/>
+      </w:pPr>
+      <w:r>
+        <w:rPr>
+          <w:b w:val="false"/>
+          <w:bCs w:val="false"/>
+          <w:sz w:val="20"/>
+          <w:szCs w:val="20"/>
+        </w:rPr>
+        <w:t xml:space="preserve">18.1 Appearance</w:t>
+      </w:r>
+    </w:p>
+    <w:p>
+      <w:pPr>
+        <w:spacing w:after="40"/>
         <w:ind w:left="0"/>
       </w:pPr>
       <w:r>
@@ -818,6 +833,36 @@
           <w:szCs w:val="20"/>
         </w:rPr>
         <w:t xml:space="preserve">21.3 Controls</w:t>
+      </w:r>
+    </w:p>
+    <w:p>
+      <w:pPr>
+        <w:spacing w:after="40"/>
+        <w:ind w:left="540"/>
+      </w:pPr>
+      <w:r>
+        <w:rPr>
+          <w:b w:val="false"/>
+          <w:bCs w:val="false"/>
+          <w:sz w:val="20"/>
+          <w:szCs w:val="20"/>
+        </w:rPr>
+        <w:t xml:space="preserve">21.4 Two-factor codes with a phone</w:t>
+      </w:r>
+    </w:p>
+    <w:p>
+      <w:pPr>
+        <w:spacing w:after="40"/>
+        <w:ind w:left="540"/>
+      </w:pPr>
+      <w:r>
+        <w:rPr>
+          <w:b w:val="false"/>
+          <w:bCs w:val="false"/>
+          <w:sz w:val="20"/>
+          <w:szCs w:val="20"/>
+        </w:rPr>
+        <w:t xml:space="preserve">21.5 HTTPS</w:t>
       </w:r>
     </w:p>
     <w:p>
@@ -7836,6 +7881,72 @@
     </w:p>
     <w:p>
       <w:pPr>
+        <w:pStyle w:val="Heading3"/>
+      </w:pPr>
+      <w:r>
+        <w:t xml:space="preserve">One at a time</w:t>
+      </w:r>
+    </w:p>
+    <w:p>
+      <w:pPr>
+        <w:spacing w:after="120"/>
+      </w:pPr>
+      <w:r>
+        <w:t xml:space="preserve">If a big batch feels like too much trust, do not use it. Every ready row has a </w:t>
+      </w:r>
+      <w:r>
+        <w:rPr>
+          <w:b/>
+          <w:bCs/>
+        </w:rPr>
+        <w:t xml:space="preserve">Rename</w:t>
+      </w:r>
+      <w:r>
+        <w:t xml:space="preserve"> button that renames just that file, and </w:t>
+      </w:r>
+      <w:r>
+        <w:rPr>
+          <w:b/>
+          <w:bCs/>
+        </w:rPr>
+        <w:t xml:space="preserve">One at a time (N)</w:t>
+      </w:r>
+      <w:r>
+        <w:t xml:space="preserve"> walks through the ticked files in a dialog that shows the current and proposed name and asks </w:t>
+      </w:r>
+      <w:r>
+        <w:rPr>
+          <w:b/>
+          <w:bCs/>
+        </w:rPr>
+        <w:t xml:space="preserve">Rename this file</w:t>
+      </w:r>
+      <w:r>
+        <w:t xml:space="preserve">, </w:t>
+      </w:r>
+      <w:r>
+        <w:rPr>
+          <w:b/>
+          <w:bCs/>
+        </w:rPr>
+        <w:t xml:space="preserve">Skip</w:t>
+      </w:r>
+      <w:r>
+        <w:t xml:space="preserve"> or </w:t>
+      </w:r>
+      <w:r>
+        <w:rPr>
+          <w:b/>
+          <w:bCs/>
+        </w:rPr>
+        <w:t xml:space="preserve">Stop</w:t>
+      </w:r>
+      <w:r>
+        <w:t xml:space="preserve"> for each. Every confirmed file runs as its own one-file batch through the same pre-flight, verification and journal, so it appears in the Batches table and can be undone on its own. The live switch must still be on.</w:t>
+      </w:r>
+    </w:p>
+    <w:p>
+      <w:pPr>
         <w:pStyle w:val="Heading2"/>
       </w:pPr>
       <w:r>
@@ -8082,7 +8193,27 @@
         <w:spacing w:after="120"/>
       </w:pPr>
       <w:r>
-        <w:t xml:space="preserve">A simpler tool for episodes. It is </w:t>
+        <w:t xml:space="preserve">The same one-at-a-time scheme as the movie tool applies here: a </w:t>
+      </w:r>
+      <w:r>
+        <w:rPr>
+          <w:b/>
+          <w:bCs/>
+        </w:rPr>
+        <w:t xml:space="preserve">Rename</w:t>
+      </w:r>
+      <w:r>
+        <w:t xml:space="preserve"> button per row and </w:t>
+      </w:r>
+      <w:r>
+        <w:rPr>
+          <w:b/>
+          <w:bCs/>
+        </w:rPr>
+        <w:t xml:space="preserve">One at a time</w:t>
+      </w:r>
+      <w:r>
+        <w:t xml:space="preserve"> for the ticked files, each confirmed separately. A simpler tool for episodes. It is </w:t>
       </w:r>
       <w:r>
         <w:rPr>
@@ -8299,7 +8430,17 @@
         <w:t xml:space="preserve">latest\medialedger-latest.zip</w:t>
       </w:r>
       <w:r>
-        <w:t xml:space="preserve">. The archive is written by MediaLedger itself; no extra software is needed.</w:t>
+        <w:t xml:space="preserve">. The archive is written by MediaLedger itself; no extra software is needed. The </w:t>
+      </w:r>
+      <w:r>
+        <w:rPr>
+          <w:b/>
+          <w:bCs/>
+        </w:rPr>
+        <w:t xml:space="preserve">when at least N files</w:t>
+      </w:r>
+      <w:r>
+        <w:t xml:space="preserve"> box beside it skips the zip for small exports: with the default of 4, ticking only the change log gives a bare CSV, ticking everything gives the zip too.</w:t>
       </w:r>
     </w:p>
     <w:p>
@@ -8834,6 +8975,29 @@
         <w:pStyle w:val="Heading2"/>
       </w:pPr>
       <w:r>
+        <w:t xml:space="preserve">18.1 Appearance</w:t>
+      </w:r>
+    </w:p>
+    <w:p>
+      <w:pPr>
+        <w:spacing w:after="120"/>
+      </w:pPr>
+      <w:r>
+        <w:rPr>
+          <w:b/>
+          <w:bCs/>
+        </w:rPr>
+        <w:t xml:space="preserve">Colour theme</w:t>
+      </w:r>
+      <w:r>
+        <w:t xml:space="preserve"> switches the whole app between a few palettes and applies at once. The choice is remembered in the browser (or the desktop app) you set it in, not on the server, so every device and every person can have their own.</w:t>
+      </w:r>
+    </w:p>
+    <w:p>
+      <w:pPr>
+        <w:pStyle w:val="Heading2"/>
+      </w:pPr>
+      <w:r>
         <w:t xml:space="preserve">Library roots</w:t>
       </w:r>
     </w:p>
@@ -9271,7 +9435,7 @@
         <w:spacing w:after="60"/>
       </w:pPr>
       <w:r>
-        <w:t xml:space="preserve">The page that opens has </w:t>
+        <w:t xml:space="preserve">A new tab opens showing XML. Copy its whole address from the browser's address bar; it ends in </w:t>
       </w:r>
       <w:r>
         <w:rPr>
@@ -9280,10 +9444,10 @@
           <w:szCs w:val="19"/>
           <w:shd w:fill="EEF1F5" w:val="clear"/>
         </w:rPr>
-        <w:t xml:space="preserve">X-Plex-Token=</w:t>
-      </w:r>
-      <w:r>
-        <w:t xml:space="preserve"> at the end of its address. Copy the value after the equals sign. Do not share it; it grants access to your server.</w:t>
+        <w:t xml:space="preserve">X-Plex-Token=…</w:t>
+      </w:r>
+      <w:r>
+        <w:t xml:space="preserve">. Do not share it; it grants access to your server.</w:t>
       </w:r>
     </w:p>
     <w:p>
@@ -9296,7 +9460,17 @@
         <w:spacing w:after="60"/>
       </w:pPr>
       <w:r>
-        <w:t xml:space="preserve">In MediaLedger, Settings → Plex: enter the server URL (for Plex on the NAS, </w:t>
+        <w:t xml:space="preserve">In MediaLedger, Settings → Plex, paste that address into </w:t>
+      </w:r>
+      <w:r>
+        <w:rPr>
+          <w:b/>
+          <w:bCs/>
+        </w:rPr>
+        <w:t xml:space="preserve">Paste the XML address</w:t>
+      </w:r>
+      <w:r>
+        <w:t xml:space="preserve">. The token is pulled out into the token field, the server URL is filled in when the address came from your LAN (for Plex on the NAS, </w:t>
       </w:r>
       <w:r>
         <w:rPr>
@@ -9308,7 +9482,7 @@
         <w:t xml:space="preserve">http://192.168.1.204:32400</w:t>
       </w:r>
       <w:r>
-        <w:t xml:space="preserve">), paste the token, press </w:t>
+        <w:t xml:space="preserve">), and the pasted text is discarded. Press </w:t>
       </w:r>
       <w:r>
         <w:rPr>
@@ -11310,7 +11484,43 @@
                 <w:sz w:val="19"/>
                 <w:szCs w:val="19"/>
               </w:rPr>
-              <w:t xml:space="preserve">Ends a session after N minutes without activity. 0 keeps the 30-day limit only.</w:t>
+              <w:t xml:space="preserve">Ends a session after N minutes without activity. 0 keeps the 30-day limit only. The </w:t>
+            </w:r>
+            <w:r>
+              <w:rPr>
+                <w:b w:val="false"/>
+                <w:bCs w:val="false"/>
+                <w:sz w:val="19"/>
+                <w:szCs w:val="19"/>
+              </w:rPr>
+              <w:t xml:space="preserve">Save</w:t>
+            </w:r>
+            <w:r>
+              <w:rPr>
+                <w:b w:val="false"/>
+                <w:bCs w:val="false"/>
+                <w:sz w:val="19"/>
+                <w:szCs w:val="19"/>
+              </w:rPr>
+              <w:t xml:space="preserve"> beside the field and </w:t>
+            </w:r>
+            <w:r>
+              <w:rPr>
+                <w:b w:val="false"/>
+                <w:bCs w:val="false"/>
+                <w:sz w:val="19"/>
+                <w:szCs w:val="19"/>
+              </w:rPr>
+              <w:t xml:space="preserve">Save options</w:t>
+            </w:r>
+            <w:r>
+              <w:rPr>
+                <w:b w:val="false"/>
+                <w:bCs w:val="false"/>
+                <w:sz w:val="19"/>
+                <w:szCs w:val="19"/>
+              </w:rPr>
+              <w:t xml:space="preserve"> below do the same thing.</w:t>
             </w:r>
           </w:p>
         </w:tc>
@@ -11466,27 +11676,117 @@
                 <w:sz w:val="19"/>
                 <w:szCs w:val="19"/>
               </w:rPr>
-              <w:t xml:space="preserve">, add the shown secret (or the </w:t>
-            </w:r>
-            <w:r>
-              <w:rPr>
-                <w:rFonts w:ascii="Consolas" w:cs="Consolas" w:eastAsia="Consolas" w:hAnsi="Consolas"/>
-                <w:b w:val="false"/>
-                <w:bCs w:val="false"/>
-                <w:sz w:val="19"/>
-                <w:szCs w:val="19"/>
-                <w:shd w:fill="EEF1F5" w:val="clear"/>
-              </w:rPr>
-              <w:t xml:space="preserve">otpauth://</w:t>
-            </w:r>
-            <w:r>
-              <w:rPr>
-                <w:b w:val="false"/>
-                <w:bCs w:val="false"/>
-                <w:sz w:val="19"/>
-                <w:szCs w:val="19"/>
-              </w:rPr>
-              <w:t xml:space="preserve"> link) to Google Authenticator, Aegis, Bitwarden, 1Password or any TOTP app, then enter the 6-digit code it shows. From then on sign-in needs password + code. Turning it off needs the password. If you lose the device, see the Pi troubleshooting table.</w:t>
+              <w:t xml:space="preserve">, scan the QR code with an authenticator app and enter the 6-digit code it shows (21.4). From then on admin sign-in needs password + code. Turning it off needs the password. If you lose the device, see the Pi troubleshooting table.</w:t>
+            </w:r>
+          </w:p>
+        </w:tc>
+      </w:tr>
+      <w:tr>
+        <w:tc>
+          <w:tcPr>
+            <w:tcW w:type="dxa" w:w="0"/>
+            <w:tcMar>
+              <w:top w:type="dxa" w:w="60"/>
+              <w:left w:type="dxa" w:w="100"/>
+              <w:bottom w:type="dxa" w:w="60"/>
+              <w:right w:type="dxa" w:w="100"/>
+            </w:tcMar>
+          </w:tcPr>
+          <w:p>
+            <w:r>
+              <w:rPr>
+                <w:b w:val="false"/>
+                <w:bCs w:val="false"/>
+                <w:sz w:val="19"/>
+                <w:szCs w:val="19"/>
+              </w:rPr>
+              <w:t xml:space="preserve">HTTPS</w:t>
+            </w:r>
+          </w:p>
+        </w:tc>
+        <w:tc>
+          <w:tcPr>
+            <w:tcW w:type="dxa" w:w="0"/>
+            <w:tcMar>
+              <w:top w:type="dxa" w:w="60"/>
+              <w:left w:type="dxa" w:w="100"/>
+              <w:bottom w:type="dxa" w:w="60"/>
+              <w:right w:type="dxa" w:w="100"/>
+            </w:tcMar>
+          </w:tcPr>
+          <w:p>
+            <w:r>
+              <w:rPr>
+                <w:b w:val="false"/>
+                <w:bCs w:val="false"/>
+                <w:sz w:val="19"/>
+                <w:szCs w:val="19"/>
+              </w:rPr>
+              <w:t xml:space="preserve">Creates a self-signed certificate and restarts the server on it (21.5). Once on, a </w:t>
+            </w:r>
+            <w:r>
+              <w:rPr>
+                <w:b w:val="false"/>
+                <w:bCs w:val="false"/>
+                <w:sz w:val="19"/>
+                <w:szCs w:val="19"/>
+              </w:rPr>
+              <w:t xml:space="preserve">Download certificate</w:t>
+            </w:r>
+            <w:r>
+              <w:rPr>
+                <w:b w:val="false"/>
+                <w:bCs w:val="false"/>
+                <w:sz w:val="19"/>
+                <w:szCs w:val="19"/>
+              </w:rPr>
+              <w:t xml:space="preserve"> button and per-device instructions replace the switch.</w:t>
+            </w:r>
+          </w:p>
+        </w:tc>
+      </w:tr>
+      <w:tr>
+        <w:tc>
+          <w:tcPr>
+            <w:tcW w:type="dxa" w:w="0"/>
+            <w:tcMar>
+              <w:top w:type="dxa" w:w="60"/>
+              <w:left w:type="dxa" w:w="100"/>
+              <w:bottom w:type="dxa" w:w="60"/>
+              <w:right w:type="dxa" w:w="100"/>
+            </w:tcMar>
+          </w:tcPr>
+          <w:p>
+            <w:r>
+              <w:rPr>
+                <w:b w:val="false"/>
+                <w:bCs w:val="false"/>
+                <w:sz w:val="19"/>
+                <w:szCs w:val="19"/>
+              </w:rPr>
+              <w:t xml:space="preserve">Guest link</w:t>
+            </w:r>
+          </w:p>
+        </w:tc>
+        <w:tc>
+          <w:tcPr>
+            <w:tcW w:type="dxa" w:w="0"/>
+            <w:tcMar>
+              <w:top w:type="dxa" w:w="60"/>
+              <w:left w:type="dxa" w:w="100"/>
+              <w:bottom w:type="dxa" w:w="60"/>
+              <w:right w:type="dxa" w:w="100"/>
+            </w:tcMar>
+          </w:tcPr>
+          <w:p>
+            <w:r>
+              <w:rPr>
+                <w:b w:val="false"/>
+                <w:bCs w:val="false"/>
+                <w:sz w:val="19"/>
+                <w:szCs w:val="19"/>
+              </w:rPr>
+              <w:t xml:space="preserve">Shown once Guest access is on: a QR code of the site address that anyone on the Wi-Fi can scan to open MediaLedger as a guest.</w:t>
             </w:r>
           </w:p>
         </w:tc>
@@ -11722,6 +12022,344 @@
     </w:p>
     <w:p>
       <w:pPr>
+        <w:pStyle w:val="Heading2"/>
+      </w:pPr>
+      <w:r>
+        <w:t xml:space="preserve">21.4 Two-factor codes with a phone</w:t>
+      </w:r>
+    </w:p>
+    <w:p>
+      <w:pPr>
+        <w:pStyle w:val="ListParagraph"/>
+        <w:numPr>
+          <w:ilvl w:val="0"/>
+          <w:numId w:val="7"/>
+        </w:numPr>
+        <w:spacing w:after="60"/>
+      </w:pPr>
+      <w:r>
+        <w:t xml:space="preserve">Install </w:t>
+      </w:r>
+      <w:r>
+        <w:rPr>
+          <w:b/>
+          <w:bCs/>
+        </w:rPr>
+        <w:t xml:space="preserve">Google Authenticator</w:t>
+      </w:r>
+      <w:r>
+        <w:t xml:space="preserve"> (or Aegis, Bitwarden, 1Password, Microsoft Authenticator: any app that does time-based codes) on your phone.</w:t>
+      </w:r>
+    </w:p>
+    <w:p>
+      <w:pPr>
+        <w:pStyle w:val="ListParagraph"/>
+        <w:numPr>
+          <w:ilvl w:val="0"/>
+          <w:numId w:val="7"/>
+        </w:numPr>
+        <w:spacing w:after="60"/>
+      </w:pPr>
+      <w:r>
+        <w:t xml:space="preserve">On the Pi, Security → Two-factor codes → </w:t>
+      </w:r>
+      <w:r>
+        <w:rPr>
+          <w:b/>
+          <w:bCs/>
+        </w:rPr>
+        <w:t xml:space="preserve">Set up 2FA</w:t>
+      </w:r>
+      <w:r>
+        <w:t xml:space="preserve">. A QR code appears.</w:t>
+      </w:r>
+    </w:p>
+    <w:p>
+      <w:pPr>
+        <w:pStyle w:val="ListParagraph"/>
+        <w:numPr>
+          <w:ilvl w:val="0"/>
+          <w:numId w:val="7"/>
+        </w:numPr>
+        <w:spacing w:after="60"/>
+      </w:pPr>
+      <w:r>
+        <w:t xml:space="preserve">In the app tap </w:t>
+      </w:r>
+      <w:r>
+        <w:rPr>
+          <w:b/>
+          <w:bCs/>
+        </w:rPr>
+        <w:t xml:space="preserve">+</w:t>
+      </w:r>
+      <w:r>
+        <w:t xml:space="preserve"> → </w:t>
+      </w:r>
+      <w:r>
+        <w:rPr>
+          <w:b/>
+          <w:bCs/>
+        </w:rPr>
+        <w:t xml:space="preserve">Scan a QR code</w:t>
+      </w:r>
+      <w:r>
+        <w:t xml:space="preserve"> and point the camera at the screen. The app adds an entry named MediaLedger and starts showing a 6-digit code that changes every 30 seconds. No camera? Tap </w:t>
+      </w:r>
+      <w:r>
+        <w:rPr>
+          <w:b/>
+          <w:bCs/>
+        </w:rPr>
+        <w:t xml:space="preserve">Enter a setup key</w:t>
+      </w:r>
+      <w:r>
+        <w:t xml:space="preserve"> and type the secret shown under the code.</w:t>
+      </w:r>
+    </w:p>
+    <w:p>
+      <w:pPr>
+        <w:pStyle w:val="ListParagraph"/>
+        <w:numPr>
+          <w:ilvl w:val="0"/>
+          <w:numId w:val="7"/>
+        </w:numPr>
+        <w:spacing w:after="60"/>
+      </w:pPr>
+      <w:r>
+        <w:t xml:space="preserve">Type the current 6-digit code into the box under the QR and press </w:t>
+      </w:r>
+      <w:r>
+        <w:rPr>
+          <w:b/>
+          <w:bCs/>
+        </w:rPr>
+        <w:t xml:space="preserve">Turn on 2FA</w:t>
+      </w:r>
+      <w:r>
+        <w:t xml:space="preserve">. The server checks it before switching on, so a mistyped secret cannot lock you out.</w:t>
+      </w:r>
+    </w:p>
+    <w:p>
+      <w:pPr>
+        <w:pStyle w:val="ListParagraph"/>
+        <w:numPr>
+          <w:ilvl w:val="0"/>
+          <w:numId w:val="7"/>
+        </w:numPr>
+        <w:spacing w:after="60"/>
+      </w:pPr>
+      <w:r>
+        <w:t xml:space="preserve">From now on the sign-in dialog asks for the code after the password, for admin accounts. Standard users and guests are unaffected.</w:t>
+      </w:r>
+    </w:p>
+    <w:p>
+      <w:pPr>
+        <w:pBdr>
+          <w:left w:val="single" w:color="5AA9FF" w:sz="12" w:space="8"/>
+        </w:pBdr>
+        <w:spacing w:after="160" w:before="60"/>
+        <w:ind w:left="360"/>
+      </w:pPr>
+      <w:r>
+        <w:t xml:space="preserve">The secret lives in </w:t>
+      </w:r>
+      <w:r>
+        <w:rPr>
+          <w:rFonts w:ascii="Consolas" w:cs="Consolas" w:eastAsia="Consolas" w:hAnsi="Consolas"/>
+          <w:sz w:val="19"/>
+          <w:szCs w:val="19"/>
+          <w:shd w:fill="EEF1F5" w:val="clear"/>
+        </w:rPr>
+        <w:t xml:space="preserve">web.json</w:t>
+      </w:r>
+      <w:r>
+        <w:t xml:space="preserve"> on the Pi and in the app on your phone; nothing is sent to Google or anyone else. The Pi clock must be roughly right (</w:t>
+      </w:r>
+      <w:r>
+        <w:rPr>
+          <w:rFonts w:ascii="Consolas" w:cs="Consolas" w:eastAsia="Consolas" w:hAnsi="Consolas"/>
+          <w:sz w:val="19"/>
+          <w:szCs w:val="19"/>
+          <w:shd w:fill="EEF1F5" w:val="clear"/>
+        </w:rPr>
+        <w:t xml:space="preserve">timedatectl</w:t>
+      </w:r>
+      <w:r>
+        <w:t xml:space="preserve">), since the codes are computed from the time.</w:t>
+      </w:r>
+    </w:p>
+    <w:p>
+      <w:pPr>
+        <w:pStyle w:val="Heading2"/>
+      </w:pPr>
+      <w:r>
+        <w:t xml:space="preserve">21.5 HTTPS</w:t>
+      </w:r>
+    </w:p>
+    <w:p>
+      <w:pPr>
+        <w:spacing w:after="120"/>
+      </w:pPr>
+      <w:r>
+        <w:t xml:space="preserve">On a home LAN plain HTTP is normal, and MediaLedger refuses connections from outside the LAN anyway. HTTPS adds encryption between each browser and the Pi, which matters if you do not fully trust every device on the Wi-Fi, and it lets phones add the site as a proper app without warnings. There is no certificate authority for a private LAN name, so MediaLedger makes its own </w:t>
+      </w:r>
+      <w:r>
+        <w:rPr>
+          <w:b/>
+          <w:bCs/>
+        </w:rPr>
+        <w:t xml:space="preserve">self-signed</w:t>
+      </w:r>
+      <w:r>
+        <w:t xml:space="preserve"> certificate; browsers trust it once you install it on each device.</w:t>
+      </w:r>
+    </w:p>
+    <w:p>
+      <w:pPr>
+        <w:pStyle w:val="ListParagraph"/>
+        <w:numPr>
+          <w:ilvl w:val="0"/>
+          <w:numId w:val="8"/>
+        </w:numPr>
+        <w:spacing w:after="60"/>
+      </w:pPr>
+      <w:r>
+        <w:t xml:space="preserve">Security → HTTPS → </w:t>
+      </w:r>
+      <w:r>
+        <w:rPr>
+          <w:b/>
+          <w:bCs/>
+        </w:rPr>
+        <w:t xml:space="preserve">Turn on HTTPS</w:t>
+      </w:r>
+      <w:r>
+        <w:t xml:space="preserve">, then confirm. The server writes a certificate valid for ten years covering every name it answers to (</w:t>
+      </w:r>
+      <w:r>
+        <w:rPr>
+          <w:rFonts w:ascii="Consolas" w:cs="Consolas" w:eastAsia="Consolas" w:hAnsi="Consolas"/>
+          <w:sz w:val="19"/>
+          <w:szCs w:val="19"/>
+          <w:shd w:fill="EEF1F5" w:val="clear"/>
+        </w:rPr>
+        <w:t xml:space="preserve">medialedger.local</w:t>
+      </w:r>
+      <w:r>
+        <w:t xml:space="preserve">, the hostname, your custom domain if the installer was given one, and every LAN address), audits the change, and restarts. Sign-in sessions survive the restart.</w:t>
+      </w:r>
+    </w:p>
+    <w:p>
+      <w:pPr>
+        <w:pStyle w:val="ListParagraph"/>
+        <w:numPr>
+          <w:ilvl w:val="0"/>
+          <w:numId w:val="8"/>
+        </w:numPr>
+        <w:spacing w:after="60"/>
+      </w:pPr>
+      <w:r>
+        <w:t xml:space="preserve">The page reopens on </w:t>
+      </w:r>
+      <w:r>
+        <w:rPr>
+          <w:rFonts w:ascii="Consolas" w:cs="Consolas" w:eastAsia="Consolas" w:hAnsi="Consolas"/>
+          <w:sz w:val="19"/>
+          <w:szCs w:val="19"/>
+          <w:shd w:fill="EEF1F5" w:val="clear"/>
+        </w:rPr>
+        <w:t xml:space="preserve">https://</w:t>
+      </w:r>
+      <w:r>
+        <w:t xml:space="preserve">. If the Pi was installed with </w:t>
+      </w:r>
+      <w:r>
+        <w:rPr>
+          <w:rFonts w:ascii="Consolas" w:cs="Consolas" w:eastAsia="Consolas" w:hAnsi="Consolas"/>
+          <w:sz w:val="19"/>
+          <w:szCs w:val="19"/>
+          <w:shd w:fill="EEF1F5" w:val="clear"/>
+        </w:rPr>
+        <w:t xml:space="preserve">--port=80</w:t>
+      </w:r>
+      <w:r>
+        <w:t xml:space="preserve">, the site moves to port 443 (no port in the address) and port 80 redirects there, so </w:t>
+      </w:r>
+      <w:r>
+        <w:rPr>
+          <w:rFonts w:ascii="Consolas" w:cs="Consolas" w:eastAsia="Consolas" w:hAnsi="Consolas"/>
+          <w:sz w:val="19"/>
+          <w:szCs w:val="19"/>
+          <w:shd w:fill="EEF1F5" w:val="clear"/>
+        </w:rPr>
+        <w:t xml:space="preserve">http://medialedger.home</w:t>
+      </w:r>
+      <w:r>
+        <w:t xml:space="preserve"> keeps working.</w:t>
+      </w:r>
+    </w:p>
+    <w:p>
+      <w:pPr>
+        <w:pStyle w:val="ListParagraph"/>
+        <w:numPr>
+          <w:ilvl w:val="0"/>
+          <w:numId w:val="8"/>
+        </w:numPr>
+        <w:spacing w:after="60"/>
+      </w:pPr>
+      <w:r>
+        <w:t xml:space="preserve">The browser warns that the certificate is not trusted. Either accept the warning for this site, or remove it for good: press </w:t>
+      </w:r>
+      <w:r>
+        <w:rPr>
+          <w:b/>
+          <w:bCs/>
+        </w:rPr>
+        <w:t xml:space="preserve">Download certificate</w:t>
+      </w:r>
+      <w:r>
+        <w:t xml:space="preserve"> and follow the per-device steps under *Removing the browser warning* (Windows: Trusted Root Certification Authorities; Android: install a CA certificate; iPhone: install the profile, then Certificate Trust Settings; macOS: Keychain, Always Trust).</w:t>
+      </w:r>
+    </w:p>
+    <w:p>
+      <w:pPr>
+        <w:pBdr>
+          <w:left w:val="single" w:color="F0B429" w:sz="12" w:space="8"/>
+        </w:pBdr>
+        <w:spacing w:after="160" w:before="60"/>
+        <w:ind w:left="360"/>
+      </w:pPr>
+      <w:r>
+        <w:t xml:space="preserve">Adding a new name for the Pi later (a custom domain, a rename) needs a new certificate: delete </w:t>
+      </w:r>
+      <w:r>
+        <w:rPr>
+          <w:rFonts w:ascii="Consolas" w:cs="Consolas" w:eastAsia="Consolas" w:hAnsi="Consolas"/>
+          <w:sz w:val="19"/>
+          <w:szCs w:val="19"/>
+          <w:shd w:fill="EEF1F5" w:val="clear"/>
+        </w:rPr>
+        <w:t xml:space="preserve">/var/lib/medialedger/tls/</w:t>
+      </w:r>
+      <w:r>
+        <w:t xml:space="preserve"> on the Pi, restart the service, and turn HTTPS on again. Installing the certificate on a device is per device; the file itself is public, only </w:t>
+      </w:r>
+      <w:r>
+        <w:rPr>
+          <w:rFonts w:ascii="Consolas" w:cs="Consolas" w:eastAsia="Consolas" w:hAnsi="Consolas"/>
+          <w:sz w:val="19"/>
+          <w:szCs w:val="19"/>
+          <w:shd w:fill="EEF1F5" w:val="clear"/>
+        </w:rPr>
+        <w:t xml:space="preserve">key.pem</w:t>
+      </w:r>
+      <w:r>
+        <w:t xml:space="preserve"> on the Pi is secret.</w:t>
+      </w:r>
+    </w:p>
+    <w:p>
+      <w:pPr>
         <w:pStyle w:val="Heading1"/>
         <w:pageBreakBefore/>
       </w:pPr>
@@ -12391,7 +13029,7 @@
         <w:pStyle w:val="ListParagraph"/>
         <w:numPr>
           <w:ilvl w:val="0"/>
-          <w:numId w:val="7"/>
+          <w:numId w:val="9"/>
         </w:numPr>
         <w:spacing w:after="60"/>
       </w:pPr>
@@ -12426,7 +13064,7 @@
         <w:pStyle w:val="ListParagraph"/>
         <w:numPr>
           <w:ilvl w:val="0"/>
-          <w:numId w:val="7"/>
+          <w:numId w:val="9"/>
         </w:numPr>
         <w:spacing w:after="60"/>
       </w:pPr>
@@ -12475,7 +13113,7 @@
         <w:pStyle w:val="ListParagraph"/>
         <w:numPr>
           <w:ilvl w:val="0"/>
-          <w:numId w:val="7"/>
+          <w:numId w:val="9"/>
         </w:numPr>
         <w:spacing w:after="60"/>
       </w:pPr>
@@ -12982,7 +13620,7 @@
         <w:pStyle w:val="ListParagraph"/>
         <w:numPr>
           <w:ilvl w:val="0"/>
-          <w:numId w:val="8"/>
+          <w:numId w:val="10"/>
         </w:numPr>
         <w:spacing w:after="60"/>
       </w:pPr>
@@ -13031,7 +13669,7 @@
         <w:pStyle w:val="ListParagraph"/>
         <w:numPr>
           <w:ilvl w:val="0"/>
-          <w:numId w:val="8"/>
+          <w:numId w:val="10"/>
         </w:numPr>
         <w:spacing w:after="60"/>
       </w:pPr>
@@ -13114,7 +13752,7 @@
         <w:pStyle w:val="ListParagraph"/>
         <w:numPr>
           <w:ilvl w:val="0"/>
-          <w:numId w:val="8"/>
+          <w:numId w:val="10"/>
         </w:numPr>
         <w:spacing w:after="60"/>
       </w:pPr>
@@ -13137,7 +13775,7 @@
         <w:pStyle w:val="ListParagraph"/>
         <w:numPr>
           <w:ilvl w:val="0"/>
-          <w:numId w:val="8"/>
+          <w:numId w:val="10"/>
         </w:numPr>
         <w:spacing w:after="60"/>
       </w:pPr>
@@ -13975,7 +14613,17 @@
         <w:t xml:space="preserve">two-factor codes</w:t>
       </w:r>
       <w:r>
-        <w:t xml:space="preserve"> if other people use your network, and let the posture tiles guide you. For HTTPS, rerun the installer with </w:t>
+        <w:t xml:space="preserve"> if other people use your network, and let the posture tiles guide you. For HTTPS, press </w:t>
+      </w:r>
+      <w:r>
+        <w:rPr>
+          <w:b/>
+          <w:bCs/>
+        </w:rPr>
+        <w:t xml:space="preserve">Turn on HTTPS</w:t>
+      </w:r>
+      <w:r>
+        <w:t xml:space="preserve"> on the Security tab (21.5); </w:t>
       </w:r>
       <w:r>
         <w:rPr>
@@ -13987,43 +14635,7 @@
         <w:t xml:space="preserve">--https</w:t>
       </w:r>
       <w:r>
-        <w:t xml:space="preserve"> or place </w:t>
-      </w:r>
-      <w:r>
-        <w:rPr>
-          <w:rFonts w:ascii="Consolas" w:cs="Consolas" w:eastAsia="Consolas" w:hAnsi="Consolas"/>
-          <w:sz w:val="19"/>
-          <w:szCs w:val="19"/>
-          <w:shd w:fill="EEF1F5" w:val="clear"/>
-        </w:rPr>
-        <w:t xml:space="preserve">cert.pem</w:t>
-      </w:r>
-      <w:r>
-        <w:t xml:space="preserve"> and </w:t>
-      </w:r>
-      <w:r>
-        <w:rPr>
-          <w:rFonts w:ascii="Consolas" w:cs="Consolas" w:eastAsia="Consolas" w:hAnsi="Consolas"/>
-          <w:sz w:val="19"/>
-          <w:szCs w:val="19"/>
-          <w:shd w:fill="EEF1F5" w:val="clear"/>
-        </w:rPr>
-        <w:t xml:space="preserve">key.pem</w:t>
-      </w:r>
-      <w:r>
-        <w:t xml:space="preserve"> in </w:t>
-      </w:r>
-      <w:r>
-        <w:rPr>
-          <w:rFonts w:ascii="Consolas" w:cs="Consolas" w:eastAsia="Consolas" w:hAnsi="Consolas"/>
-          <w:sz w:val="19"/>
-          <w:szCs w:val="19"/>
-          <w:shd w:fill="EEF1F5" w:val="clear"/>
-        </w:rPr>
-        <w:t xml:space="preserve">/var/lib/medialedger/tls/</w:t>
-      </w:r>
-      <w:r>
-        <w:t xml:space="preserve"> and restart; the browser warns once about the self-signed certificate.</w:t>
+        <w:t xml:space="preserve"> on the installer does the same at install time.</w:t>
       </w:r>
     </w:p>
     <w:p>
@@ -17062,7 +17674,7 @@
         <w:sz w:val="16"/>
         <w:szCs w:val="16"/>
       </w:rPr>
-      <w:t xml:space="preserve">MediaLedger 1.2.2 · User Manual</w:t>
+      <w:t xml:space="preserve">MediaLedger 1.3.0 · User Manual</w:t>
     </w:r>
   </w:p>
 </w:hdr>
@@ -17221,6 +17833,18 @@
     </w:lvlOverride>
   </w:num>
   <w:num w:numId="8">
+    <w:abstractNumId w:val="3"/>
+    <w:lvlOverride w:ilvl="0">
+      <w:startOverride w:val="1"/>
+    </w:lvlOverride>
+  </w:num>
+  <w:num w:numId="9">
+    <w:abstractNumId w:val="3"/>
+    <w:lvlOverride w:ilvl="0">
+      <w:startOverride w:val="1"/>
+    </w:lvlOverride>
+  </w:num>
+  <w:num w:numId="10">
     <w:abstractNumId w:val="3"/>
     <w:lvlOverride w:ilvl="0">
       <w:startOverride w:val="1"/>

</xml_diff>

<commit_message>
Release 1.3.1: editable movie name pattern with clickable parts; installer keeps the admin password on rerun; certificate downloads as .crt
</commit_message>
<xml_diff>
--- a/docs/MediaLedger-Manual.docx
+++ b/docs/MediaLedger-Manual.docx
@@ -42,7 +42,7 @@
           <w:sz w:val="24"/>
           <w:szCs w:val="24"/>
         </w:rPr>
-        <w:t xml:space="preserve">Version 1.3.0</w:t>
+        <w:t xml:space="preserve">Version 1.3.1</w:t>
       </w:r>
     </w:p>
     <w:p>
@@ -6501,6 +6501,94 @@
         <w:spacing w:after="120"/>
       </w:pPr>
       <w:r>
+        <w:t xml:space="preserve">Only </w:t>
+      </w:r>
+      <w:r>
+        <w:rPr>
+          <w:rFonts w:ascii="Consolas" w:cs="Consolas" w:eastAsia="Consolas" w:hAnsi="Consolas"/>
+          <w:sz w:val="19"/>
+          <w:szCs w:val="19"/>
+          <w:shd w:fill="EEF1F5" w:val="clear"/>
+        </w:rPr>
+        <w:t xml:space="preserve">Title (Year)</w:t>
+      </w:r>
+      <w:r>
+        <w:t xml:space="preserve"> is fixed, because Plex matches on it. Everything after the dash is a </w:t>
+      </w:r>
+      <w:r>
+        <w:rPr>
+          <w:b/>
+          <w:bCs/>
+        </w:rPr>
+        <w:t xml:space="preserve">name part</w:t>
+      </w:r>
+      <w:r>
+        <w:t xml:space="preserve"> you can leave out or reorder under Batch settings → </w:t>
+      </w:r>
+      <w:r>
+        <w:rPr>
+          <w:b/>
+          <w:bCs/>
+        </w:rPr>
+        <w:t xml:space="preserve">Name parts</w:t>
+      </w:r>
+      <w:r>
+        <w:t xml:space="preserve">: click a chip to switch it off (it shows struck through) or on, use the ◂ ▸ arrows to move it, and watch the preview. The whole list rebuilds at once. The same thing works from the list itself: every word in a proposed name is clickable, so clicking </w:t>
+      </w:r>
+      <w:r>
+        <w:rPr>
+          <w:rFonts w:ascii="Consolas" w:cs="Consolas" w:eastAsia="Consolas" w:hAnsi="Consolas"/>
+          <w:sz w:val="19"/>
+          <w:szCs w:val="19"/>
+          <w:shd w:fill="EEF1F5" w:val="clear"/>
+        </w:rPr>
+        <w:t xml:space="preserve">Source</w:t>
+      </w:r>
+      <w:r>
+        <w:t xml:space="preserve"> in any row removes Source from every name, the way editing one dimension in a CAD sketch updates the whole part. If you do not like </w:t>
+      </w:r>
+      <w:r>
+        <w:rPr>
+          <w:rFonts w:ascii="Consolas" w:cs="Consolas" w:eastAsia="Consolas" w:hAnsi="Consolas"/>
+          <w:sz w:val="19"/>
+          <w:szCs w:val="19"/>
+          <w:shd w:fill="EEF1F5" w:val="clear"/>
+        </w:rPr>
+        <w:t xml:space="preserve">Web</w:t>
+      </w:r>
+      <w:r>
+        <w:t xml:space="preserve"> / </w:t>
+      </w:r>
+      <w:r>
+        <w:rPr>
+          <w:rFonts w:ascii="Consolas" w:cs="Consolas" w:eastAsia="Consolas" w:hAnsi="Consolas"/>
+          <w:sz w:val="19"/>
+          <w:szCs w:val="19"/>
+          <w:shd w:fill="EEF1F5" w:val="clear"/>
+        </w:rPr>
+        <w:t xml:space="preserve">Rip</w:t>
+      </w:r>
+      <w:r>
+        <w:t xml:space="preserve"> in your names, click it once and it is gone; the </w:t>
+      </w:r>
+      <w:r>
+        <w:rPr>
+          <w:rFonts w:ascii="Consolas" w:cs="Consolas" w:eastAsia="Consolas" w:hAnsi="Consolas"/>
+          <w:sz w:val="19"/>
+          <w:szCs w:val="19"/>
+          <w:shd w:fill="EEF1F5" w:val="clear"/>
+        </w:rPr>
+        <w:t xml:space="preserve">no_source</w:t>
+      </w:r>
+      <w:r>
+        <w:t xml:space="preserve"> flag disappears with it.</w:t>
+      </w:r>
+    </w:p>
+    <w:p>
+      <w:pPr>
+        <w:spacing w:after="120"/>
+      </w:pPr>
+      <w:r>
         <w:t xml:space="preserve">Examples: </w:t>
       </w:r>
       <w:r>
@@ -12319,7 +12407,19 @@
         <w:t xml:space="preserve">Download certificate</w:t>
       </w:r>
       <w:r>
-        <w:t xml:space="preserve"> and follow the per-device steps under *Removing the browser warning* (Windows: Trusted Root Certification Authorities; Android: install a CA certificate; iPhone: install the profile, then Certificate Trust Settings; macOS: Keychain, Always Trust).</w:t>
+        <w:t xml:space="preserve"> (a </w:t>
+      </w:r>
+      <w:r>
+        <w:rPr>
+          <w:rFonts w:ascii="Consolas" w:cs="Consolas" w:eastAsia="Consolas" w:hAnsi="Consolas"/>
+          <w:sz w:val="19"/>
+          <w:szCs w:val="19"/>
+          <w:shd w:fill="EEF1F5" w:val="clear"/>
+        </w:rPr>
+        <w:t xml:space="preserve">.crt</w:t>
+      </w:r>
+      <w:r>
+        <w:t xml:space="preserve"> file Windows opens with its own installer on double-click) and follow the per-device steps under *Removing the browser warning* (Windows: Trusted Root Certification Authorities; Android: install a CA certificate; iPhone: install the profile, then Certificate Trust Settings; macOS: Keychain, Always Trust).</w:t>
       </w:r>
     </w:p>
     <w:p>
@@ -17674,7 +17774,7 @@
         <w:sz w:val="16"/>
         <w:szCs w:val="16"/>
       </w:rPr>
-      <w:t xml:space="preserve">MediaLedger 1.3.0 · User Manual</w:t>
+      <w:t xml:space="preserve">MediaLedger 1.3.1 · User Manual</w:t>
     </w:r>
   </w:p>
 </w:hdr>

</xml_diff>

<commit_message>
Release 1.4.0: tags on every title: genres from TVmaze, AniList and Plex, sub/dub worked out from the probe, and your own tags
</commit_message>
<xml_diff>
--- a/docs/MediaLedger-Manual.docx
+++ b/docs/MediaLedger-Manual.docx
@@ -42,7 +42,7 @@
           <w:sz w:val="24"/>
           <w:szCs w:val="24"/>
         </w:rPr>
-        <w:t xml:space="preserve">Version 1.3.1</w:t>
+        <w:t xml:space="preserve">Version 1.4.0</w:t>
       </w:r>
     </w:p>
     <w:p>
@@ -308,6 +308,21 @@
           <w:szCs w:val="20"/>
         </w:rPr>
         <w:t xml:space="preserve">5.1 Episode detail</w:t>
+      </w:r>
+    </w:p>
+    <w:p>
+      <w:pPr>
+        <w:spacing w:after="40"/>
+        <w:ind w:left="540"/>
+      </w:pPr>
+      <w:r>
+        <w:rPr>
+          <w:b w:val="false"/>
+          <w:bCs w:val="false"/>
+          <w:sz w:val="20"/>
+          <w:szCs w:val="20"/>
+        </w:rPr>
+        <w:t xml:space="preserve">5.2 Tags: genres, sub/dub and your own</w:t>
       </w:r>
     </w:p>
     <w:p>
@@ -4068,6 +4083,661 @@
     </w:p>
     <w:p>
       <w:pPr>
+        <w:pStyle w:val="Heading2"/>
+      </w:pPr>
+      <w:r>
+        <w:t xml:space="preserve">5.2 Tags: genres, sub/dub and your own</w:t>
+      </w:r>
+    </w:p>
+    <w:p>
+      <w:pPr>
+        <w:spacing w:after="120"/>
+      </w:pPr>
+      <w:r>
+        <w:t xml:space="preserve">Every series and movie carries three kinds of tag, shown in a </w:t>
+      </w:r>
+      <w:r>
+        <w:rPr>
+          <w:b/>
+          <w:bCs/>
+        </w:rPr>
+        <w:t xml:space="preserve">Tags</w:t>
+      </w:r>
+      <w:r>
+        <w:t xml:space="preserve"> column on the lists and as a strip under the title on its own page. The filter box matches them, so typing </w:t>
+      </w:r>
+      <w:r>
+        <w:rPr>
+          <w:rFonts w:ascii="Consolas" w:cs="Consolas" w:eastAsia="Consolas" w:hAnsi="Consolas"/>
+          <w:sz w:val="19"/>
+          <w:szCs w:val="19"/>
+          <w:shd w:fill="EEF1F5" w:val="clear"/>
+        </w:rPr>
+        <w:t xml:space="preserve">comedy</w:t>
+      </w:r>
+      <w:r>
+        <w:t xml:space="preserve">, </w:t>
+      </w:r>
+      <w:r>
+        <w:rPr>
+          <w:rFonts w:ascii="Consolas" w:cs="Consolas" w:eastAsia="Consolas" w:hAnsi="Consolas"/>
+          <w:sz w:val="19"/>
+          <w:szCs w:val="19"/>
+          <w:shd w:fill="EEF1F5" w:val="clear"/>
+        </w:rPr>
+        <w:t xml:space="preserve">dub</w:t>
+      </w:r>
+      <w:r>
+        <w:t xml:space="preserve"> or </w:t>
+      </w:r>
+      <w:r>
+        <w:rPr>
+          <w:rFonts w:ascii="Consolas" w:cs="Consolas" w:eastAsia="Consolas" w:hAnsi="Consolas"/>
+          <w:sz w:val="19"/>
+          <w:szCs w:val="19"/>
+          <w:shd w:fill="EEF1F5" w:val="clear"/>
+        </w:rPr>
+        <w:t xml:space="preserve">kids</w:t>
+      </w:r>
+      <w:r>
+        <w:t xml:space="preserve"> narrows the list.</w:t>
+      </w:r>
+    </w:p>
+    <w:tbl>
+      <w:tblPr>
+        <w:tblW w:type="dxa" w:w="9360"/>
+        <w:tblBorders>
+          <w:top w:val="single" w:color="auto" w:sz="4"/>
+          <w:left w:val="single" w:color="auto" w:sz="4"/>
+          <w:bottom w:val="single" w:color="auto" w:sz="4"/>
+          <w:right w:val="single" w:color="auto" w:sz="4"/>
+          <w:insideH w:val="single" w:color="auto" w:sz="4"/>
+          <w:insideV w:val="single" w:color="auto" w:sz="4"/>
+        </w:tblBorders>
+      </w:tblPr>
+      <w:tblGrid>
+        <w:gridCol w:w="1900"/>
+        <w:gridCol w:w="5460"/>
+        <w:gridCol w:w="2000"/>
+      </w:tblGrid>
+      <w:tr>
+        <w:tc>
+          <w:tcPr>
+            <w:tcW w:type="dxa" w:w="0"/>
+            <w:shd w:fill="DDE6F2" w:val="clear"/>
+            <w:tcMar>
+              <w:top w:type="dxa" w:w="60"/>
+              <w:left w:type="dxa" w:w="100"/>
+              <w:bottom w:type="dxa" w:w="60"/>
+              <w:right w:type="dxa" w:w="100"/>
+            </w:tcMar>
+          </w:tcPr>
+          <w:p>
+            <w:r>
+              <w:rPr>
+                <w:b/>
+                <w:bCs/>
+                <w:sz w:val="19"/>
+                <w:szCs w:val="19"/>
+              </w:rPr>
+              <w:t xml:space="preserve">Kind</w:t>
+            </w:r>
+          </w:p>
+        </w:tc>
+        <w:tc>
+          <w:tcPr>
+            <w:tcW w:type="dxa" w:w="0"/>
+            <w:shd w:fill="DDE6F2" w:val="clear"/>
+            <w:tcMar>
+              <w:top w:type="dxa" w:w="60"/>
+              <w:left w:type="dxa" w:w="100"/>
+              <w:bottom w:type="dxa" w:w="60"/>
+              <w:right w:type="dxa" w:w="100"/>
+            </w:tcMar>
+          </w:tcPr>
+          <w:p>
+            <w:r>
+              <w:rPr>
+                <w:b/>
+                <w:bCs/>
+                <w:sz w:val="19"/>
+                <w:szCs w:val="19"/>
+              </w:rPr>
+              <w:t xml:space="preserve">Where it comes from</w:t>
+            </w:r>
+          </w:p>
+        </w:tc>
+        <w:tc>
+          <w:tcPr>
+            <w:tcW w:type="dxa" w:w="0"/>
+            <w:shd w:fill="DDE6F2" w:val="clear"/>
+            <w:tcMar>
+              <w:top w:type="dxa" w:w="60"/>
+              <w:left w:type="dxa" w:w="100"/>
+              <w:bottom w:type="dxa" w:w="60"/>
+              <w:right w:type="dxa" w:w="100"/>
+            </w:tcMar>
+          </w:tcPr>
+          <w:p>
+            <w:r>
+              <w:rPr>
+                <w:b/>
+                <w:bCs/>
+                <w:sz w:val="19"/>
+                <w:szCs w:val="19"/>
+              </w:rPr>
+              <w:t xml:space="preserve">Examples</w:t>
+            </w:r>
+          </w:p>
+        </w:tc>
+      </w:tr>
+      <w:tr>
+        <w:tc>
+          <w:tcPr>
+            <w:tcW w:type="dxa" w:w="0"/>
+            <w:tcMar>
+              <w:top w:type="dxa" w:w="60"/>
+              <w:left w:type="dxa" w:w="100"/>
+              <w:bottom w:type="dxa" w:w="60"/>
+              <w:right w:type="dxa" w:w="100"/>
+            </w:tcMar>
+          </w:tcPr>
+          <w:p>
+            <w:r>
+              <w:rPr>
+                <w:b w:val="false"/>
+                <w:bCs w:val="false"/>
+                <w:sz w:val="19"/>
+                <w:szCs w:val="19"/>
+              </w:rPr>
+              <w:t xml:space="preserve">Genres (grey)</w:t>
+            </w:r>
+          </w:p>
+        </w:tc>
+        <w:tc>
+          <w:tcPr>
+            <w:tcW w:type="dxa" w:w="0"/>
+            <w:tcMar>
+              <w:top w:type="dxa" w:w="60"/>
+              <w:left w:type="dxa" w:w="100"/>
+              <w:bottom w:type="dxa" w:w="60"/>
+              <w:right w:type="dxa" w:w="100"/>
+            </w:tcMar>
+          </w:tcPr>
+          <w:p>
+            <w:r>
+              <w:rPr>
+                <w:b w:val="false"/>
+                <w:bCs w:val="false"/>
+                <w:sz w:val="19"/>
+                <w:szCs w:val="19"/>
+              </w:rPr>
+              <w:t xml:space="preserve">The same TVmaze / AniList lookup that fetches episode counts also returns genres, and AniList adds its crowd-ranked tags. Fetched automatically with the next lookup; series matched before this version are filled in once in the background. Movies take their genres from Plex when synced.</w:t>
+            </w:r>
+          </w:p>
+        </w:tc>
+        <w:tc>
+          <w:tcPr>
+            <w:tcW w:type="dxa" w:w="0"/>
+            <w:tcMar>
+              <w:top w:type="dxa" w:w="60"/>
+              <w:left w:type="dxa" w:w="100"/>
+              <w:bottom w:type="dxa" w:w="60"/>
+              <w:right w:type="dxa" w:w="100"/>
+            </w:tcMar>
+          </w:tcPr>
+          <w:p>
+            <w:r>
+              <w:rPr>
+                <w:rFonts w:ascii="Consolas" w:cs="Consolas" w:eastAsia="Consolas" w:hAnsi="Consolas"/>
+                <w:b w:val="false"/>
+                <w:bCs w:val="false"/>
+                <w:sz w:val="19"/>
+                <w:szCs w:val="19"/>
+                <w:shd w:fill="EEF1F5" w:val="clear"/>
+              </w:rPr>
+              <w:t xml:space="preserve">Action</w:t>
+            </w:r>
+            <w:r>
+              <w:rPr>
+                <w:b w:val="false"/>
+                <w:bCs w:val="false"/>
+                <w:sz w:val="19"/>
+                <w:szCs w:val="19"/>
+              </w:rPr>
+              <w:t xml:space="preserve">, </w:t>
+            </w:r>
+            <w:r>
+              <w:rPr>
+                <w:rFonts w:ascii="Consolas" w:cs="Consolas" w:eastAsia="Consolas" w:hAnsi="Consolas"/>
+                <w:b w:val="false"/>
+                <w:bCs w:val="false"/>
+                <w:sz w:val="19"/>
+                <w:szCs w:val="19"/>
+                <w:shd w:fill="EEF1F5" w:val="clear"/>
+              </w:rPr>
+              <w:t xml:space="preserve">Slice of Life</w:t>
+            </w:r>
+            <w:r>
+              <w:rPr>
+                <w:b w:val="false"/>
+                <w:bCs w:val="false"/>
+                <w:sz w:val="19"/>
+                <w:szCs w:val="19"/>
+              </w:rPr>
+              <w:t xml:space="preserve">, </w:t>
+            </w:r>
+            <w:r>
+              <w:rPr>
+                <w:rFonts w:ascii="Consolas" w:cs="Consolas" w:eastAsia="Consolas" w:hAnsi="Consolas"/>
+                <w:b w:val="false"/>
+                <w:bCs w:val="false"/>
+                <w:sz w:val="19"/>
+                <w:szCs w:val="19"/>
+                <w:shd w:fill="EEF1F5" w:val="clear"/>
+              </w:rPr>
+              <w:t xml:space="preserve">Isekai</w:t>
+            </w:r>
+            <w:r>
+              <w:rPr>
+                <w:b w:val="false"/>
+                <w:bCs w:val="false"/>
+                <w:sz w:val="19"/>
+                <w:szCs w:val="19"/>
+              </w:rPr>
+              <w:t xml:space="preserve">, </w:t>
+            </w:r>
+            <w:r>
+              <w:rPr>
+                <w:rFonts w:ascii="Consolas" w:cs="Consolas" w:eastAsia="Consolas" w:hAnsi="Consolas"/>
+                <w:b w:val="false"/>
+                <w:bCs w:val="false"/>
+                <w:sz w:val="19"/>
+                <w:szCs w:val="19"/>
+                <w:shd w:fill="EEF1F5" w:val="clear"/>
+              </w:rPr>
+              <w:t xml:space="preserve">Documentary</w:t>
+            </w:r>
+          </w:p>
+        </w:tc>
+      </w:tr>
+      <w:tr>
+        <w:tc>
+          <w:tcPr>
+            <w:tcW w:type="dxa" w:w="0"/>
+            <w:tcMar>
+              <w:top w:type="dxa" w:w="60"/>
+              <w:left w:type="dxa" w:w="100"/>
+              <w:bottom w:type="dxa" w:w="60"/>
+              <w:right w:type="dxa" w:w="100"/>
+            </w:tcMar>
+          </w:tcPr>
+          <w:p>
+            <w:r>
+              <w:rPr>
+                <w:b w:val="false"/>
+                <w:bCs w:val="false"/>
+                <w:sz w:val="19"/>
+                <w:szCs w:val="19"/>
+              </w:rPr>
+              <w:t xml:space="preserve">Sub / dub (coloured)</w:t>
+            </w:r>
+          </w:p>
+        </w:tc>
+        <w:tc>
+          <w:tcPr>
+            <w:tcW w:type="dxa" w:w="0"/>
+            <w:tcMar>
+              <w:top w:type="dxa" w:w="60"/>
+              <w:left w:type="dxa" w:w="100"/>
+              <w:bottom w:type="dxa" w:w="60"/>
+              <w:right w:type="dxa" w:w="100"/>
+            </w:tcMar>
+          </w:tcPr>
+          <w:p>
+            <w:r>
+              <w:rPr>
+                <w:b w:val="false"/>
+                <w:bCs w:val="false"/>
+                <w:sz w:val="19"/>
+                <w:szCs w:val="19"/>
+              </w:rPr>
+              <w:t xml:space="preserve">Worked out on this machine from the audio and subtitle languages ffprobe recorded: Japanese audio with English subtitles is </w:t>
+            </w:r>
+            <w:r>
+              <w:rPr>
+                <w:b w:val="false"/>
+                <w:bCs w:val="false"/>
+                <w:sz w:val="19"/>
+                <w:szCs w:val="19"/>
+              </w:rPr>
+              <w:t xml:space="preserve">Subbed</w:t>
+            </w:r>
+            <w:r>
+              <w:rPr>
+                <w:b w:val="false"/>
+                <w:bCs w:val="false"/>
+                <w:sz w:val="19"/>
+                <w:szCs w:val="19"/>
+              </w:rPr>
+              <w:t xml:space="preserve">, English audio on anime is </w:t>
+            </w:r>
+            <w:r>
+              <w:rPr>
+                <w:b w:val="false"/>
+                <w:bCs w:val="false"/>
+                <w:sz w:val="19"/>
+                <w:szCs w:val="19"/>
+              </w:rPr>
+              <w:t xml:space="preserve">Dubbed</w:t>
+            </w:r>
+            <w:r>
+              <w:rPr>
+                <w:b w:val="false"/>
+                <w:bCs w:val="false"/>
+                <w:sz w:val="19"/>
+                <w:szCs w:val="19"/>
+              </w:rPr>
+              <w:t xml:space="preserve">, both audio tracks is </w:t>
+            </w:r>
+            <w:r>
+              <w:rPr>
+                <w:b w:val="false"/>
+                <w:bCs w:val="false"/>
+                <w:sz w:val="19"/>
+                <w:szCs w:val="19"/>
+              </w:rPr>
+              <w:t xml:space="preserve">Dual audio</w:t>
+            </w:r>
+            <w:r>
+              <w:rPr>
+                <w:b w:val="false"/>
+                <w:bCs w:val="false"/>
+                <w:sz w:val="19"/>
+                <w:szCs w:val="19"/>
+              </w:rPr>
+              <w:t xml:space="preserve">, and a series whose episodes disagree is </w:t>
+            </w:r>
+            <w:r>
+              <w:rPr>
+                <w:b w:val="false"/>
+                <w:bCs w:val="false"/>
+                <w:sz w:val="19"/>
+                <w:szCs w:val="19"/>
+              </w:rPr>
+              <w:t xml:space="preserve">Mixed</w:t>
+            </w:r>
+            <w:r>
+              <w:rPr>
+                <w:b w:val="false"/>
+                <w:bCs w:val="false"/>
+                <w:sz w:val="19"/>
+                <w:szCs w:val="19"/>
+              </w:rPr>
+              <w:t xml:space="preserve">. Nothing is fetched.</w:t>
+            </w:r>
+          </w:p>
+        </w:tc>
+        <w:tc>
+          <w:tcPr>
+            <w:tcW w:type="dxa" w:w="0"/>
+            <w:tcMar>
+              <w:top w:type="dxa" w:w="60"/>
+              <w:left w:type="dxa" w:w="100"/>
+              <w:bottom w:type="dxa" w:w="60"/>
+              <w:right w:type="dxa" w:w="100"/>
+            </w:tcMar>
+          </w:tcPr>
+          <w:p>
+            <w:r>
+              <w:rPr>
+                <w:rFonts w:ascii="Consolas" w:cs="Consolas" w:eastAsia="Consolas" w:hAnsi="Consolas"/>
+                <w:b w:val="false"/>
+                <w:bCs w:val="false"/>
+                <w:sz w:val="19"/>
+                <w:szCs w:val="19"/>
+                <w:shd w:fill="EEF1F5" w:val="clear"/>
+              </w:rPr>
+              <w:t xml:space="preserve">Subbed</w:t>
+            </w:r>
+            <w:r>
+              <w:rPr>
+                <w:b w:val="false"/>
+                <w:bCs w:val="false"/>
+                <w:sz w:val="19"/>
+                <w:szCs w:val="19"/>
+              </w:rPr>
+              <w:t xml:space="preserve">, </w:t>
+            </w:r>
+            <w:r>
+              <w:rPr>
+                <w:rFonts w:ascii="Consolas" w:cs="Consolas" w:eastAsia="Consolas" w:hAnsi="Consolas"/>
+                <w:b w:val="false"/>
+                <w:bCs w:val="false"/>
+                <w:sz w:val="19"/>
+                <w:szCs w:val="19"/>
+                <w:shd w:fill="EEF1F5" w:val="clear"/>
+              </w:rPr>
+              <w:t xml:space="preserve">Dubbed</w:t>
+            </w:r>
+            <w:r>
+              <w:rPr>
+                <w:b w:val="false"/>
+                <w:bCs w:val="false"/>
+                <w:sz w:val="19"/>
+                <w:szCs w:val="19"/>
+              </w:rPr>
+              <w:t xml:space="preserve">, </w:t>
+            </w:r>
+            <w:r>
+              <w:rPr>
+                <w:rFonts w:ascii="Consolas" w:cs="Consolas" w:eastAsia="Consolas" w:hAnsi="Consolas"/>
+                <w:b w:val="false"/>
+                <w:bCs w:val="false"/>
+                <w:sz w:val="19"/>
+                <w:szCs w:val="19"/>
+                <w:shd w:fill="EEF1F5" w:val="clear"/>
+              </w:rPr>
+              <w:t xml:space="preserve">Dual audio</w:t>
+            </w:r>
+          </w:p>
+        </w:tc>
+      </w:tr>
+      <w:tr>
+        <w:tc>
+          <w:tcPr>
+            <w:tcW w:type="dxa" w:w="0"/>
+            <w:tcMar>
+              <w:top w:type="dxa" w:w="60"/>
+              <w:left w:type="dxa" w:w="100"/>
+              <w:bottom w:type="dxa" w:w="60"/>
+              <w:right w:type="dxa" w:w="100"/>
+            </w:tcMar>
+          </w:tcPr>
+          <w:p>
+            <w:r>
+              <w:rPr>
+                <w:b w:val="false"/>
+                <w:bCs w:val="false"/>
+                <w:sz w:val="19"/>
+                <w:szCs w:val="19"/>
+              </w:rPr>
+              <w:t xml:space="preserve">Your tags (blue)</w:t>
+            </w:r>
+          </w:p>
+        </w:tc>
+        <w:tc>
+          <w:tcPr>
+            <w:tcW w:type="dxa" w:w="0"/>
+            <w:tcMar>
+              <w:top w:type="dxa" w:w="60"/>
+              <w:left w:type="dxa" w:w="100"/>
+              <w:bottom w:type="dxa" w:w="60"/>
+              <w:right w:type="dxa" w:w="100"/>
+            </w:tcMar>
+          </w:tcPr>
+          <w:p>
+            <w:r>
+              <w:rPr>
+                <w:b w:val="false"/>
+                <w:bCs w:val="false"/>
+                <w:sz w:val="19"/>
+                <w:szCs w:val="19"/>
+              </w:rPr>
+              <w:t xml:space="preserve">Anything you type into the </w:t>
+            </w:r>
+            <w:r>
+              <w:rPr>
+                <w:b w:val="false"/>
+                <w:bCs w:val="false"/>
+                <w:sz w:val="19"/>
+                <w:szCs w:val="19"/>
+              </w:rPr>
+              <w:t xml:space="preserve">+ tag</w:t>
+            </w:r>
+            <w:r>
+              <w:rPr>
+                <w:b w:val="false"/>
+                <w:bCs w:val="false"/>
+                <w:sz w:val="19"/>
+                <w:szCs w:val="19"/>
+              </w:rPr>
+              <w:t xml:space="preserve"> box on a title page, Enter to add, × to remove. Earlier tags are suggested as you type. Stored with the title like your star rating, so they survive scans and renames.</w:t>
+            </w:r>
+          </w:p>
+        </w:tc>
+        <w:tc>
+          <w:tcPr>
+            <w:tcW w:type="dxa" w:w="0"/>
+            <w:tcMar>
+              <w:top w:type="dxa" w:w="60"/>
+              <w:left w:type="dxa" w:w="100"/>
+              <w:bottom w:type="dxa" w:w="60"/>
+              <w:right w:type="dxa" w:w="100"/>
+            </w:tcMar>
+          </w:tcPr>
+          <w:p>
+            <w:r>
+              <w:rPr>
+                <w:rFonts w:ascii="Consolas" w:cs="Consolas" w:eastAsia="Consolas" w:hAnsi="Consolas"/>
+                <w:b w:val="false"/>
+                <w:bCs w:val="false"/>
+                <w:sz w:val="19"/>
+                <w:szCs w:val="19"/>
+                <w:shd w:fill="EEF1F5" w:val="clear"/>
+              </w:rPr>
+              <w:t xml:space="preserve">kids</w:t>
+            </w:r>
+            <w:r>
+              <w:rPr>
+                <w:b w:val="false"/>
+                <w:bCs w:val="false"/>
+                <w:sz w:val="19"/>
+                <w:szCs w:val="19"/>
+              </w:rPr>
+              <w:t xml:space="preserve">, </w:t>
+            </w:r>
+            <w:r>
+              <w:rPr>
+                <w:rFonts w:ascii="Consolas" w:cs="Consolas" w:eastAsia="Consolas" w:hAnsi="Consolas"/>
+                <w:b w:val="false"/>
+                <w:bCs w:val="false"/>
+                <w:sz w:val="19"/>
+                <w:szCs w:val="19"/>
+                <w:shd w:fill="EEF1F5" w:val="clear"/>
+              </w:rPr>
+              <w:t xml:space="preserve">Christmas</w:t>
+            </w:r>
+            <w:r>
+              <w:rPr>
+                <w:b w:val="false"/>
+                <w:bCs w:val="false"/>
+                <w:sz w:val="19"/>
+                <w:szCs w:val="19"/>
+              </w:rPr>
+              <w:t xml:space="preserve">, </w:t>
+            </w:r>
+            <w:r>
+              <w:rPr>
+                <w:rFonts w:ascii="Consolas" w:cs="Consolas" w:eastAsia="Consolas" w:hAnsi="Consolas"/>
+                <w:b w:val="false"/>
+                <w:bCs w:val="false"/>
+                <w:sz w:val="19"/>
+                <w:szCs w:val="19"/>
+                <w:shd w:fill="EEF1F5" w:val="clear"/>
+              </w:rPr>
+              <w:t xml:space="preserve">watch with Sarah</w:t>
+            </w:r>
+            <w:r>
+              <w:rPr>
+                <w:b w:val="false"/>
+                <w:bCs w:val="false"/>
+                <w:sz w:val="19"/>
+                <w:szCs w:val="19"/>
+              </w:rPr>
+              <w:t xml:space="preserve">, </w:t>
+            </w:r>
+            <w:r>
+              <w:rPr>
+                <w:rFonts w:ascii="Consolas" w:cs="Consolas" w:eastAsia="Consolas" w:hAnsi="Consolas"/>
+                <w:b w:val="false"/>
+                <w:bCs w:val="false"/>
+                <w:sz w:val="19"/>
+                <w:szCs w:val="19"/>
+                <w:shd w:fill="EEF1F5" w:val="clear"/>
+              </w:rPr>
+              <w:t xml:space="preserve">rewatch</w:t>
+            </w:r>
+          </w:p>
+        </w:tc>
+      </w:tr>
+    </w:tbl>
+    <w:p>
+      <w:pPr>
+        <w:spacing w:after="120"/>
+      </w:pPr>
+      <w:r>
+        <w:t xml:space="preserve">All three are exported in the series and movie title CSVs (</w:t>
+      </w:r>
+      <w:r>
+        <w:rPr>
+          <w:rFonts w:ascii="Consolas" w:cs="Consolas" w:eastAsia="Consolas" w:hAnsi="Consolas"/>
+          <w:sz w:val="19"/>
+          <w:szCs w:val="19"/>
+          <w:shd w:fill="EEF1F5" w:val="clear"/>
+        </w:rPr>
+        <w:t xml:space="preserve">genres</w:t>
+      </w:r>
+      <w:r>
+        <w:t xml:space="preserve">, </w:t>
+      </w:r>
+      <w:r>
+        <w:rPr>
+          <w:rFonts w:ascii="Consolas" w:cs="Consolas" w:eastAsia="Consolas" w:hAnsi="Consolas"/>
+          <w:sz w:val="19"/>
+          <w:szCs w:val="19"/>
+          <w:shd w:fill="EEF1F5" w:val="clear"/>
+        </w:rPr>
+        <w:t xml:space="preserve">audio_type</w:t>
+      </w:r>
+      <w:r>
+        <w:t xml:space="preserve">, </w:t>
+      </w:r>
+      <w:r>
+        <w:rPr>
+          <w:rFonts w:ascii="Consolas" w:cs="Consolas" w:eastAsia="Consolas" w:hAnsi="Consolas"/>
+          <w:sz w:val="19"/>
+          <w:szCs w:val="19"/>
+          <w:shd w:fill="EEF1F5" w:val="clear"/>
+        </w:rPr>
+        <w:t xml:space="preserve">tags</w:t>
+      </w:r>
+      <w:r>
+        <w:t xml:space="preserve">). Guests see tags but cannot edit them; standard users and admins can.</w:t>
+      </w:r>
+    </w:p>
+    <w:p>
+      <w:pPr>
         <w:spacing w:after="120"/>
       </w:pPr>
       <w:r>
@@ -8743,7 +9413,7 @@
                 <w:sz w:val="19"/>
                 <w:szCs w:val="19"/>
               </w:rPr>
-              <w:t xml:space="preserve">One row per series: seasons, episodes, runtime, size, resolutions, codecs, languages, captions %, episode gaps, metadata source, expected and missing episodes with the exact list, online rating, your rating and note, mixed-resolution and low-bitrate flags.</w:t>
+              <w:t xml:space="preserve">One row per series: seasons, episodes, runtime, size, resolutions, codecs, languages, captions %, episode gaps, metadata source, expected and missing episodes with the exact list, online rating, your rating and note, genres, sub/dub, your tags, mixed-resolution and low-bitrate flags.</w:t>
             </w:r>
           </w:p>
         </w:tc>
@@ -8835,7 +9505,7 @@
                 <w:sz w:val="19"/>
                 <w:szCs w:val="19"/>
               </w:rPr>
-              <w:t xml:space="preserve">One row per title: file count, versions, best resolution, size, languages, captions, your rating and note.</w:t>
+              <w:t xml:space="preserve">One row per title: file count, versions, best resolution, size, languages, captions, your rating and note, genres (from Plex), sub/dub, your tags.</w:t>
             </w:r>
           </w:p>
         </w:tc>
@@ -17774,7 +18444,7 @@
         <w:sz w:val="16"/>
         <w:szCs w:val="16"/>
       </w:rPr>
-      <w:t xml:space="preserve">MediaLedger 1.3.1 · User Manual</w:t>
+      <w:t xml:space="preserve">MediaLedger 1.4.0 · User Manual</w:t>
     </w:r>
   </w:p>
 </w:hdr>

</xml_diff>

<commit_message>
Release 1.5.0: Watch tonight page, filter dropdowns on the lists, storage forecast, nightly backup to a folder, optional Sub/Dub name part
</commit_message>
<xml_diff>
--- a/docs/MediaLedger-Manual.docx
+++ b/docs/MediaLedger-Manual.docx
@@ -42,7 +42,7 @@
           <w:sz w:val="24"/>
           <w:szCs w:val="24"/>
         </w:rPr>
-        <w:t xml:space="preserve">Version 1.4.0</w:t>
+        <w:t xml:space="preserve">Version 1.5.0</w:t>
       </w:r>
     </w:p>
     <w:p>
@@ -283,6 +283,21 @@
     <w:p>
       <w:pPr>
         <w:spacing w:after="40"/>
+        <w:ind w:left="540"/>
+      </w:pPr>
+      <w:r>
+        <w:rPr>
+          <w:b w:val="false"/>
+          <w:bCs w:val="false"/>
+          <w:sz w:val="20"/>
+          <w:szCs w:val="20"/>
+        </w:rPr>
+        <w:t xml:space="preserve">4.4 Storage forecast</w:t>
+      </w:r>
+    </w:p>
+    <w:p>
+      <w:pPr>
+        <w:spacing w:after="40"/>
         <w:ind w:left="0"/>
       </w:pPr>
       <w:r>
@@ -488,6 +503,21 @@
           <w:szCs w:val="22"/>
         </w:rPr>
         <w:t xml:space="preserve">12. Ratings</w:t>
+      </w:r>
+    </w:p>
+    <w:p>
+      <w:pPr>
+        <w:spacing w:after="40"/>
+        <w:ind w:left="540"/>
+      </w:pPr>
+      <w:r>
+        <w:rPr>
+          <w:b w:val="false"/>
+          <w:bCs w:val="false"/>
+          <w:sz w:val="20"/>
+          <w:szCs w:val="20"/>
+        </w:rPr>
+        <w:t xml:space="preserve">12.1 Watch tonight</w:t>
       </w:r>
     </w:p>
     <w:p>
@@ -4140,7 +4170,7 @@
         <w:t xml:space="preserve">kids</w:t>
       </w:r>
       <w:r>
-        <w:t xml:space="preserve"> narrows the list.</w:t>
+        <w:t xml:space="preserve"> narrows the list, and the dropdown row under it filters by one genre, sub/dub state, tag, or watched state (from Plex) at a time.</w:t>
       </w:r>
     </w:p>
     <w:tbl>
@@ -6779,6 +6809,62 @@
     </w:p>
     <w:p>
       <w:pPr>
+        <w:pStyle w:val="Heading2"/>
+      </w:pPr>
+      <w:r>
+        <w:t xml:space="preserve">12.1 Watch tonight</w:t>
+      </w:r>
+    </w:p>
+    <w:p>
+      <w:pPr>
+        <w:spacing w:after="120"/>
+      </w:pPr>
+      <w:r>
+        <w:t xml:space="preserve">One list across every series and movie, made for the "what shall we watch" moment. Narrow it by kind, </w:t>
+      </w:r>
+      <w:r>
+        <w:rPr>
+          <w:b/>
+          <w:bCs/>
+        </w:rPr>
+        <w:t xml:space="preserve">unwatched only</w:t>
+      </w:r>
+      <w:r>
+        <w:t xml:space="preserve"> (from Plex play counts; titles Plex does not have stay in), </w:t>
+      </w:r>
+      <w:r>
+        <w:rPr>
+          <w:b/>
+          <w:bCs/>
+        </w:rPr>
+        <w:t xml:space="preserve">complete series only</w:t>
+      </w:r>
+      <w:r>
+        <w:t xml:space="preserve"> (no missing episodes), a length limit in minutes (episode length for series), your minimum star rating, and the genre, sub/dub and tag dropdowns. </w:t>
+      </w:r>
+      <w:r>
+        <w:rPr>
+          <w:b/>
+          <w:bCs/>
+        </w:rPr>
+        <w:t xml:space="preserve">Pick for me</w:t>
+      </w:r>
+      <w:r>
+        <w:t xml:space="preserve"> chooses one at random from what is left and shows it in a card with an Open button; </w:t>
+      </w:r>
+      <w:r>
+        <w:rPr>
+          <w:b/>
+          <w:bCs/>
+        </w:rPr>
+        <w:t xml:space="preserve">Pick another</w:t>
+      </w:r>
+      <w:r>
+        <w:t xml:space="preserve"> rerolls. Your last settings are remembered in the browser.</w:t>
+      </w:r>
+    </w:p>
+    <w:p>
+      <w:pPr>
         <w:pStyle w:val="Heading1"/>
         <w:pageBreakBefore/>
       </w:pPr>
@@ -7171,7 +7257,53 @@
         <w:spacing w:after="120"/>
       </w:pPr>
       <w:r>
-        <w:t xml:space="preserve">Only </w:t>
+        <w:t xml:space="preserve">A seventh part, </w:t>
+      </w:r>
+      <w:r>
+        <w:rPr>
+          <w:b/>
+          <w:bCs/>
+        </w:rPr>
+        <w:t xml:space="preserve">Sub/Dub</w:t>
+      </w:r>
+      <w:r>
+        <w:t xml:space="preserve">, is off unless you switch it on: it writes </w:t>
+      </w:r>
+      <w:r>
+        <w:rPr>
+          <w:rFonts w:ascii="Consolas" w:cs="Consolas" w:eastAsia="Consolas" w:hAnsi="Consolas"/>
+          <w:sz w:val="19"/>
+          <w:szCs w:val="19"/>
+          <w:shd w:fill="EEF1F5" w:val="clear"/>
+        </w:rPr>
+        <w:t xml:space="preserve">Sub</w:t>
+      </w:r>
+      <w:r>
+        <w:t xml:space="preserve">, </w:t>
+      </w:r>
+      <w:r>
+        <w:rPr>
+          <w:rFonts w:ascii="Consolas" w:cs="Consolas" w:eastAsia="Consolas" w:hAnsi="Consolas"/>
+          <w:sz w:val="19"/>
+          <w:szCs w:val="19"/>
+          <w:shd w:fill="EEF1F5" w:val="clear"/>
+        </w:rPr>
+        <w:t xml:space="preserve">Dub</w:t>
+      </w:r>
+      <w:r>
+        <w:t xml:space="preserve"> or </w:t>
+      </w:r>
+      <w:r>
+        <w:rPr>
+          <w:rFonts w:ascii="Consolas" w:cs="Consolas" w:eastAsia="Consolas" w:hAnsi="Consolas"/>
+          <w:sz w:val="19"/>
+          <w:szCs w:val="19"/>
+          <w:shd w:fill="EEF1F5" w:val="clear"/>
+        </w:rPr>
+        <w:t xml:space="preserve">Dual</w:t>
+      </w:r>
+      <w:r>
+        <w:t xml:space="preserve"> from the probed languages and nothing for a plain English film. Only </w:t>
       </w:r>
       <w:r>
         <w:rPr>
@@ -10080,7 +10212,27 @@
         <w:spacing w:after="120"/>
       </w:pPr>
       <w:r>
-        <w:t xml:space="preserve">Database path and size, schema version, counts, and buttons to back up now, open the backups folder, the data folder and the log.</w:t>
+        <w:t xml:space="preserve">Database path and size, schema version, counts, and buttons to back up now, open the backups folder, the data folder and the log. </w:t>
+      </w:r>
+      <w:r>
+        <w:rPr>
+          <w:b/>
+          <w:bCs/>
+        </w:rPr>
+        <w:t xml:space="preserve">Nightly backup to a folder</w:t>
+      </w:r>
+      <w:r>
+        <w:t xml:space="preserve"> copies the database to a folder of your choice once a day at the time you set, dated, keeping the newest N. Point it at the NAS: the database holds every fix, rating, tag, match and the whole change log, and this is the only copy that survives a dead SD card or PC. </w:t>
+      </w:r>
+      <w:r>
+        <w:rPr>
+          <w:b/>
+          <w:bCs/>
+        </w:rPr>
+        <w:t xml:space="preserve">Back up there now</w:t>
+      </w:r>
+      <w:r>
+        <w:t xml:space="preserve"> tests the folder.</w:t>
       </w:r>
     </w:p>
     <w:p>
@@ -18444,7 +18596,7 @@
         <w:sz w:val="16"/>
         <w:szCs w:val="16"/>
       </w:rPr>
-      <w:t xml:space="preserve">MediaLedger 1.4.0 · User Manual</w:t>
+      <w:t xml:space="preserve">MediaLedger 1.5.0 · User Manual</w:t>
     </w:r>
   </w:p>
 </w:hdr>

</xml_diff>

<commit_message>
Release 1.6.0: Upgrades page, airing dates on the Missing page, webhook and e-mail notifications with a daily summary, Home Assistant status endpoint, phone request page
</commit_message>
<xml_diff>
--- a/docs/MediaLedger-Manual.docx
+++ b/docs/MediaLedger-Manual.docx
@@ -42,7 +42,7 @@
           <w:sz w:val="24"/>
           <w:szCs w:val="24"/>
         </w:rPr>
-        <w:t xml:space="preserve">Version 1.5.0</w:t>
+        <w:t xml:space="preserve">Version 1.6.0</w:t>
       </w:r>
     </w:p>
     <w:p>
@@ -418,6 +418,21 @@
     <w:p>
       <w:pPr>
         <w:spacing w:after="40"/>
+        <w:ind w:left="540"/>
+      </w:pPr>
+      <w:r>
+        <w:rPr>
+          <w:b w:val="false"/>
+          <w:bCs w:val="false"/>
+          <w:sz w:val="20"/>
+          <w:szCs w:val="20"/>
+        </w:rPr>
+        <w:t xml:space="preserve">9.2 Airing next</w:t>
+      </w:r>
+    </w:p>
+    <w:p>
+      <w:pPr>
+        <w:spacing w:after="40"/>
         <w:ind w:left="0"/>
       </w:pPr>
       <w:r>
@@ -493,6 +508,21 @@
     <w:p>
       <w:pPr>
         <w:spacing w:after="40"/>
+        <w:ind w:left="540"/>
+      </w:pPr>
+      <w:r>
+        <w:rPr>
+          <w:b w:val="false"/>
+          <w:bCs w:val="false"/>
+          <w:sz w:val="20"/>
+          <w:szCs w:val="20"/>
+        </w:rPr>
+        <w:t xml:space="preserve">11.1 Upgrade candidates</w:t>
+      </w:r>
+    </w:p>
+    <w:p>
+      <w:pPr>
+        <w:spacing w:after="40"/>
         <w:ind w:left="0"/>
       </w:pPr>
       <w:r>
@@ -533,6 +563,21 @@
           <w:szCs w:val="22"/>
         </w:rPr>
         <w:t xml:space="preserve">13. Media requests</w:t>
+      </w:r>
+    </w:p>
+    <w:p>
+      <w:pPr>
+        <w:spacing w:after="40"/>
+        <w:ind w:left="540"/>
+      </w:pPr>
+      <w:r>
+        <w:rPr>
+          <w:b w:val="false"/>
+          <w:bCs w:val="false"/>
+          <w:sz w:val="20"/>
+          <w:szCs w:val="20"/>
+        </w:rPr>
+        <w:t xml:space="preserve">13.1 The phone page and notifications</w:t>
       </w:r>
     </w:p>
     <w:p>
@@ -5655,6 +5700,42 @@
         <w:pStyle w:val="Heading2"/>
       </w:pPr>
       <w:r>
+        <w:t xml:space="preserve">9.2 Airing next</w:t>
+      </w:r>
+    </w:p>
+    <w:p>
+      <w:pPr>
+        <w:spacing w:after="120"/>
+      </w:pPr>
+      <w:r>
+        <w:t xml:space="preserve">Two panels above the table use the same online match. </w:t>
+      </w:r>
+      <w:r>
+        <w:rPr>
+          <w:b/>
+          <w:bCs/>
+        </w:rPr>
+        <w:t xml:space="preserve">Airing next</w:t>
+      </w:r>
+      <w:r>
+        <w:t xml:space="preserve"> lists every series whose match reports an upcoming episode, soonest first, with the date and the episode label and whether your copy is otherwise up to date; the next seven days are highlighted. Episodes that have not aired yet are never counted as missing. </w:t>
+      </w:r>
+      <w:r>
+        <w:rPr>
+          <w:b/>
+          <w:bCs/>
+        </w:rPr>
+        <w:t xml:space="preserve">Finished airing, still incomplete</w:t>
+      </w:r>
+      <w:r>
+        <w:t xml:space="preserve"> lists series the source marks as ended while you still lack episodes: those gaps will not fill themselves. Both feed the daily summary (13.1) and the Home Assistant status.</w:t>
+      </w:r>
+    </w:p>
+    <w:p>
+      <w:pPr>
+        <w:pStyle w:val="Heading2"/>
+      </w:pPr>
+      <w:r>
         <w:t xml:space="preserve">9.1 The Match dialog</w:t>
       </w:r>
     </w:p>
@@ -7004,6 +7085,116 @@
     </w:p>
     <w:p>
       <w:pPr>
+        <w:pStyle w:val="Heading2"/>
+      </w:pPr>
+      <w:r>
+        <w:t xml:space="preserve">13.1 The phone page and notifications</w:t>
+      </w:r>
+    </w:p>
+    <w:p>
+      <w:pPr>
+        <w:spacing w:after="120"/>
+      </w:pPr>
+      <w:r>
+        <w:rPr>
+          <w:rFonts w:ascii="Consolas" w:cs="Consolas" w:eastAsia="Consolas" w:hAnsi="Consolas"/>
+          <w:sz w:val="19"/>
+          <w:szCs w:val="19"/>
+          <w:shd w:fill="EEF1F5" w:val="clear"/>
+        </w:rPr>
+        <w:t xml:space="preserve">http://&lt;pi&gt;/request</w:t>
+      </w:r>
+      <w:r>
+        <w:t xml:space="preserve"> is a phone-sized version of the form with nothing else on it; the guest QR code on the Security tab points there, so a visitor scans, types a title and is done. Guests give their name once and the phone remembers it.</w:t>
+      </w:r>
+    </w:p>
+    <w:p>
+      <w:pPr>
+        <w:spacing w:after="120"/>
+      </w:pPr>
+      <w:r>
+        <w:t xml:space="preserve">Settings → </w:t>
+      </w:r>
+      <w:r>
+        <w:rPr>
+          <w:b/>
+          <w:bCs/>
+        </w:rPr>
+        <w:t xml:space="preserve">Notifications</w:t>
+      </w:r>
+      <w:r>
+        <w:t xml:space="preserve"> tells you when something happens without opening the app. A </w:t>
+      </w:r>
+      <w:r>
+        <w:rPr>
+          <w:b/>
+          <w:bCs/>
+        </w:rPr>
+        <w:t xml:space="preserve">webhook URL</w:t>
+      </w:r>
+      <w:r>
+        <w:t xml:space="preserve"> receives a small JSON body per event (Home Assistant webhook trigger, ntfy, Discord…); </w:t>
+      </w:r>
+      <w:r>
+        <w:rPr>
+          <w:b/>
+          <w:bCs/>
+        </w:rPr>
+        <w:t xml:space="preserve">e-mail</w:t>
+      </w:r>
+      <w:r>
+        <w:t xml:space="preserve"> goes through any ordinary mailbox with a dependency-free SMTP client (for Gmail use an app password). Events: a new request, a </w:t>
+      </w:r>
+      <w:r>
+        <w:rPr>
+          <w:b/>
+          <w:bCs/>
+        </w:rPr>
+        <w:t xml:space="preserve">daily summary</w:t>
+      </w:r>
+      <w:r>
+        <w:t xml:space="preserve"> at the time you choose (files and free space, pending requests, missing episodes, what airs this week, series that finished airing but are incomplete), and a failed nightly backup. </w:t>
+      </w:r>
+      <w:r>
+        <w:rPr>
+          <w:b/>
+          <w:bCs/>
+        </w:rPr>
+        <w:t xml:space="preserve">Send a test</w:t>
+      </w:r>
+      <w:r>
+        <w:t xml:space="preserve"> saves the settings and sends one of each.</w:t>
+      </w:r>
+    </w:p>
+    <w:p>
+      <w:pPr>
+        <w:spacing w:after="120"/>
+      </w:pPr>
+      <w:r>
+        <w:rPr>
+          <w:b/>
+          <w:bCs/>
+        </w:rPr>
+        <w:t xml:space="preserve">Home Assistant status</w:t>
+      </w:r>
+      <w:r>
+        <w:t xml:space="preserve"> is a read-only JSON summary at a URL with its own key (New key rotates it). Add it as a RESTful sensor and pick values with a template such as </w:t>
+      </w:r>
+      <w:r>
+        <w:rPr>
+          <w:rFonts w:ascii="Consolas" w:cs="Consolas" w:eastAsia="Consolas" w:hAnsi="Consolas"/>
+          <w:sz w:val="19"/>
+          <w:szCs w:val="19"/>
+          <w:shd w:fill="EEF1F5" w:val="clear"/>
+        </w:rPr>
+        <w:t xml:space="preserve">{{ value_json.pending_requests }}</w:t>
+      </w:r>
+      <w:r>
+        <w:t xml:space="preserve">; fields include files, bytes, free space, months left, pending requests, missing episodes, airing this week, the next airing episode, whether a scan is running and the last scan result.</w:t>
+      </w:r>
+    </w:p>
+    <w:p>
+      <w:pPr>
         <w:pStyle w:val="Heading1"/>
         <w:pageBreakBefore/>
       </w:pPr>
@@ -18596,7 +18787,7 @@
         <w:sz w:val="16"/>
         <w:szCs w:val="16"/>
       </w:rPr>
-      <w:t xml:space="preserve">MediaLedger 1.5.0 · User Manual</w:t>
+      <w:t xml:space="preserve">MediaLedger 1.6.0 · User Manual</w:t>
     </w:r>
   </w:p>
 </w:hdr>

</xml_diff>

<commit_message>
Release 1.7.0: TV and anime renames through the batch engine with pre-flight, journal, undo, dry run and editable name parts
</commit_message>
<xml_diff>
--- a/docs/MediaLedger-Manual.docx
+++ b/docs/MediaLedger-Manual.docx
@@ -42,7 +42,7 @@
           <w:sz w:val="24"/>
           <w:szCs w:val="24"/>
         </w:rPr>
-        <w:t xml:space="preserve">Version 1.6.0</w:t>
+        <w:t xml:space="preserve">Version 1.7.0</w:t>
       </w:r>
     </w:p>
     <w:p>
@@ -9274,7 +9274,79 @@
         <w:spacing w:after="120"/>
       </w:pPr>
       <w:r>
-        <w:t xml:space="preserve">The same one-at-a-time scheme as the movie tool applies here: a </w:t>
+        <w:t xml:space="preserve">Episodes use the same engine as movies: every run is a batch that is pre-flighted as a whole (file still there, size unchanged, target free, root writable), each rename verified, journaled in the </w:t>
+      </w:r>
+      <w:r>
+        <w:rPr>
+          <w:b/>
+          <w:bCs/>
+        </w:rPr>
+        <w:t xml:space="preserve">Batches</w:t>
+      </w:r>
+      <w:r>
+        <w:t xml:space="preserve"> table and undoable from it. </w:t>
+      </w:r>
+      <w:r>
+        <w:rPr>
+          <w:b/>
+          <w:bCs/>
+        </w:rPr>
+        <w:t xml:space="preserve">Dry run N</w:t>
+      </w:r>
+      <w:r>
+        <w:t xml:space="preserve"> records what would happen without touching anything. Name parts work as on the movie tab: </w:t>
+      </w:r>
+      <w:r>
+        <w:rPr>
+          <w:rFonts w:ascii="Consolas" w:cs="Consolas" w:eastAsia="Consolas" w:hAnsi="Consolas"/>
+          <w:sz w:val="19"/>
+          <w:szCs w:val="19"/>
+          <w:shd w:fill="EEF1F5" w:val="clear"/>
+        </w:rPr>
+        <w:t xml:space="preserve">Show - S01E02</w:t>
+      </w:r>
+      <w:r>
+        <w:t xml:space="preserve"> is fixed, the </w:t>
+      </w:r>
+      <w:r>
+        <w:rPr>
+          <w:b/>
+          <w:bCs/>
+        </w:rPr>
+        <w:t xml:space="preserve">Episode title</w:t>
+      </w:r>
+      <w:r>
+        <w:t xml:space="preserve"> is on by default, and </w:t>
+      </w:r>
+      <w:r>
+        <w:rPr>
+          <w:b/>
+          <w:bCs/>
+        </w:rPr>
+        <w:t xml:space="preserve">Resolution</w:t>
+      </w:r>
+      <w:r>
+        <w:t xml:space="preserve">, </w:t>
+      </w:r>
+      <w:r>
+        <w:rPr>
+          <w:b/>
+          <w:bCs/>
+        </w:rPr>
+        <w:t xml:space="preserve">Codec</w:t>
+      </w:r>
+      <w:r>
+        <w:t xml:space="preserve"> and </w:t>
+      </w:r>
+      <w:r>
+        <w:rPr>
+          <w:b/>
+          <w:bCs/>
+        </w:rPr>
+        <w:t xml:space="preserve">Sub/Dub</w:t>
+      </w:r>
+      <w:r>
+        <w:t xml:space="preserve"> are opt-in, written in square brackets. The same one-at-a-time scheme applies: a </w:t>
       </w:r>
       <w:r>
         <w:rPr>
@@ -9294,7 +9366,7 @@
         <w:t xml:space="preserve">One at a time</w:t>
       </w:r>
       <w:r>
-        <w:t xml:space="preserve"> for the ticked files, each confirmed separately. A simpler tool for episodes. It is </w:t>
+        <w:t xml:space="preserve"> for the ticked files, each confirmed separately. It is </w:t>
       </w:r>
       <w:r>
         <w:rPr>
@@ -18787,7 +18859,7 @@
         <w:sz w:val="16"/>
         <w:szCs w:val="16"/>
       </w:rPr>
-      <w:t xml:space="preserve">MediaLedger 1.6.0 · User Manual</w:t>
+      <w:t xml:space="preserve">MediaLedger 1.7.0 · User Manual</w:t>
     </w:r>
   </w:p>
 </w:hdr>

</xml_diff>

<commit_message>
Release 1.8.0: dashboard and list tiles for tags, genres, sub/dub, watched state, requests, airing and upgrades
</commit_message>
<xml_diff>
--- a/docs/MediaLedger-Manual.docx
+++ b/docs/MediaLedger-Manual.docx
@@ -42,7 +42,7 @@
           <w:sz w:val="24"/>
           <w:szCs w:val="24"/>
         </w:rPr>
-        <w:t xml:space="preserve">Version 1.7.0</w:t>
+        <w:t xml:space="preserve">Version 1.8.0</w:t>
       </w:r>
     </w:p>
     <w:p>
@@ -292,7 +292,22 @@
           <w:sz w:val="20"/>
           <w:szCs w:val="20"/>
         </w:rPr>
-        <w:t xml:space="preserve">4.4 Storage forecast</w:t>
+        <w:t xml:space="preserve">4.4 What the new data adds</w:t>
+      </w:r>
+    </w:p>
+    <w:p>
+      <w:pPr>
+        <w:spacing w:after="40"/>
+        <w:ind w:left="540"/>
+      </w:pPr>
+      <w:r>
+        <w:rPr>
+          <w:b w:val="false"/>
+          <w:bCs w:val="false"/>
+          <w:sz w:val="20"/>
+          <w:szCs w:val="20"/>
+        </w:rPr>
+        <w:t xml:space="preserve">4.5 Storage forecast</w:t>
       </w:r>
     </w:p>
     <w:p>
@@ -18859,7 +18874,7 @@
         <w:sz w:val="16"/>
         <w:szCs w:val="16"/>
       </w:rPr>
-      <w:t xml:space="preserve">MediaLedger 1.7.0 · User Manual</w:t>
+      <w:t xml:space="preserve">MediaLedger 1.8.0 · User Manual</w:t>
     </w:r>
   </w:p>
 </w:hdr>

</xml_diff>

<commit_message>
Release 1.9.0: readable charts on a square-root scale with counts, shares, hover details and drill-down; donut and trend cards from daily snapshots; colour rules with per-account preferences and editor levels; phone layout for cards
</commit_message>
<xml_diff>
--- a/docs/MediaLedger-Manual.docx
+++ b/docs/MediaLedger-Manual.docx
@@ -42,7 +42,7 @@
           <w:sz w:val="24"/>
           <w:szCs w:val="24"/>
         </w:rPr>
-        <w:t xml:space="preserve">Version 1.8.0</w:t>
+        <w:t xml:space="preserve">Version 1.9.0</w:t>
       </w:r>
     </w:p>
     <w:p>
@@ -307,7 +307,22 @@
           <w:sz w:val="20"/>
           <w:szCs w:val="20"/>
         </w:rPr>
-        <w:t xml:space="preserve">4.5 Storage forecast</w:t>
+        <w:t xml:space="preserve">4.5 Charts, colours and drill-down</w:t>
+      </w:r>
+    </w:p>
+    <w:p>
+      <w:pPr>
+        <w:spacing w:after="40"/>
+        <w:ind w:left="540"/>
+      </w:pPr>
+      <w:r>
+        <w:rPr>
+          <w:b w:val="false"/>
+          <w:bCs w:val="false"/>
+          <w:sz w:val="20"/>
+          <w:szCs w:val="20"/>
+        </w:rPr>
+        <w:t xml:space="preserve">4.6 Storage forecast</w:t>
       </w:r>
     </w:p>
     <w:p>
@@ -18874,7 +18889,7 @@
         <w:sz w:val="16"/>
         <w:szCs w:val="16"/>
       </w:rPr>
-      <w:t xml:space="preserve">MediaLedger 1.8.0 · User Manual</w:t>
+      <w:t xml:space="preserve">MediaLedger 1.9.0 · User Manual</w:t>
     </w:r>
   </w:p>
 </w:hdr>

</xml_diff>

<commit_message>
Release 1.9.2: Schedules section listing every timed job with last and next run and Run now; timed Plex sync independent of scans; configurable snapshot time
</commit_message>
<xml_diff>
--- a/docs/MediaLedger-Manual.docx
+++ b/docs/MediaLedger-Manual.docx
@@ -42,7 +42,7 @@
           <w:sz w:val="24"/>
           <w:szCs w:val="24"/>
         </w:rPr>
-        <w:t xml:space="preserve">Version 1.9.1</w:t>
+        <w:t xml:space="preserve">Version 1.9.2</w:t>
       </w:r>
     </w:p>
     <w:p>
@@ -7445,6 +7445,52 @@
     </w:p>
     <w:p>
       <w:pPr>
+        <w:pStyle w:val="Heading2"/>
+      </w:pPr>
+      <w:r>
+        <w:t xml:space="preserve">13.2 Schedules</w:t>
+      </w:r>
+    </w:p>
+    <w:p>
+      <w:pPr>
+        <w:spacing w:after="120"/>
+      </w:pPr>
+      <w:r>
+        <w:t xml:space="preserve">Settings → </w:t>
+      </w:r>
+      <w:r>
+        <w:rPr>
+          <w:b/>
+          <w:bCs/>
+        </w:rPr>
+        <w:t xml:space="preserve">Schedules</w:t>
+      </w:r>
+      <w:r>
+        <w:t xml:space="preserve"> lists every job MediaLedger runs on its own, in one table: the library scan, the Plex sync, episode counts and airing dates, the backup, the daily snapshot and the daily summary. Each row shows when it runs, the last run and its result, the next run, and a </w:t>
+      </w:r>
+      <w:r>
+        <w:rPr>
+          <w:b/>
+          <w:bCs/>
+        </w:rPr>
+        <w:t xml:space="preserve">Run now</w:t>
+      </w:r>
+      <w:r>
+        <w:t xml:space="preserve"> button. The timing controls sit underneath: the </w:t>
+      </w:r>
+      <w:r>
+        <w:rPr>
+          <w:b/>
+          <w:bCs/>
+        </w:rPr>
+        <w:t xml:space="preserve">Plex sync</w:t>
+      </w:r>
+      <w:r>
+        <w:t xml:space="preserve"> interval (a timer keeps the Watched tab and play counts current on days without a scan; 0 means only after scans), the backup time and how many copies to keep, the snapshot time and the summary time. The scan timers and the Windows scheduled task follow.</w:t>
+      </w:r>
+    </w:p>
+    <w:p>
+      <w:pPr>
         <w:pStyle w:val="Heading1"/>
         <w:pageBreakBefore/>
       </w:pPr>
@@ -18953,7 +18999,7 @@
         <w:sz w:val="16"/>
         <w:szCs w:val="16"/>
       </w:rPr>
-      <w:t xml:space="preserve">MediaLedger 1.9.1 · User Manual</w:t>
+      <w:t xml:space="preserve">MediaLedger 1.9.2 · User Manual</w:t>
     </w:r>
   </w:p>
 </w:hdr>

</xml_diff>

<commit_message>
Release 1.9.3: card tables fit their cards so badges no longer clip, two-column rows stack on mid-width windows, Plex sync timer defaults to 6 hours and is linked from the Plex section
</commit_message>
<xml_diff>
--- a/docs/MediaLedger-Manual.docx
+++ b/docs/MediaLedger-Manual.docx
@@ -42,7 +42,7 @@
           <w:sz w:val="24"/>
           <w:szCs w:val="24"/>
         </w:rPr>
-        <w:t xml:space="preserve">Version 1.9.2</w:t>
+        <w:t xml:space="preserve">Version 1.9.3</w:t>
       </w:r>
     </w:p>
     <w:p>
@@ -18999,7 +18999,7 @@
         <w:sz w:val="16"/>
         <w:szCs w:val="16"/>
       </w:rPr>
-      <w:t xml:space="preserve">MediaLedger 1.9.2 · User Manual</w:t>
+      <w:t xml:space="preserve">MediaLedger 1.9.3 · User Manual</w:t>
     </w:r>
   </w:p>
 </w:hdr>

</xml_diff>

<commit_message>
Release 1.11.0: collecting policy per series so long runners stop swamping Missing, episodes filed under Movies flagged on Problems, Plex sync breakdown per library with reasons
</commit_message>
<xml_diff>
--- a/docs/MediaLedger-Manual.docx
+++ b/docs/MediaLedger-Manual.docx
@@ -42,7 +42,7 @@
           <w:sz w:val="24"/>
           <w:szCs w:val="24"/>
         </w:rPr>
-        <w:t xml:space="preserve">Version 1.10.0</w:t>
+        <w:t xml:space="preserve">Version 1.11.0</w:t>
       </w:r>
     </w:p>
     <w:p>
@@ -458,6 +458,21 @@
           <w:szCs w:val="20"/>
         </w:rPr>
         <w:t xml:space="preserve">9.2 Airing next</w:t>
+      </w:r>
+    </w:p>
+    <w:p>
+      <w:pPr>
+        <w:spacing w:after="40"/>
+        <w:ind w:left="540"/>
+      </w:pPr>
+      <w:r>
+        <w:rPr>
+          <w:b w:val="false"/>
+          <w:bCs w:val="false"/>
+          <w:sz w:val="20"/>
+          <w:szCs w:val="20"/>
+        </w:rPr>
+        <w:t xml:space="preserve">9.3 What you are collecting</w:t>
       </w:r>
     </w:p>
     <w:p>
@@ -5874,6 +5889,86 @@
     </w:p>
     <w:p>
       <w:pPr>
+        <w:pStyle w:val="Heading2"/>
+      </w:pPr>
+      <w:r>
+        <w:t xml:space="preserve">9.3 What you are collecting</w:t>
+      </w:r>
+    </w:p>
+    <w:p>
+      <w:pPr>
+        <w:spacing w:after="120"/>
+      </w:pPr>
+      <w:r>
+        <w:t xml:space="preserve">A long runner you joined late can swamp the Missing page: a thousand early episodes you never meant to keep. </w:t>
+      </w:r>
+      <w:r>
+        <w:rPr>
+          <w:b/>
+          <w:bCs/>
+        </w:rPr>
+        <w:t xml:space="preserve">Collect…</w:t>
+      </w:r>
+      <w:r>
+        <w:t xml:space="preserve"> on a series row sets what counts as missing for that one series. </w:t>
+      </w:r>
+      <w:r>
+        <w:rPr>
+          <w:b/>
+          <w:bCs/>
+        </w:rPr>
+        <w:t xml:space="preserve">Everything</w:t>
+      </w:r>
+      <w:r>
+        <w:t xml:space="preserve"> is the default. </w:t>
+      </w:r>
+      <w:r>
+        <w:rPr>
+          <w:b/>
+          <w:bCs/>
+        </w:rPr>
+        <w:t xml:space="preserve">From season S episode E onward</w:t>
+      </w:r>
+      <w:r>
+        <w:t xml:space="preserve"> drops everything earlier; shows numbered straight through use season 1 and the episode number. </w:t>
+      </w:r>
+      <w:r>
+        <w:rPr>
+          <w:b/>
+          <w:bCs/>
+        </w:rPr>
+        <w:t xml:space="preserve">Mute this series</w:t>
+      </w:r>
+      <w:r>
+        <w:t xml:space="preserve"> counts nothing. The row keeps a badge (</w:t>
+      </w:r>
+      <w:r>
+        <w:rPr>
+          <w:rFonts w:ascii="Consolas" w:cs="Consolas" w:eastAsia="Consolas" w:hAnsi="Consolas"/>
+          <w:sz w:val="19"/>
+          <w:szCs w:val="19"/>
+          <w:shd w:fill="EEF1F5" w:val="clear"/>
+        </w:rPr>
+        <w:t xml:space="preserve">from S1E1100</w:t>
+      </w:r>
+      <w:r>
+        <w:t xml:space="preserve">, </w:t>
+      </w:r>
+      <w:r>
+        <w:rPr>
+          <w:rFonts w:ascii="Consolas" w:cs="Consolas" w:eastAsia="Consolas" w:hAnsi="Consolas"/>
+          <w:sz w:val="19"/>
+          <w:szCs w:val="19"/>
+          <w:shd w:fill="EEF1F5" w:val="clear"/>
+        </w:rPr>
+        <w:t xml:space="preserve">muted</w:t>
+      </w:r>
+      <w:r>
+        <w:t xml:space="preserve">) whose tooltip gives the full count, and the dashboard, the sidebar count, the daily summary and the Home Assistant status all follow the policy. No file is touched.</w:t>
+      </w:r>
+    </w:p>
+    <w:p>
+      <w:pPr>
         <w:pStyle w:val="Heading1"/>
         <w:pageBreakBefore/>
       </w:pPr>
@@ -6366,6 +6461,57 @@
     </w:p>
     <w:p>
       <w:pPr>
+        <w:spacing w:after="120"/>
+      </w:pPr>
+      <w:r>
+        <w:rPr>
+          <w:b/>
+          <w:bCs/>
+        </w:rPr>
+        <w:t xml:space="preserve">Episodes filed under Movies</w:t>
+      </w:r>
+      <w:r>
+        <w:t xml:space="preserve"> lists files in a movie folder whose name carries a season or episode marker (</w:t>
+      </w:r>
+      <w:r>
+        <w:rPr>
+          <w:rFonts w:ascii="Consolas" w:cs="Consolas" w:eastAsia="Consolas" w:hAnsi="Consolas"/>
+          <w:sz w:val="19"/>
+          <w:szCs w:val="19"/>
+          <w:shd w:fill="EEF1F5" w:val="clear"/>
+        </w:rPr>
+        <w:t xml:space="preserve">S01E02</w:t>
+      </w:r>
+      <w:r>
+        <w:t xml:space="preserve">, </w:t>
+      </w:r>
+      <w:r>
+        <w:rPr>
+          <w:rFonts w:ascii="Consolas" w:cs="Consolas" w:eastAsia="Consolas" w:hAnsi="Consolas"/>
+          <w:sz w:val="19"/>
+          <w:szCs w:val="19"/>
+          <w:shd w:fill="EEF1F5" w:val="clear"/>
+        </w:rPr>
+        <w:t xml:space="preserve">1x02</w:t>
+      </w:r>
+      <w:r>
+        <w:t xml:space="preserve">, </w:t>
+      </w:r>
+      <w:r>
+        <w:rPr>
+          <w:rFonts w:ascii="Consolas" w:cs="Consolas" w:eastAsia="Consolas" w:hAnsi="Consolas"/>
+          <w:sz w:val="19"/>
+          <w:szCs w:val="19"/>
+          <w:shd w:fill="EEF1F5" w:val="clear"/>
+        </w:rPr>
+        <w:t xml:space="preserve">Season 2</w:t>
+      </w:r>
+      <w:r>
+        <w:t xml:space="preserve">). They show up as odd movies everywhere else, so move them to a TV or anime folder; if one really is a film, use Fix to ignore it. A bare "Episode 1" is not flagged, so the Star Wars films are safe.</w:t>
+      </w:r>
+    </w:p>
+    <w:p>
+      <w:pPr>
         <w:pStyle w:val="Heading1"/>
         <w:pageBreakBefore/>
       </w:pPr>
@@ -11629,6 +11775,24 @@
     </w:p>
     <w:p>
       <w:pPr>
+        <w:spacing w:after="120"/>
+      </w:pPr>
+      <w:r>
+        <w:t xml:space="preserve">Under the last-sync line a table breaks the sync down </w:t>
+      </w:r>
+      <w:r>
+        <w:rPr>
+          <w:b/>
+          <w:bCs/>
+        </w:rPr>
+        <w:t xml:space="preserve">per Plex library</w:t>
+      </w:r>
+      <w:r>
+        <w:t xml:space="preserve">: items, matched, unmatched and why. *No path mapping covers this folder* means that library lives under a path none of your mappings translate: add a mapping for it. *File is not in a scanned root* means Plex has files MediaLedger does not scan: add the root, or ignore it if that library is not meant to be tracked. The first unmatched path is shown as Plex reports it and as MediaLedger translated it, which is usually enough to see the difference.</w:t>
+      </w:r>
+    </w:p>
+    <w:p>
+      <w:pPr>
         <w:pStyle w:val="Heading1"/>
         <w:pageBreakBefore/>
       </w:pPr>
@@ -19364,7 +19528,7 @@
         <w:sz w:val="16"/>
         <w:szCs w:val="16"/>
       </w:rPr>
-      <w:t xml:space="preserve">MediaLedger 1.10.0 · User Manual</w:t>
+      <w:t xml:space="preserve">MediaLedger 1.11.0 · User Manual</w:t>
     </w:r>
   </w:p>
 </w:hdr>

</xml_diff>

<commit_message>
Release 1.12.1: mount watchdog sees through the automount trap and the reachability check nudges it, HTTPS off switch for reverse proxies, installer honours --port with --update-only, Caddy chapter in the manual
</commit_message>
<xml_diff>
--- a/docs/MediaLedger-Manual.docx
+++ b/docs/MediaLedger-Manual.docx
@@ -42,7 +42,7 @@
           <w:sz w:val="24"/>
           <w:szCs w:val="24"/>
         </w:rPr>
-        <w:t xml:space="preserve">Version 1.12.0</w:t>
+        <w:t xml:space="preserve">Version 1.12.1</w:t>
       </w:r>
     </w:p>
     <w:p>
@@ -15992,6 +15992,54 @@
                 <w:szCs w:val="19"/>
                 <w:shd w:fill="EEF1F5" w:val="clear"/>
               </w:rPr>
+              <w:t xml:space="preserve">sudo bash install.sh --update-only --port=8080</w:t>
+            </w:r>
+          </w:p>
+        </w:tc>
+        <w:tc>
+          <w:tcPr>
+            <w:tcW w:type="dxa" w:w="0"/>
+            <w:tcMar>
+              <w:top w:type="dxa" w:w="60"/>
+              <w:left w:type="dxa" w:w="100"/>
+              <w:bottom w:type="dxa" w:w="60"/>
+              <w:right w:type="dxa" w:w="100"/>
+            </w:tcMar>
+          </w:tcPr>
+          <w:p>
+            <w:r>
+              <w:rPr>
+                <w:b w:val="false"/>
+                <w:bCs w:val="false"/>
+                <w:sz w:val="19"/>
+                <w:szCs w:val="19"/>
+              </w:rPr>
+              <w:t xml:space="preserve">Move the service to another port without a full reinstall, for example to put it behind a reverse proxy such as Caddy. The Caddy setup is described below.</w:t>
+            </w:r>
+          </w:p>
+        </w:tc>
+      </w:tr>
+      <w:tr>
+        <w:tc>
+          <w:tcPr>
+            <w:tcW w:type="dxa" w:w="0"/>
+            <w:tcMar>
+              <w:top w:type="dxa" w:w="60"/>
+              <w:left w:type="dxa" w:w="100"/>
+              <w:bottom w:type="dxa" w:w="60"/>
+              <w:right w:type="dxa" w:w="100"/>
+            </w:tcMar>
+          </w:tcPr>
+          <w:p>
+            <w:r>
+              <w:rPr>
+                <w:rFonts w:ascii="Consolas" w:cs="Consolas" w:eastAsia="Consolas" w:hAnsi="Consolas"/>
+                <w:b w:val="false"/>
+                <w:bCs w:val="false"/>
+                <w:sz w:val="19"/>
+                <w:szCs w:val="19"/>
+                <w:shd w:fill="EEF1F5" w:val="clear"/>
+              </w:rPr>
               <w:t xml:space="preserve">sudo bash install.sh --auto-update</w:t>
             </w:r>
           </w:p>
@@ -18278,6 +18326,166 @@
         </w:tc>
       </w:tr>
     </w:tbl>
+    <w:p>
+      <w:pPr>
+        <w:pStyle w:val="Heading2"/>
+      </w:pPr>
+      <w:r>
+        <w:t xml:space="preserve">22.1 Several services on one Pi: Caddy in front</w:t>
+      </w:r>
+    </w:p>
+    <w:p>
+      <w:pPr>
+        <w:spacing w:after="120"/>
+      </w:pPr>
+      <w:r>
+        <w:t xml:space="preserve">DNS records carry an address, never a port, so a second web service on the same Pi either lives on its own port in the URL or sits behind a reverse proxy. </w:t>
+      </w:r>
+      <w:r>
+        <w:rPr>
+          <w:b/>
+          <w:bCs/>
+        </w:rPr>
+        <w:t xml:space="preserve">Caddy</w:t>
+      </w:r>
+      <w:r>
+        <w:t xml:space="preserve"> is the easy proxy: it owns ports 80 and 443, reads the name the browser asked for, and hands the request to the right service on a local port. Every service then has a clean </w:t>
+      </w:r>
+      <w:r>
+        <w:rPr>
+          <w:rFonts w:ascii="Consolas" w:cs="Consolas" w:eastAsia="Consolas" w:hAnsi="Consolas"/>
+          <w:sz w:val="19"/>
+          <w:szCs w:val="19"/>
+          <w:shd w:fill="EEF1F5" w:val="clear"/>
+        </w:rPr>
+        <w:t xml:space="preserve">https://name.home</w:t>
+      </w:r>
+      <w:r>
+        <w:t xml:space="preserve"> address with no port, and one root certificate covers all of them.</w:t>
+      </w:r>
+    </w:p>
+    <w:p>
+      <w:pPr>
+        <w:spacing w:after="120"/>
+      </w:pPr>
+      <w:r>
+        <w:t xml:space="preserve">Setup, once: </w:t>
+      </w:r>
+      <w:r>
+        <w:rPr>
+          <w:rFonts w:ascii="Consolas" w:cs="Consolas" w:eastAsia="Consolas" w:hAnsi="Consolas"/>
+          <w:sz w:val="19"/>
+          <w:szCs w:val="19"/>
+          <w:shd w:fill="EEF1F5" w:val="clear"/>
+        </w:rPr>
+        <w:t xml:space="preserve">sudo apt install caddy</w:t>
+      </w:r>
+      <w:r>
+        <w:t xml:space="preserve">; move MediaLedger off 80/443 with </w:t>
+      </w:r>
+      <w:r>
+        <w:rPr>
+          <w:rFonts w:ascii="Consolas" w:cs="Consolas" w:eastAsia="Consolas" w:hAnsi="Consolas"/>
+          <w:sz w:val="19"/>
+          <w:szCs w:val="19"/>
+          <w:shd w:fill="EEF1F5" w:val="clear"/>
+        </w:rPr>
+        <w:t xml:space="preserve">sudo bash install.sh --update-only --port=8080</w:t>
+      </w:r>
+      <w:r>
+        <w:t xml:space="preserve">; turn its own HTTPS off (Security → </w:t>
+      </w:r>
+      <w:r>
+        <w:rPr>
+          <w:b/>
+          <w:bCs/>
+        </w:rPr>
+        <w:t xml:space="preserve">Turn HTTPS off</w:t>
+      </w:r>
+      <w:r>
+        <w:t xml:space="preserve">); write </w:t>
+      </w:r>
+      <w:r>
+        <w:rPr>
+          <w:rFonts w:ascii="Consolas" w:cs="Consolas" w:eastAsia="Consolas" w:hAnsi="Consolas"/>
+          <w:sz w:val="19"/>
+          <w:szCs w:val="19"/>
+          <w:shd w:fill="EEF1F5" w:val="clear"/>
+        </w:rPr>
+        <w:t xml:space="preserve">/etc/caddy/Caddyfile</w:t>
+      </w:r>
+      <w:r>
+        <w:t xml:space="preserve"> with one block per service, </w:t>
+      </w:r>
+      <w:r>
+        <w:rPr>
+          <w:rFonts w:ascii="Consolas" w:cs="Consolas" w:eastAsia="Consolas" w:hAnsi="Consolas"/>
+          <w:sz w:val="19"/>
+          <w:szCs w:val="19"/>
+          <w:shd w:fill="EEF1F5" w:val="clear"/>
+        </w:rPr>
+        <w:t xml:space="preserve">medialedger.home { tls internal  reverse_proxy 127.0.0.1:8080 }</w:t>
+      </w:r>
+      <w:r>
+        <w:t xml:space="preserve">, and </w:t>
+      </w:r>
+      <w:r>
+        <w:rPr>
+          <w:rFonts w:ascii="Consolas" w:cs="Consolas" w:eastAsia="Consolas" w:hAnsi="Consolas"/>
+          <w:sz w:val="19"/>
+          <w:szCs w:val="19"/>
+          <w:shd w:fill="EEF1F5" w:val="clear"/>
+        </w:rPr>
+        <w:t xml:space="preserve">sudo systemctl reload caddy</w:t>
+      </w:r>
+      <w:r>
+        <w:t xml:space="preserve">. </w:t>
+      </w:r>
+      <w:r>
+        <w:rPr>
+          <w:rFonts w:ascii="Consolas" w:cs="Consolas" w:eastAsia="Consolas" w:hAnsi="Consolas"/>
+          <w:sz w:val="19"/>
+          <w:szCs w:val="19"/>
+          <w:shd w:fill="EEF1F5" w:val="clear"/>
+        </w:rPr>
+        <w:t xml:space="preserve">tls internal</w:t>
+      </w:r>
+      <w:r>
+        <w:t xml:space="preserve"> makes Caddy issue certificates from its own authority; install its root once per device from </w:t>
+      </w:r>
+      <w:r>
+        <w:rPr>
+          <w:rFonts w:ascii="Consolas" w:cs="Consolas" w:eastAsia="Consolas" w:hAnsi="Consolas"/>
+          <w:sz w:val="19"/>
+          <w:szCs w:val="19"/>
+          <w:shd w:fill="EEF1F5" w:val="clear"/>
+        </w:rPr>
+        <w:t xml:space="preserve">/var/lib/caddy/.local/share/caddy/pki/authorities/local/root.crt</w:t>
+      </w:r>
+      <w:r>
+        <w:t xml:space="preserve"> and no service on that Pi warns again. To let visitors in over plain HTTP without a certificate, name both schemes: </w:t>
+      </w:r>
+      <w:r>
+        <w:rPr>
+          <w:rFonts w:ascii="Consolas" w:cs="Consolas" w:eastAsia="Consolas" w:hAnsi="Consolas"/>
+          <w:sz w:val="19"/>
+          <w:szCs w:val="19"/>
+          <w:shd w:fill="EEF1F5" w:val="clear"/>
+        </w:rPr>
+        <w:t xml:space="preserve">http://medialedger.home, https://medialedger.home { … }</w:t>
+      </w:r>
+      <w:r>
+        <w:t xml:space="preserve">.</w:t>
+      </w:r>
+    </w:p>
+    <w:p>
+      <w:pPr>
+        <w:spacing w:after="120"/>
+      </w:pPr>
+      <w:r>
+        <w:t xml:space="preserve">Adding a service later is one block in the Caddyfile on the next free port, a reload, and one DNS record for the new name pointing at the same Pi. Behind the proxy MediaLedger sees every visitor as 127.0.0.1 unless the proxy forwards the real address, which Caddy does by default.</w:t>
+      </w:r>
+    </w:p>
     <w:p>
       <w:pPr>
         <w:pStyle w:val="Heading1"/>
@@ -19681,7 +19889,7 @@
         <w:sz w:val="16"/>
         <w:szCs w:val="16"/>
       </w:rPr>
-      <w:t xml:space="preserve">MediaLedger 1.12.0 · User Manual</w:t>
+      <w:t xml:space="preserve">MediaLedger 1.12.1 · User Manual</w:t>
     </w:r>
   </w:p>
 </w:hdr>

</xml_diff>

<commit_message>
Release 2.0.1: the server checks the family portal's addresses on a timer and on demand, with tiles, a Schedules row and notifications; invites need an address first
</commit_message>
<xml_diff>
--- a/docs/MediaLedger-Manual.docx
+++ b/docs/MediaLedger-Manual.docx
@@ -42,7 +42,7 @@
           <w:sz w:val="24"/>
           <w:szCs w:val="24"/>
         </w:rPr>
-        <w:t xml:space="preserve">Version 2.0.0</w:t>
+        <w:t xml:space="preserve">Version 2.0.1</w:t>
       </w:r>
     </w:p>
     <w:p>
@@ -8335,6 +8335,41 @@
     </w:p>
     <w:p>
       <w:pPr>
+        <w:spacing w:after="120"/>
+      </w:pPr>
+      <w:r>
+        <w:rPr>
+          <w:b/>
+          <w:bCs/>
+        </w:rPr>
+        <w:t xml:space="preserve">Is it working?</w:t>
+      </w:r>
+      <w:r>
+        <w:t xml:space="preserve"> The server tests its own addresses the way a visitor would: it looks the name up, connects, checks the certificate and asks the portal to identify itself, so a name that points somewhere else does not pass. It does this every 15 minutes (set the interval at the bottom of the page; 0 turns it off) and when you press </w:t>
+      </w:r>
+      <w:r>
+        <w:rPr>
+          <w:b/>
+          <w:bCs/>
+        </w:rPr>
+        <w:t xml:space="preserve">Check the addresses now</w:t>
+      </w:r>
+      <w:r>
+        <w:t xml:space="preserve">. The two tiles show *working* with the response time, when it was last checked, how long it has been up or down, and the days left on the certificate. One failed check turns a tile amber; two in a row turn it red, put a notice on the Dashboard, write the log and, when </w:t>
+      </w:r>
+      <w:r>
+        <w:rPr>
+          <w:b/>
+          <w:bCs/>
+        </w:rPr>
+        <w:t xml:space="preserve">family portal not reachable</w:t>
+      </w:r>
+      <w:r>
+        <w:t xml:space="preserve"> is ticked under Notifications, send a message, with another when it comes back. The check is also a row under Settings → Schedules. A home address served by Caddy uses Caddy's own certificates, which the check accepts without verifying, and says so.</w:t>
+      </w:r>
+    </w:p>
+    <w:p>
+      <w:pPr>
         <w:pStyle w:val="Heading1"/>
         <w:pageBreakBefore/>
       </w:pPr>
@@ -20651,7 +20686,7 @@
         <w:sz w:val="16"/>
         <w:szCs w:val="16"/>
       </w:rPr>
-      <w:t xml:space="preserve">MediaLedger 2.0.0 · User Manual</w:t>
+      <w:t xml:space="preserve">MediaLedger 2.0.1 · User Manual</w:t>
     </w:r>
   </w:p>
 </w:hdr>

</xml_diff>

<commit_message>
Release 2.1.1: editing the dashboard no longer reloads its data on every action, and the dashboard report is served from memory while the library is unchanged
</commit_message>
<xml_diff>
--- a/docs/MediaLedger-Manual.docx
+++ b/docs/MediaLedger-Manual.docx
@@ -42,7 +42,7 @@
           <w:sz w:val="24"/>
           <w:szCs w:val="24"/>
         </w:rPr>
-        <w:t xml:space="preserve">Version 2.1.0</w:t>
+        <w:t xml:space="preserve">Version 2.1.1</w:t>
       </w:r>
     </w:p>
     <w:p>
@@ -20933,7 +20933,7 @@
         <w:sz w:val="16"/>
         <w:szCs w:val="16"/>
       </w:rPr>
-      <w:t xml:space="preserve">MediaLedger 2.1.0 · User Manual</w:t>
+      <w:t xml:space="preserve">MediaLedger 2.1.1 · User Manual</w:t>
     </w:r>
   </w:p>
 </w:hdr>

</xml_diff>

<commit_message>
Release 2.3.0: sort menu on the lists, poster wall details and hover card, sidebar that folds to icons, grouped Settings, HTTPS recognised behind Caddy, clearer family portal check
</commit_message>
<xml_diff>
--- a/docs/MediaLedger-Manual.docx
+++ b/docs/MediaLedger-Manual.docx
@@ -42,7 +42,7 @@
           <w:sz w:val="24"/>
           <w:szCs w:val="24"/>
         </w:rPr>
-        <w:t>Version 2.2.0</w:t>
+        <w:t>Version 2.3.0</w:t>
       </w:r>
     </w:p>
     <w:p>
@@ -2477,7 +2477,7 @@
           <w:noProof/>
         </w:rPr>
         <w:drawing>
-          <wp:inline distT="0" distB="0" distL="0" distR="0" wp14:anchorId="242D42D8" wp14:editId="776A195B">
+          <wp:inline distT="0" distB="0" distL="0" distR="0" wp14:anchorId="0643C1D9" wp14:editId="707053A8">
             <wp:extent cx="5943600" cy="3714750"/>
             <wp:effectExtent l="0" t="0" r="0" b="0"/>
             <wp:docPr id="1" name="Picture 1"/>
@@ -3699,10 +3699,10 @@
           <w:noProof/>
         </w:rPr>
         <w:drawing>
-          <wp:inline distT="0" distB="0" distL="0" distR="0" wp14:anchorId="3C5B9D70" wp14:editId="21B3A263">
+          <wp:inline distT="0" distB="0" distL="0" distR="0" wp14:anchorId="20464C38" wp14:editId="43E6C14F">
             <wp:extent cx="5943600" cy="3714750"/>
             <wp:effectExtent l="0" t="0" r="0" b="0"/>
-            <wp:docPr id="2121735305" name="Picture 2121735305"/>
+            <wp:docPr id="1953411480" name="Picture 1953411480"/>
             <wp:cNvGraphicFramePr>
               <a:graphicFrameLocks xmlns:a="http://schemas.openxmlformats.org/drawingml/2006/main" noChangeAspect="1"/>
             </wp:cNvGraphicFramePr>
@@ -4385,10 +4385,10 @@
           <w:noProof/>
         </w:rPr>
         <w:drawing>
-          <wp:inline distT="0" distB="0" distL="0" distR="0" wp14:anchorId="03697B7F" wp14:editId="00B36E37">
+          <wp:inline distT="0" distB="0" distL="0" distR="0" wp14:anchorId="0692B9B0" wp14:editId="45EA3B13">
             <wp:extent cx="5943600" cy="3714750"/>
             <wp:effectExtent l="0" t="0" r="0" b="0"/>
-            <wp:docPr id="1919881527" name="Picture 1919881527"/>
+            <wp:docPr id="450319259" name="Picture 450319259"/>
             <wp:cNvGraphicFramePr>
               <a:graphicFrameLocks xmlns:a="http://schemas.openxmlformats.org/drawingml/2006/main" noChangeAspect="1"/>
             </wp:cNvGraphicFramePr>
@@ -5074,10 +5074,10 @@
           <w:noProof/>
         </w:rPr>
         <w:drawing>
-          <wp:inline distT="0" distB="0" distL="0" distR="0" wp14:anchorId="7E97D47F" wp14:editId="21C005E6">
+          <wp:inline distT="0" distB="0" distL="0" distR="0" wp14:anchorId="45E93333" wp14:editId="1E5E0991">
             <wp:extent cx="5943600" cy="3714750"/>
             <wp:effectExtent l="0" t="0" r="0" b="0"/>
-            <wp:docPr id="1920649925" name="Picture 1920649925"/>
+            <wp:docPr id="400470957" name="Picture 400470957"/>
             <wp:cNvGraphicFramePr>
               <a:graphicFrameLocks xmlns:a="http://schemas.openxmlformats.org/drawingml/2006/main" noChangeAspect="1"/>
             </wp:cNvGraphicFramePr>
@@ -5134,6 +5134,85 @@
         <w:spacing w:after="120"/>
       </w:pPr>
       <w:r>
+        <w:rPr>
+          <w:b/>
+          <w:bCs/>
+        </w:rPr>
+        <w:t>Sorting a list.</w:t>
+      </w:r>
+      <w:r>
+        <w:t xml:space="preserve"> Beside the filter box, </w:t>
+      </w:r>
+      <w:r>
+        <w:rPr>
+          <w:b/>
+          <w:bCs/>
+        </w:rPr>
+        <w:t>Sort by</w:t>
+      </w:r>
+      <w:r>
+        <w:t xml:space="preserve"> lists what the TV, Anime and Movies pages can be ordered by: title, year, the ratings (online, Plex audience and critic, your own), unwatched episodes, last episode </w:t>
+      </w:r>
+      <w:r>
+        <w:lastRenderedPageBreak/>
+        <w:t xml:space="preserve">added, date added, date viewed, plays, episodes, seasons, duration, size, resolution, bitrate, missing episodes, and </w:t>
+      </w:r>
+      <w:r>
+        <w:rPr>
+          <w:b/>
+          <w:bCs/>
+        </w:rPr>
+        <w:t>Randomly</w:t>
+      </w:r>
+      <w:r>
+        <w:t>; Movies adds progress and versions. The arrow button next to it flips between ascending and descending. Clicking a column heading still sorts too. The choice is remembered per list on the device you set it on. "Date added" is the earlier of when MediaLedger first saw the file and the file's own date, so an old library does not all look new.</w:t>
+      </w:r>
+    </w:p>
+    <w:p>
+      <w:pPr>
+        <w:spacing w:after="120"/>
+      </w:pPr>
+      <w:r>
+        <w:rPr>
+          <w:b/>
+          <w:bCs/>
+        </w:rPr>
+        <w:t>On the poster wall</w:t>
+      </w:r>
+      <w:r>
+        <w:t xml:space="preserve"> each tile shows the seasons and episodes on hand (for a movie: length and quality) under the title. Rest the pointer on a tile for a card with the rest: runtime and size, quality, missing episodes, how much is watched and when last, ratings, the next episode date, when it was added, genres and your tags.</w:t>
+      </w:r>
+    </w:p>
+    <w:p>
+      <w:pPr>
+        <w:spacing w:after="120"/>
+      </w:pPr>
+      <w:r>
+        <w:rPr>
+          <w:b/>
+          <w:bCs/>
+        </w:rPr>
+        <w:t>The sidebar</w:t>
+      </w:r>
+      <w:r>
+        <w:t xml:space="preserve"> folds to a strip of icons with the </w:t>
+      </w:r>
+      <w:r>
+        <w:rPr>
+          <w:b/>
+          <w:bCs/>
+        </w:rPr>
+        <w:t>«</w:t>
+      </w:r>
+      <w:r>
+        <w:t xml:space="preserve"> button at its top (wide screens; phones keep the slide-out menu). Badges stay on the icons and each icon shows its name when the pointer rests on it.</w:t>
+      </w:r>
+    </w:p>
+    <w:p>
+      <w:pPr>
+        <w:spacing w:after="120"/>
+      </w:pPr>
+      <w:r>
         <w:t xml:space="preserve">Every series and movie can carry a </w:t>
       </w:r>
       <w:r>
@@ -5151,15 +5230,7 @@
           <w:b/>
           <w:bCs/>
         </w:rPr>
-        <w:t xml:space="preserve">▦ </w:t>
-      </w:r>
-      <w:r>
-        <w:rPr>
-          <w:b/>
-          <w:bCs/>
-        </w:rPr>
-        <w:lastRenderedPageBreak/>
-        <w:t>Posters</w:t>
+        <w:t>▦ Posters</w:t>
       </w:r>
       <w:r>
         <w:t xml:space="preserve"> in the toolbar of a list turns the table into a wall of posters; search, the filters and sorting keep working, and </w:t>
@@ -5326,10 +5397,10 @@
           <w:noProof/>
         </w:rPr>
         <w:drawing>
-          <wp:inline distT="0" distB="0" distL="0" distR="0" wp14:anchorId="5EAF0E03" wp14:editId="7CB97189">
+          <wp:inline distT="0" distB="0" distL="0" distR="0" wp14:anchorId="18A1B195" wp14:editId="0E26538F">
             <wp:extent cx="5943600" cy="3714750"/>
             <wp:effectExtent l="0" t="0" r="0" b="0"/>
-            <wp:docPr id="843729143" name="Picture 843729143"/>
+            <wp:docPr id="1037672505" name="Picture 1037672505"/>
             <wp:cNvGraphicFramePr>
               <a:graphicFrameLocks xmlns:a="http://schemas.openxmlformats.org/drawingml/2006/main" noChangeAspect="1"/>
             </wp:cNvGraphicFramePr>
@@ -5434,10 +5505,10 @@
         </w:rPr>
         <w:lastRenderedPageBreak/>
         <w:drawing>
-          <wp:inline distT="0" distB="0" distL="0" distR="0" wp14:anchorId="71459CE9" wp14:editId="16A19880">
+          <wp:inline distT="0" distB="0" distL="0" distR="0" wp14:anchorId="6F6051CA" wp14:editId="5D2E9F1A">
             <wp:extent cx="5943600" cy="3714750"/>
             <wp:effectExtent l="0" t="0" r="0" b="0"/>
-            <wp:docPr id="113673253" name="Picture 113673253"/>
+            <wp:docPr id="342543582" name="Picture 342543582"/>
             <wp:cNvGraphicFramePr>
               <a:graphicFrameLocks xmlns:a="http://schemas.openxmlformats.org/drawingml/2006/main" noChangeAspect="1"/>
             </wp:cNvGraphicFramePr>
@@ -5527,10 +5598,10 @@
           <w:noProof/>
         </w:rPr>
         <w:drawing>
-          <wp:inline distT="0" distB="0" distL="0" distR="0" wp14:anchorId="506411BC" wp14:editId="2A092BB8">
+          <wp:inline distT="0" distB="0" distL="0" distR="0" wp14:anchorId="609A97DD" wp14:editId="25C0D6F3">
             <wp:extent cx="5943600" cy="3714750"/>
             <wp:effectExtent l="0" t="0" r="0" b="0"/>
-            <wp:docPr id="869699701" name="Picture 869699701"/>
+            <wp:docPr id="2072805686" name="Picture 2072805686"/>
             <wp:cNvGraphicFramePr>
               <a:graphicFrameLocks xmlns:a="http://schemas.openxmlformats.org/drawingml/2006/main" noChangeAspect="1"/>
             </wp:cNvGraphicFramePr>
@@ -5793,10 +5864,10 @@
           <w:noProof/>
         </w:rPr>
         <w:drawing>
-          <wp:inline distT="0" distB="0" distL="0" distR="0" wp14:anchorId="3CDF0431" wp14:editId="52B0972E">
+          <wp:inline distT="0" distB="0" distL="0" distR="0" wp14:anchorId="7202DDB3" wp14:editId="7300096B">
             <wp:extent cx="5943600" cy="3714750"/>
             <wp:effectExtent l="0" t="0" r="0" b="0"/>
-            <wp:docPr id="567362515" name="Picture 567362515"/>
+            <wp:docPr id="503366745" name="Picture 503366745"/>
             <wp:cNvGraphicFramePr>
               <a:graphicFrameLocks xmlns:a="http://schemas.openxmlformats.org/drawingml/2006/main" noChangeAspect="1"/>
             </wp:cNvGraphicFramePr>
@@ -6375,10 +6446,10 @@
           <w:noProof/>
         </w:rPr>
         <w:drawing>
-          <wp:inline distT="0" distB="0" distL="0" distR="0" wp14:anchorId="5BA48F35" wp14:editId="5316D9BE">
+          <wp:inline distT="0" distB="0" distL="0" distR="0" wp14:anchorId="63765590" wp14:editId="4DBD73B7">
             <wp:extent cx="5943600" cy="3714750"/>
             <wp:effectExtent l="0" t="0" r="0" b="0"/>
-            <wp:docPr id="1847464579" name="Picture 1847464579"/>
+            <wp:docPr id="1874023799" name="Picture 1874023799"/>
             <wp:cNvGraphicFramePr>
               <a:graphicFrameLocks xmlns:a="http://schemas.openxmlformats.org/drawingml/2006/main" noChangeAspect="1"/>
             </wp:cNvGraphicFramePr>
@@ -6562,10 +6633,10 @@
         </w:rPr>
         <w:lastRenderedPageBreak/>
         <w:drawing>
-          <wp:inline distT="0" distB="0" distL="0" distR="0" wp14:anchorId="2EAC20AC" wp14:editId="1C6E2760">
+          <wp:inline distT="0" distB="0" distL="0" distR="0" wp14:anchorId="780D1DBA" wp14:editId="2A3A5824">
             <wp:extent cx="5943600" cy="3714750"/>
             <wp:effectExtent l="0" t="0" r="0" b="0"/>
-            <wp:docPr id="718884156" name="Picture 718884156"/>
+            <wp:docPr id="260938372" name="Picture 260938372"/>
             <wp:cNvGraphicFramePr>
               <a:graphicFrameLocks xmlns:a="http://schemas.openxmlformats.org/drawingml/2006/main" noChangeAspect="1"/>
             </wp:cNvGraphicFramePr>
@@ -6738,10 +6809,10 @@
         </w:rPr>
         <w:lastRenderedPageBreak/>
         <w:drawing>
-          <wp:inline distT="0" distB="0" distL="0" distR="0" wp14:anchorId="48E94CE4" wp14:editId="39379774">
+          <wp:inline distT="0" distB="0" distL="0" distR="0" wp14:anchorId="1B542264" wp14:editId="05B80A7B">
             <wp:extent cx="5943600" cy="3714750"/>
             <wp:effectExtent l="0" t="0" r="0" b="0"/>
-            <wp:docPr id="2130468453" name="Picture 2130468453"/>
+            <wp:docPr id="1359909426" name="Picture 1359909426"/>
             <wp:cNvGraphicFramePr>
               <a:graphicFrameLocks xmlns:a="http://schemas.openxmlformats.org/drawingml/2006/main" noChangeAspect="1"/>
             </wp:cNvGraphicFramePr>
@@ -6930,10 +7001,10 @@
           <w:noProof/>
         </w:rPr>
         <w:drawing>
-          <wp:inline distT="0" distB="0" distL="0" distR="0" wp14:anchorId="24BA01B4" wp14:editId="0EE01196">
+          <wp:inline distT="0" distB="0" distL="0" distR="0" wp14:anchorId="0076D459" wp14:editId="69BD0EA1">
             <wp:extent cx="5943600" cy="3714750"/>
             <wp:effectExtent l="0" t="0" r="0" b="0"/>
-            <wp:docPr id="990514617" name="Picture 990514617"/>
+            <wp:docPr id="1512713189" name="Picture 1512713189"/>
             <wp:cNvGraphicFramePr>
               <a:graphicFrameLocks xmlns:a="http://schemas.openxmlformats.org/drawingml/2006/main" noChangeAspect="1"/>
             </wp:cNvGraphicFramePr>
@@ -7113,10 +7184,10 @@
           <w:noProof/>
         </w:rPr>
         <w:drawing>
-          <wp:inline distT="0" distB="0" distL="0" distR="0" wp14:anchorId="450F6E00" wp14:editId="7BFBCCEA">
+          <wp:inline distT="0" distB="0" distL="0" distR="0" wp14:anchorId="14E72E74" wp14:editId="03EDCFAB">
             <wp:extent cx="5943600" cy="3714750"/>
             <wp:effectExtent l="0" t="0" r="0" b="0"/>
-            <wp:docPr id="1075846154" name="Picture 1075846154"/>
+            <wp:docPr id="42776953" name="Picture 42776953"/>
             <wp:cNvGraphicFramePr>
               <a:graphicFrameLocks xmlns:a="http://schemas.openxmlformats.org/drawingml/2006/main" noChangeAspect="1"/>
             </wp:cNvGraphicFramePr>
@@ -7615,10 +7686,10 @@
         </w:rPr>
         <w:lastRenderedPageBreak/>
         <w:drawing>
-          <wp:inline distT="0" distB="0" distL="0" distR="0" wp14:anchorId="05F121D3" wp14:editId="0EAB5606">
+          <wp:inline distT="0" distB="0" distL="0" distR="0" wp14:anchorId="55447716" wp14:editId="3E996806">
             <wp:extent cx="5943600" cy="3714750"/>
             <wp:effectExtent l="0" t="0" r="0" b="0"/>
-            <wp:docPr id="1256516438" name="Picture 1256516438"/>
+            <wp:docPr id="91311096" name="Picture 91311096"/>
             <wp:cNvGraphicFramePr>
               <a:graphicFrameLocks xmlns:a="http://schemas.openxmlformats.org/drawingml/2006/main" noChangeAspect="1"/>
             </wp:cNvGraphicFramePr>
@@ -7824,10 +7895,10 @@
         </w:rPr>
         <w:lastRenderedPageBreak/>
         <w:drawing>
-          <wp:inline distT="0" distB="0" distL="0" distR="0" wp14:anchorId="5E0FEAC3" wp14:editId="23AE18BA">
+          <wp:inline distT="0" distB="0" distL="0" distR="0" wp14:anchorId="1E3890A3" wp14:editId="7B118A9D">
             <wp:extent cx="5943600" cy="3714750"/>
             <wp:effectExtent l="0" t="0" r="0" b="0"/>
-            <wp:docPr id="399444629" name="Picture 399444629"/>
+            <wp:docPr id="1486286848" name="Picture 1486286848"/>
             <wp:cNvGraphicFramePr>
               <a:graphicFrameLocks xmlns:a="http://schemas.openxmlformats.org/drawingml/2006/main" noChangeAspect="1"/>
             </wp:cNvGraphicFramePr>
@@ -7967,10 +8038,10 @@
           <w:noProof/>
         </w:rPr>
         <w:drawing>
-          <wp:inline distT="0" distB="0" distL="0" distR="0" wp14:anchorId="68F761E6" wp14:editId="75739595">
+          <wp:inline distT="0" distB="0" distL="0" distR="0" wp14:anchorId="6AFF9B39" wp14:editId="6AF2D303">
             <wp:extent cx="5943600" cy="3714750"/>
             <wp:effectExtent l="0" t="0" r="0" b="0"/>
-            <wp:docPr id="1148499566" name="Picture 1148499566"/>
+            <wp:docPr id="484496660" name="Picture 484496660"/>
             <wp:cNvGraphicFramePr>
               <a:graphicFrameLocks xmlns:a="http://schemas.openxmlformats.org/drawingml/2006/main" noChangeAspect="1"/>
             </wp:cNvGraphicFramePr>
@@ -8296,10 +8367,10 @@
           <w:noProof/>
         </w:rPr>
         <w:drawing>
-          <wp:inline distT="0" distB="0" distL="0" distR="0" wp14:anchorId="6E3E7DF2" wp14:editId="6E72A0D3">
+          <wp:inline distT="0" distB="0" distL="0" distR="0" wp14:anchorId="00961D4B" wp14:editId="19EE7BD3">
             <wp:extent cx="5943600" cy="3714750"/>
             <wp:effectExtent l="0" t="0" r="0" b="0"/>
-            <wp:docPr id="1213292149" name="Picture 1213292149"/>
+            <wp:docPr id="1359884330" name="Picture 1359884330"/>
             <wp:cNvGraphicFramePr>
               <a:graphicFrameLocks xmlns:a="http://schemas.openxmlformats.org/drawingml/2006/main" noChangeAspect="1"/>
             </wp:cNvGraphicFramePr>
@@ -8672,10 +8743,10 @@
           <w:noProof/>
         </w:rPr>
         <w:drawing>
-          <wp:inline distT="0" distB="0" distL="0" distR="0" wp14:anchorId="3E90BEDB" wp14:editId="51F6A94E">
+          <wp:inline distT="0" distB="0" distL="0" distR="0" wp14:anchorId="6D10FC42" wp14:editId="3FAA5491">
             <wp:extent cx="5943600" cy="3714750"/>
             <wp:effectExtent l="0" t="0" r="0" b="0"/>
-            <wp:docPr id="243515062" name="Picture 243515062"/>
+            <wp:docPr id="1959868892" name="Picture 1959868892"/>
             <wp:cNvGraphicFramePr>
               <a:graphicFrameLocks xmlns:a="http://schemas.openxmlformats.org/drawingml/2006/main" noChangeAspect="1"/>
             </wp:cNvGraphicFramePr>
@@ -8825,10 +8896,10 @@
           <w:noProof/>
         </w:rPr>
         <w:drawing>
-          <wp:inline distT="0" distB="0" distL="0" distR="0" wp14:anchorId="7EC9F5B1" wp14:editId="24E377C5">
+          <wp:inline distT="0" distB="0" distL="0" distR="0" wp14:anchorId="047B2628" wp14:editId="03737A17">
             <wp:extent cx="5943600" cy="3714750"/>
             <wp:effectExtent l="0" t="0" r="0" b="0"/>
-            <wp:docPr id="1264049113" name="Picture 1264049113"/>
+            <wp:docPr id="1421371285" name="Picture 1421371285"/>
             <wp:cNvGraphicFramePr>
               <a:graphicFrameLocks xmlns:a="http://schemas.openxmlformats.org/drawingml/2006/main" noChangeAspect="1"/>
             </wp:cNvGraphicFramePr>
@@ -10663,10 +10734,10 @@
           <w:noProof/>
         </w:rPr>
         <w:drawing>
-          <wp:inline distT="0" distB="0" distL="0" distR="0" wp14:anchorId="45768CC5" wp14:editId="700330FD">
+          <wp:inline distT="0" distB="0" distL="0" distR="0" wp14:anchorId="001F889F" wp14:editId="54C8DB15">
             <wp:extent cx="5943600" cy="3714750"/>
             <wp:effectExtent l="0" t="0" r="0" b="0"/>
-            <wp:docPr id="223767782" name="Picture 223767782"/>
+            <wp:docPr id="1827435450" name="Picture 1827435450"/>
             <wp:cNvGraphicFramePr>
               <a:graphicFrameLocks xmlns:a="http://schemas.openxmlformats.org/drawingml/2006/main" noChangeAspect="1"/>
             </wp:cNvGraphicFramePr>
@@ -10885,10 +10956,10 @@
           <w:noProof/>
         </w:rPr>
         <w:drawing>
-          <wp:inline distT="0" distB="0" distL="0" distR="0" wp14:anchorId="457B486E" wp14:editId="25967ACE">
+          <wp:inline distT="0" distB="0" distL="0" distR="0" wp14:anchorId="38898B9F" wp14:editId="0FBE3692">
             <wp:extent cx="5943600" cy="3714750"/>
             <wp:effectExtent l="0" t="0" r="0" b="0"/>
-            <wp:docPr id="157551399" name="Picture 157551399"/>
+            <wp:docPr id="1460288746" name="Picture 1460288746"/>
             <wp:cNvGraphicFramePr>
               <a:graphicFrameLocks xmlns:a="http://schemas.openxmlformats.org/drawingml/2006/main" noChangeAspect="1"/>
             </wp:cNvGraphicFramePr>
@@ -11566,10 +11637,10 @@
           <w:noProof/>
         </w:rPr>
         <w:drawing>
-          <wp:inline distT="0" distB="0" distL="0" distR="0" wp14:anchorId="18F1F852" wp14:editId="15D02035">
+          <wp:inline distT="0" distB="0" distL="0" distR="0" wp14:anchorId="0F40306C" wp14:editId="2C8E473F">
             <wp:extent cx="5943600" cy="3714750"/>
             <wp:effectExtent l="0" t="0" r="0" b="0"/>
-            <wp:docPr id="1545327563" name="Picture 1545327563"/>
+            <wp:docPr id="531460612" name="Picture 531460612"/>
             <wp:cNvGraphicFramePr>
               <a:graphicFrameLocks xmlns:a="http://schemas.openxmlformats.org/drawingml/2006/main" noChangeAspect="1"/>
             </wp:cNvGraphicFramePr>
@@ -11623,6 +11694,114 @@
     </w:p>
     <w:p>
       <w:pPr>
+        <w:spacing w:after="120"/>
+      </w:pPr>
+      <w:r>
+        <w:t xml:space="preserve">The page is divided into seven groups, each with a tab at the top: </w:t>
+      </w:r>
+      <w:r>
+        <w:rPr>
+          <w:b/>
+          <w:bCs/>
+        </w:rPr>
+        <w:t>Library</w:t>
+      </w:r>
+      <w:r>
+        <w:t xml:space="preserve"> (roots, scanning, ffprobe, folder watch, adult content), </w:t>
+      </w:r>
+      <w:r>
+        <w:rPr>
+          <w:b/>
+          <w:bCs/>
+        </w:rPr>
+        <w:t>Episodes and quality</w:t>
+      </w:r>
+      <w:r>
+        <w:t xml:space="preserve"> (expected episodes, quality thresholds, posters), </w:t>
+      </w:r>
+      <w:r>
+        <w:rPr>
+          <w:b/>
+          <w:bCs/>
+        </w:rPr>
+        <w:t>Automation</w:t>
+      </w:r>
+      <w:r>
+        <w:t xml:space="preserve"> (schedules, notifications, updates), </w:t>
+      </w:r>
+      <w:r>
+        <w:rPr>
+          <w:b/>
+          <w:bCs/>
+        </w:rPr>
+        <w:t>Connections</w:t>
+      </w:r>
+      <w:r>
+        <w:t xml:space="preserve"> (Plex, CSV export), </w:t>
+      </w:r>
+      <w:r>
+        <w:rPr>
+          <w:b/>
+          <w:bCs/>
+        </w:rPr>
+        <w:t>Renaming</w:t>
+      </w:r>
+      <w:r>
+        <w:t xml:space="preserve">, </w:t>
+      </w:r>
+      <w:r>
+        <w:rPr>
+          <w:b/>
+          <w:bCs/>
+        </w:rPr>
+        <w:t>Backup and data</w:t>
+      </w:r>
+      <w:r>
+        <w:t xml:space="preserve">, and </w:t>
+      </w:r>
+      <w:r>
+        <w:rPr>
+          <w:b/>
+          <w:bCs/>
+        </w:rPr>
+        <w:t>Appearance</w:t>
+      </w:r>
+      <w:r>
+        <w:t xml:space="preserve">. </w:t>
+      </w:r>
+      <w:r>
+        <w:rPr>
+          <w:b/>
+          <w:bCs/>
+        </w:rPr>
+        <w:t>All</w:t>
+      </w:r>
+      <w:r>
+        <w:t xml:space="preserve"> shows everything under its group headings. </w:t>
+      </w:r>
+      <w:r>
+        <w:rPr>
+          <w:b/>
+          <w:bCs/>
+        </w:rPr>
+        <w:t>Find a setting</w:t>
+      </w:r>
+      <w:r>
+        <w:t xml:space="preserve"> filters the sections by any word in them, across all groups. One </w:t>
+      </w:r>
+      <w:r>
+        <w:rPr>
+          <w:b/>
+          <w:bCs/>
+        </w:rPr>
+        <w:t>Save settings</w:t>
+      </w:r>
+      <w:r>
+        <w:t xml:space="preserve"> button at the bottom saves the whole page whichever tab is showing.</w:t>
+      </w:r>
+    </w:p>
+    <w:p>
+      <w:pPr>
         <w:pStyle w:val="Heading2"/>
       </w:pPr>
       <w:r>
@@ -11732,6 +11911,7 @@
           <w:b/>
           <w:bCs/>
         </w:rPr>
+        <w:lastRenderedPageBreak/>
         <w:t>Re-probe unchanged files</w:t>
       </w:r>
       <w:r>
@@ -11791,7 +11971,6 @@
         <w:spacing w:after="120"/>
       </w:pPr>
       <w:r>
-        <w:lastRenderedPageBreak/>
         <w:t xml:space="preserve">Shows where ffprobe was found and its version. A path override and a </w:t>
       </w:r>
       <w:r>
@@ -12043,7 +12222,11 @@
         <w:t>Restore…</w:t>
       </w:r>
       <w:r>
-        <w:t xml:space="preserve"> lists the sets in the folder. Pick one and choose whether to bring back the settings and the web accounts as well as the library data. The backup is opened read-only and checked (integrity, schema no newer than this build) before anything happens; then MediaLedger restarts and swaps the files in before opening them. The files it replaces are not deleted: they are moved into a </w:t>
+        <w:t xml:space="preserve"> lists the sets in the folder. Pick one and choose whether to bring back the settings and the web accounts as well as the library data. The backup is opened read-only and checked (integrity, schema no newer than this build) before anything happens; then MediaLedger restarts and swaps the files in </w:t>
+      </w:r>
+      <w:r>
+        <w:lastRenderedPageBreak/>
+        <w:t xml:space="preserve">before opening them. The files it replaces are not deleted: they are moved into a </w:t>
       </w:r>
       <w:r>
         <w:rPr>
@@ -12071,7 +12254,6 @@
         <w:spacing w:after="120"/>
       </w:pPr>
       <w:r>
-        <w:lastRenderedPageBreak/>
         <w:t>Automatic updates on/off, and the GitHub token needed only while the repository is private.</w:t>
       </w:r>
     </w:p>
@@ -12816,10 +12998,10 @@
           <w:noProof/>
         </w:rPr>
         <w:drawing>
-          <wp:inline distT="0" distB="0" distL="0" distR="0" wp14:anchorId="6C70507E" wp14:editId="2BCCD74E">
+          <wp:inline distT="0" distB="0" distL="0" distR="0" wp14:anchorId="69501593" wp14:editId="40589280">
             <wp:extent cx="5943600" cy="3714750"/>
             <wp:effectExtent l="0" t="0" r="0" b="0"/>
-            <wp:docPr id="760216107" name="Picture 760216107"/>
+            <wp:docPr id="971664077" name="Picture 971664077"/>
             <wp:cNvGraphicFramePr>
               <a:graphicFrameLocks xmlns:a="http://schemas.openxmlformats.org/drawingml/2006/main" noChangeAspect="1"/>
             </wp:cNvGraphicFramePr>
@@ -13393,10 +13575,10 @@
           <w:noProof/>
         </w:rPr>
         <w:drawing>
-          <wp:inline distT="0" distB="0" distL="0" distR="0" wp14:anchorId="6C6C839B" wp14:editId="1A01BAF6">
+          <wp:inline distT="0" distB="0" distL="0" distR="0" wp14:anchorId="20F91A22" wp14:editId="0F6C57D5">
             <wp:extent cx="5943600" cy="3714750"/>
             <wp:effectExtent l="0" t="0" r="0" b="0"/>
-            <wp:docPr id="996838835" name="Picture 996838835"/>
+            <wp:docPr id="1239727918" name="Picture 1239727918"/>
             <wp:cNvGraphicFramePr>
               <a:graphicFrameLocks xmlns:a="http://schemas.openxmlformats.org/drawingml/2006/main" noChangeAspect="1"/>
             </wp:cNvGraphicFramePr>
@@ -13559,10 +13741,10 @@
           <w:noProof/>
         </w:rPr>
         <w:drawing>
-          <wp:inline distT="0" distB="0" distL="0" distR="0" wp14:anchorId="4F6E2757" wp14:editId="4FE80261">
+          <wp:inline distT="0" distB="0" distL="0" distR="0" wp14:anchorId="4A7232D0" wp14:editId="1A142464">
             <wp:extent cx="5943600" cy="3714750"/>
             <wp:effectExtent l="0" t="0" r="0" b="0"/>
-            <wp:docPr id="824286883" name="Picture 824286883"/>
+            <wp:docPr id="618946092" name="Picture 618946092"/>
             <wp:cNvGraphicFramePr>
               <a:graphicFrameLocks xmlns:a="http://schemas.openxmlformats.org/drawingml/2006/main" noChangeAspect="1"/>
             </wp:cNvGraphicFramePr>
@@ -14776,10 +14958,10 @@
           <w:noProof/>
         </w:rPr>
         <w:drawing>
-          <wp:inline distT="0" distB="0" distL="0" distR="0" wp14:anchorId="12B031E9" wp14:editId="0C7775FD">
+          <wp:inline distT="0" distB="0" distL="0" distR="0" wp14:anchorId="11C4C71B" wp14:editId="451701D1">
             <wp:extent cx="5943600" cy="3714750"/>
             <wp:effectExtent l="0" t="0" r="0" b="0"/>
-            <wp:docPr id="1535842702" name="Picture 1535842702"/>
+            <wp:docPr id="982676508" name="Picture 982676508"/>
             <wp:cNvGraphicFramePr>
               <a:graphicFrameLocks xmlns:a="http://schemas.openxmlformats.org/drawingml/2006/main" noChangeAspect="1"/>
             </wp:cNvGraphicFramePr>
@@ -15014,6 +15196,14 @@
       </w:pPr>
       <w:r>
         <w:lastRenderedPageBreak/>
+        <w:t>When a reverse proxy on the same machine (Caddy, see 22.9) serves HTTPS in front of MediaLedger, the server notices the first time you open the site through it: the HTTPS line in the checklist turns green, the heading reads *on, by the reverse proxy*, and the button for the built-in certificate is not offered, because turning it on would break the proxy. Only a proxy on the machine itself is believed; another computer on the network cannot claim it.</w:t>
+      </w:r>
+    </w:p>
+    <w:p>
+      <w:pPr>
+        <w:spacing w:after="120"/>
+      </w:pPr>
+      <w:r>
         <w:t xml:space="preserve">On a home LAN plain HTTP is normal, and MediaLedger refuses connections from outside the LAN anyway. HTTPS adds encryption between each browser and the Pi, which matters if you do not fully trust every device on the Wi-Fi, and it lets phones add the site as a proper app without warnings. There is no certificate authority for a private LAN name, so MediaLedger makes its own </w:t>
       </w:r>
       <w:r>
@@ -15218,10 +15408,10 @@
           <w:noProof/>
         </w:rPr>
         <w:drawing>
-          <wp:inline distT="0" distB="0" distL="0" distR="0" wp14:anchorId="5DF6232E" wp14:editId="46B0855C">
+          <wp:inline distT="0" distB="0" distL="0" distR="0" wp14:anchorId="1EAD92CF" wp14:editId="03E5C78D">
             <wp:extent cx="5943600" cy="3714750"/>
             <wp:effectExtent l="0" t="0" r="0" b="0"/>
-            <wp:docPr id="417069205" name="Picture 417069205"/>
+            <wp:docPr id="266938631" name="Picture 266938631"/>
             <wp:cNvGraphicFramePr>
               <a:graphicFrameLocks xmlns:a="http://schemas.openxmlformats.org/drawingml/2006/main" noChangeAspect="1"/>
             </wp:cNvGraphicFramePr>
@@ -21216,7 +21406,7 @@
         <w:sz w:val="16"/>
         <w:szCs w:val="16"/>
       </w:rPr>
-      <w:t>MediaLedger 2.2.0 · User Manual</w:t>
+      <w:t>MediaLedger 2.3.0 · User Manual</w:t>
     </w:r>
   </w:p>
 </w:hdr>
@@ -21235,118 +21425,118 @@
 <file path=word/numbering.xml><?xml version="1.0" encoding="utf-8"?>
 <w:numbering xmlns:wpc="http://schemas.microsoft.com/office/word/2010/wordprocessingCanvas" xmlns:cx="http://schemas.microsoft.com/office/drawing/2014/chartex" xmlns:cx1="http://schemas.microsoft.com/office/drawing/2015/9/8/chartex" xmlns:cx2="http://schemas.microsoft.com/office/drawing/2015/10/21/chartex" xmlns:cx3="http://schemas.microsoft.com/office/drawing/2016/5/9/chartex" xmlns:cx4="http://schemas.microsoft.com/office/drawing/2016/5/10/chartex" xmlns:cx5="http://schemas.microsoft.com/office/drawing/2016/5/11/chartex" xmlns:cx6="http://schemas.microsoft.com/office/drawing/2016/5/12/chartex" xmlns:cx7="http://schemas.microsoft.com/office/drawing/2016/5/13/chartex" xmlns:cx8="http://schemas.microsoft.com/office/drawing/2016/5/14/chartex" xmlns:mc="http://schemas.openxmlformats.org/markup-compatibility/2006" xmlns:aink="http://schemas.microsoft.com/office/drawing/2016/ink" xmlns:am3d="http://schemas.microsoft.com/office/drawing/2017/model3d" xmlns:o="urn:schemas-microsoft-com:office:office" xmlns:oel="http://schemas.microsoft.com/office/2019/extlst" xmlns:r="http://schemas.openxmlformats.org/officeDocument/2006/relationships" xmlns:m="http://schemas.openxmlformats.org/officeDocument/2006/math" xmlns:v="urn:schemas-microsoft-com:vml" xmlns:wp14="http://schemas.microsoft.com/office/word/2010/wordprocessingDrawing" xmlns:wp="http://schemas.openxmlformats.org/drawingml/2006/wordprocessingDrawing" xmlns:w10="urn:schemas-microsoft-com:office:word" xmlns:w="http://schemas.openxmlformats.org/wordprocessingml/2006/main" xmlns:w14="http://schemas.microsoft.com/office/word/2010/wordml" xmlns:w15="http://schemas.microsoft.com/office/word/2012/wordml" xmlns:w16cex="http://schemas.microsoft.com/office/word/2018/wordml/cex" xmlns:w16cid="http://schemas.microsoft.com/office/word/2016/wordml/cid" xmlns:w16="http://schemas.microsoft.com/office/word/2018/wordml" xmlns:w16du="http://schemas.microsoft.com/office/word/2023/wordml/word16du" xmlns:w16sdtdh="http://schemas.microsoft.com/office/word/2020/wordml/sdtdatahash" xmlns:w16sdtfl="http://schemas.microsoft.com/office/word/2024/wordml/sdtformatlock" xmlns:w16se="http://schemas.microsoft.com/office/word/2015/wordml/symex" xmlns:wpg="http://schemas.microsoft.com/office/word/2010/wordprocessingGroup" xmlns:wpi="http://schemas.microsoft.com/office/word/2010/wordprocessingInk" xmlns:wne="http://schemas.microsoft.com/office/word/2006/wordml" xmlns:wps="http://schemas.microsoft.com/office/word/2010/wordprocessingShape" mc:Ignorable="w14 w15 w16se w16cid w16 w16cex w16sdtdh w16sdtfl w16du wp14">
   <w:abstractNum w:abstractNumId="0" w15:restartNumberingAfterBreak="0">
-    <w:nsid w:val="40123DAC"/>
+    <w:nsid w:val="0DD144C7"/>
     <w:multiLevelType w:val="hybridMultilevel"/>
-    <w:tmpl w:val="6A3E493E"/>
-    <w:lvl w:ilvl="0" w:tplc="20585206">
+    <w:tmpl w:val="939C6C94"/>
+    <w:lvl w:ilvl="0" w:tplc="C70C8BF8">
       <w:start w:val="1"/>
-      <w:numFmt w:val="decimal"/>
-      <w:lvlText w:val="%1."/>
+      <w:numFmt w:val="bullet"/>
+      <w:lvlText w:val="•"/>
       <w:lvlJc w:val="left"/>
       <w:pPr>
-        <w:ind w:left="540" w:hanging="360"/>
+        <w:ind w:left="540" w:hanging="270"/>
       </w:pPr>
     </w:lvl>
-    <w:lvl w:ilvl="1" w:tplc="296C9534">
+    <w:lvl w:ilvl="1" w:tplc="460002F8">
       <w:numFmt w:val="decimal"/>
       <w:lvlText w:val=""/>
       <w:lvlJc w:val="left"/>
     </w:lvl>
-    <w:lvl w:ilvl="2" w:tplc="898C34E2">
+    <w:lvl w:ilvl="2" w:tplc="5BE4A960">
       <w:numFmt w:val="decimal"/>
       <w:lvlText w:val=""/>
       <w:lvlJc w:val="left"/>
     </w:lvl>
-    <w:lvl w:ilvl="3" w:tplc="1EE6E634">
+    <w:lvl w:ilvl="3" w:tplc="4502DC08">
       <w:numFmt w:val="decimal"/>
       <w:lvlText w:val=""/>
       <w:lvlJc w:val="left"/>
     </w:lvl>
-    <w:lvl w:ilvl="4" w:tplc="DDB4D684">
+    <w:lvl w:ilvl="4" w:tplc="DF3A4884">
       <w:numFmt w:val="decimal"/>
       <w:lvlText w:val=""/>
       <w:lvlJc w:val="left"/>
     </w:lvl>
-    <w:lvl w:ilvl="5" w:tplc="06763FE6">
+    <w:lvl w:ilvl="5" w:tplc="5A587D22">
       <w:numFmt w:val="decimal"/>
       <w:lvlText w:val=""/>
       <w:lvlJc w:val="left"/>
     </w:lvl>
-    <w:lvl w:ilvl="6" w:tplc="C81EB674">
+    <w:lvl w:ilvl="6" w:tplc="F1328B2C">
       <w:numFmt w:val="decimal"/>
       <w:lvlText w:val=""/>
       <w:lvlJc w:val="left"/>
     </w:lvl>
-    <w:lvl w:ilvl="7" w:tplc="275EB45C">
+    <w:lvl w:ilvl="7" w:tplc="B61849A4">
       <w:numFmt w:val="decimal"/>
       <w:lvlText w:val=""/>
       <w:lvlJc w:val="left"/>
     </w:lvl>
-    <w:lvl w:ilvl="8" w:tplc="C93CBC6A">
+    <w:lvl w:ilvl="8" w:tplc="6F0805A2">
       <w:numFmt w:val="decimal"/>
       <w:lvlText w:val=""/>
       <w:lvlJc w:val="left"/>
     </w:lvl>
   </w:abstractNum>
   <w:abstractNum w:abstractNumId="1" w15:restartNumberingAfterBreak="0">
-    <w:nsid w:val="46962189"/>
+    <w:nsid w:val="21917ECA"/>
     <w:multiLevelType w:val="hybridMultilevel"/>
-    <w:tmpl w:val="540EF696"/>
-    <w:lvl w:ilvl="0" w:tplc="A18E4CEE">
+    <w:tmpl w:val="B61CD460"/>
+    <w:lvl w:ilvl="0" w:tplc="179C1E30">
       <w:start w:val="1"/>
-      <w:numFmt w:val="bullet"/>
-      <w:lvlText w:val="•"/>
+      <w:numFmt w:val="decimal"/>
+      <w:lvlText w:val="%1."/>
       <w:lvlJc w:val="left"/>
       <w:pPr>
-        <w:ind w:left="540" w:hanging="270"/>
+        <w:ind w:left="540" w:hanging="360"/>
       </w:pPr>
     </w:lvl>
-    <w:lvl w:ilvl="1" w:tplc="C4A8057A">
+    <w:lvl w:ilvl="1" w:tplc="8A28B3E6">
       <w:numFmt w:val="decimal"/>
       <w:lvlText w:val=""/>
       <w:lvlJc w:val="left"/>
     </w:lvl>
-    <w:lvl w:ilvl="2" w:tplc="64325032">
+    <w:lvl w:ilvl="2" w:tplc="1F74F096">
       <w:numFmt w:val="decimal"/>
       <w:lvlText w:val=""/>
       <w:lvlJc w:val="left"/>
     </w:lvl>
-    <w:lvl w:ilvl="3" w:tplc="0D0254F2">
+    <w:lvl w:ilvl="3" w:tplc="4C20C5F8">
       <w:numFmt w:val="decimal"/>
       <w:lvlText w:val=""/>
       <w:lvlJc w:val="left"/>
     </w:lvl>
-    <w:lvl w:ilvl="4" w:tplc="4EFA56AA">
+    <w:lvl w:ilvl="4" w:tplc="62F6F67A">
       <w:numFmt w:val="decimal"/>
       <w:lvlText w:val=""/>
       <w:lvlJc w:val="left"/>
     </w:lvl>
-    <w:lvl w:ilvl="5" w:tplc="2698F308">
+    <w:lvl w:ilvl="5" w:tplc="34C6E87A">
       <w:numFmt w:val="decimal"/>
       <w:lvlText w:val=""/>
       <w:lvlJc w:val="left"/>
     </w:lvl>
-    <w:lvl w:ilvl="6" w:tplc="39700CF0">
+    <w:lvl w:ilvl="6" w:tplc="3446A90A">
       <w:numFmt w:val="decimal"/>
       <w:lvlText w:val=""/>
       <w:lvlJc w:val="left"/>
     </w:lvl>
-    <w:lvl w:ilvl="7" w:tplc="B928EC4E">
+    <w:lvl w:ilvl="7" w:tplc="9758A8F4">
       <w:numFmt w:val="decimal"/>
       <w:lvlText w:val=""/>
       <w:lvlJc w:val="left"/>
     </w:lvl>
-    <w:lvl w:ilvl="8" w:tplc="1F186336">
+    <w:lvl w:ilvl="8" w:tplc="0A3E6CA0">
       <w:numFmt w:val="decimal"/>
       <w:lvlText w:val=""/>
       <w:lvlJc w:val="left"/>
     </w:lvl>
   </w:abstractNum>
   <w:abstractNum w:abstractNumId="2" w15:restartNumberingAfterBreak="0">
-    <w:nsid w:val="62AF2893"/>
+    <w:nsid w:val="33CD7A6A"/>
     <w:multiLevelType w:val="hybridMultilevel"/>
-    <w:tmpl w:val="EB802FB8"/>
-    <w:lvl w:ilvl="0" w:tplc="ECECBDB0">
+    <w:tmpl w:val="94CCE794"/>
+    <w:lvl w:ilvl="0" w:tplc="D9400AA8">
       <w:start w:val="1"/>
       <w:numFmt w:val="bullet"/>
       <w:lvlText w:val="●"/>
@@ -21355,7 +21545,7 @@
         <w:ind w:left="720" w:hanging="360"/>
       </w:pPr>
     </w:lvl>
-    <w:lvl w:ilvl="1" w:tplc="A30EFA9E">
+    <w:lvl w:ilvl="1" w:tplc="15605F20">
       <w:start w:val="1"/>
       <w:numFmt w:val="bullet"/>
       <w:lvlText w:val="○"/>
@@ -21364,7 +21554,7 @@
         <w:ind w:left="1440" w:hanging="360"/>
       </w:pPr>
     </w:lvl>
-    <w:lvl w:ilvl="2" w:tplc="195A133E">
+    <w:lvl w:ilvl="2" w:tplc="CC4AB740">
       <w:start w:val="1"/>
       <w:numFmt w:val="bullet"/>
       <w:lvlText w:val="■"/>
@@ -21373,7 +21563,7 @@
         <w:ind w:left="2160" w:hanging="360"/>
       </w:pPr>
     </w:lvl>
-    <w:lvl w:ilvl="3" w:tplc="787CB372">
+    <w:lvl w:ilvl="3" w:tplc="93EC35A8">
       <w:start w:val="1"/>
       <w:numFmt w:val="bullet"/>
       <w:lvlText w:val="●"/>
@@ -21382,7 +21572,7 @@
         <w:ind w:left="2880" w:hanging="360"/>
       </w:pPr>
     </w:lvl>
-    <w:lvl w:ilvl="4" w:tplc="C4543BE4">
+    <w:lvl w:ilvl="4" w:tplc="DCAAE488">
       <w:start w:val="1"/>
       <w:numFmt w:val="bullet"/>
       <w:lvlText w:val="○"/>
@@ -21391,7 +21581,7 @@
         <w:ind w:left="3600" w:hanging="360"/>
       </w:pPr>
     </w:lvl>
-    <w:lvl w:ilvl="5" w:tplc="24AC5042">
+    <w:lvl w:ilvl="5" w:tplc="D8E43E18">
       <w:start w:val="1"/>
       <w:numFmt w:val="bullet"/>
       <w:lvlText w:val="■"/>
@@ -21400,7 +21590,7 @@
         <w:ind w:left="4320" w:hanging="360"/>
       </w:pPr>
     </w:lvl>
-    <w:lvl w:ilvl="6" w:tplc="84EE0AD2">
+    <w:lvl w:ilvl="6" w:tplc="AF1A2E92">
       <w:start w:val="1"/>
       <w:numFmt w:val="bullet"/>
       <w:lvlText w:val="●"/>
@@ -21409,7 +21599,7 @@
         <w:ind w:left="5040" w:hanging="360"/>
       </w:pPr>
     </w:lvl>
-    <w:lvl w:ilvl="7" w:tplc="7070DD28">
+    <w:lvl w:ilvl="7" w:tplc="FD8A548A">
       <w:start w:val="1"/>
       <w:numFmt w:val="bullet"/>
       <w:lvlText w:val="●"/>
@@ -21418,7 +21608,7 @@
         <w:ind w:left="5760" w:hanging="360"/>
       </w:pPr>
     </w:lvl>
-    <w:lvl w:ilvl="8" w:tplc="C3960E62">
+    <w:lvl w:ilvl="8" w:tplc="CA469D46">
       <w:start w:val="1"/>
       <w:numFmt w:val="bullet"/>
       <w:lvlText w:val="●"/>
@@ -21428,68 +21618,68 @@
       </w:pPr>
     </w:lvl>
   </w:abstractNum>
-  <w:num w:numId="1" w16cid:durableId="700519053">
+  <w:num w:numId="1" w16cid:durableId="442652116">
     <w:abstractNumId w:val="2"/>
     <w:lvlOverride w:ilvl="0">
       <w:startOverride w:val="1"/>
     </w:lvlOverride>
   </w:num>
-  <w:num w:numId="2" w16cid:durableId="1741562815">
+  <w:num w:numId="2" w16cid:durableId="628320922">
+    <w:abstractNumId w:val="0"/>
+    <w:lvlOverride w:ilvl="0">
+      <w:startOverride w:val="1"/>
+    </w:lvlOverride>
+  </w:num>
+  <w:num w:numId="3" w16cid:durableId="1781492010">
     <w:abstractNumId w:val="1"/>
     <w:lvlOverride w:ilvl="0">
       <w:startOverride w:val="1"/>
     </w:lvlOverride>
   </w:num>
-  <w:num w:numId="3" w16cid:durableId="243877641">
-    <w:abstractNumId w:val="0"/>
+  <w:num w:numId="4" w16cid:durableId="1077440478">
+    <w:abstractNumId w:val="1"/>
     <w:lvlOverride w:ilvl="0">
       <w:startOverride w:val="1"/>
     </w:lvlOverride>
   </w:num>
-  <w:num w:numId="4" w16cid:durableId="710038466">
-    <w:abstractNumId w:val="0"/>
+  <w:num w:numId="5" w16cid:durableId="1433015055">
+    <w:abstractNumId w:val="1"/>
     <w:lvlOverride w:ilvl="0">
       <w:startOverride w:val="1"/>
     </w:lvlOverride>
   </w:num>
-  <w:num w:numId="5" w16cid:durableId="570382592">
-    <w:abstractNumId w:val="0"/>
+  <w:num w:numId="6" w16cid:durableId="647365395">
+    <w:abstractNumId w:val="1"/>
     <w:lvlOverride w:ilvl="0">
       <w:startOverride w:val="1"/>
     </w:lvlOverride>
   </w:num>
-  <w:num w:numId="6" w16cid:durableId="83188132">
-    <w:abstractNumId w:val="0"/>
+  <w:num w:numId="7" w16cid:durableId="864637263">
+    <w:abstractNumId w:val="1"/>
     <w:lvlOverride w:ilvl="0">
       <w:startOverride w:val="1"/>
     </w:lvlOverride>
   </w:num>
-  <w:num w:numId="7" w16cid:durableId="1147550725">
-    <w:abstractNumId w:val="0"/>
+  <w:num w:numId="8" w16cid:durableId="332269612">
+    <w:abstractNumId w:val="1"/>
     <w:lvlOverride w:ilvl="0">
       <w:startOverride w:val="1"/>
     </w:lvlOverride>
   </w:num>
-  <w:num w:numId="8" w16cid:durableId="498927853">
-    <w:abstractNumId w:val="0"/>
+  <w:num w:numId="9" w16cid:durableId="1568220546">
+    <w:abstractNumId w:val="1"/>
     <w:lvlOverride w:ilvl="0">
       <w:startOverride w:val="1"/>
     </w:lvlOverride>
   </w:num>
-  <w:num w:numId="9" w16cid:durableId="922879229">
-    <w:abstractNumId w:val="0"/>
+  <w:num w:numId="10" w16cid:durableId="404491839">
+    <w:abstractNumId w:val="1"/>
     <w:lvlOverride w:ilvl="0">
       <w:startOverride w:val="1"/>
     </w:lvlOverride>
   </w:num>
-  <w:num w:numId="10" w16cid:durableId="611520344">
-    <w:abstractNumId w:val="0"/>
-    <w:lvlOverride w:ilvl="0">
-      <w:startOverride w:val="1"/>
-    </w:lvlOverride>
-  </w:num>
-  <w:num w:numId="11" w16cid:durableId="1132863263">
-    <w:abstractNumId w:val="0"/>
+  <w:num w:numId="11" w16cid:durableId="1659380051">
+    <w:abstractNumId w:val="1"/>
     <w:lvlOverride w:ilvl="0">
       <w:startOverride w:val="1"/>
     </w:lvlOverride>
@@ -22108,7 +22298,7 @@
     <w:link w:val="HeaderChar"/>
     <w:uiPriority w:val="99"/>
     <w:unhideWhenUsed/>
-    <w:rsid w:val="002F0332"/>
+    <w:rsid w:val="00AF2175"/>
     <w:pPr>
       <w:tabs>
         <w:tab w:val="center" w:pos="4680"/>
@@ -22121,7 +22311,7 @@
     <w:basedOn w:val="DefaultParagraphFont"/>
     <w:link w:val="Header"/>
     <w:uiPriority w:val="99"/>
-    <w:rsid w:val="002F0332"/>
+    <w:rsid w:val="00AF2175"/>
   </w:style>
   <w:style w:type="paragraph" w:styleId="Footer">
     <w:name w:val="footer"/>
@@ -22129,7 +22319,7 @@
     <w:link w:val="FooterChar"/>
     <w:uiPriority w:val="99"/>
     <w:unhideWhenUsed/>
-    <w:rsid w:val="002F0332"/>
+    <w:rsid w:val="00AF2175"/>
     <w:pPr>
       <w:tabs>
         <w:tab w:val="center" w:pos="4680"/>
@@ -22142,7 +22332,7 @@
     <w:basedOn w:val="DefaultParagraphFont"/>
     <w:link w:val="Footer"/>
     <w:uiPriority w:val="99"/>
-    <w:rsid w:val="002F0332"/>
+    <w:rsid w:val="00AF2175"/>
   </w:style>
 </w:styles>
 </file>

</xml_diff>

<commit_message>
Release 2.4.0: connect network shares from the web app, a welcome guide, and a guided installer with a sign-in banner on the Pi
</commit_message>
<xml_diff>
--- a/docs/MediaLedger-Manual.docx
+++ b/docs/MediaLedger-Manual.docx
@@ -42,7 +42,7 @@
           <w:sz w:val="24"/>
           <w:szCs w:val="24"/>
         </w:rPr>
-        <w:t>Version 2.3.0</w:t>
+        <w:t>Version 2.4.0</w:t>
       </w:r>
     </w:p>
     <w:p>
@@ -2477,7 +2477,7 @@
           <w:noProof/>
         </w:rPr>
         <w:drawing>
-          <wp:inline distT="0" distB="0" distL="0" distR="0" wp14:anchorId="0643C1D9" wp14:editId="707053A8">
+          <wp:inline distT="0" distB="0" distL="0" distR="0" wp14:anchorId="0ABB631D" wp14:editId="51D5FC31">
             <wp:extent cx="5943600" cy="3714750"/>
             <wp:effectExtent l="0" t="0" r="0" b="0"/>
             <wp:docPr id="1" name="Picture 1"/>
@@ -3699,10 +3699,10 @@
           <w:noProof/>
         </w:rPr>
         <w:drawing>
-          <wp:inline distT="0" distB="0" distL="0" distR="0" wp14:anchorId="20464C38" wp14:editId="43E6C14F">
+          <wp:inline distT="0" distB="0" distL="0" distR="0" wp14:anchorId="1938C788" wp14:editId="324B7D2E">
             <wp:extent cx="5943600" cy="3714750"/>
             <wp:effectExtent l="0" t="0" r="0" b="0"/>
-            <wp:docPr id="1953411480" name="Picture 1953411480"/>
+            <wp:docPr id="1115225829" name="Picture 1115225829"/>
             <wp:cNvGraphicFramePr>
               <a:graphicFrameLocks xmlns:a="http://schemas.openxmlformats.org/drawingml/2006/main" noChangeAspect="1"/>
             </wp:cNvGraphicFramePr>
@@ -4385,10 +4385,10 @@
           <w:noProof/>
         </w:rPr>
         <w:drawing>
-          <wp:inline distT="0" distB="0" distL="0" distR="0" wp14:anchorId="0692B9B0" wp14:editId="45EA3B13">
+          <wp:inline distT="0" distB="0" distL="0" distR="0" wp14:anchorId="150E2036" wp14:editId="59F66A91">
             <wp:extent cx="5943600" cy="3714750"/>
             <wp:effectExtent l="0" t="0" r="0" b="0"/>
-            <wp:docPr id="450319259" name="Picture 450319259"/>
+            <wp:docPr id="936712649" name="Picture 936712649"/>
             <wp:cNvGraphicFramePr>
               <a:graphicFrameLocks xmlns:a="http://schemas.openxmlformats.org/drawingml/2006/main" noChangeAspect="1"/>
             </wp:cNvGraphicFramePr>
@@ -5074,10 +5074,10 @@
           <w:noProof/>
         </w:rPr>
         <w:drawing>
-          <wp:inline distT="0" distB="0" distL="0" distR="0" wp14:anchorId="45E93333" wp14:editId="1E5E0991">
+          <wp:inline distT="0" distB="0" distL="0" distR="0" wp14:anchorId="5D632A4B" wp14:editId="405A757C">
             <wp:extent cx="5943600" cy="3714750"/>
             <wp:effectExtent l="0" t="0" r="0" b="0"/>
-            <wp:docPr id="400470957" name="Picture 400470957"/>
+            <wp:docPr id="737283444" name="Picture 737283444"/>
             <wp:cNvGraphicFramePr>
               <a:graphicFrameLocks xmlns:a="http://schemas.openxmlformats.org/drawingml/2006/main" noChangeAspect="1"/>
             </wp:cNvGraphicFramePr>
@@ -5397,10 +5397,10 @@
           <w:noProof/>
         </w:rPr>
         <w:drawing>
-          <wp:inline distT="0" distB="0" distL="0" distR="0" wp14:anchorId="18A1B195" wp14:editId="0E26538F">
+          <wp:inline distT="0" distB="0" distL="0" distR="0" wp14:anchorId="6959E1A6" wp14:editId="383281B6">
             <wp:extent cx="5943600" cy="3714750"/>
             <wp:effectExtent l="0" t="0" r="0" b="0"/>
-            <wp:docPr id="1037672505" name="Picture 1037672505"/>
+            <wp:docPr id="1567946198" name="Picture 1567946198"/>
             <wp:cNvGraphicFramePr>
               <a:graphicFrameLocks xmlns:a="http://schemas.openxmlformats.org/drawingml/2006/main" noChangeAspect="1"/>
             </wp:cNvGraphicFramePr>
@@ -5505,10 +5505,10 @@
         </w:rPr>
         <w:lastRenderedPageBreak/>
         <w:drawing>
-          <wp:inline distT="0" distB="0" distL="0" distR="0" wp14:anchorId="6F6051CA" wp14:editId="5D2E9F1A">
+          <wp:inline distT="0" distB="0" distL="0" distR="0" wp14:anchorId="04A6E5E2" wp14:editId="11CDBC83">
             <wp:extent cx="5943600" cy="3714750"/>
             <wp:effectExtent l="0" t="0" r="0" b="0"/>
-            <wp:docPr id="342543582" name="Picture 342543582"/>
+            <wp:docPr id="1385214821" name="Picture 1385214821"/>
             <wp:cNvGraphicFramePr>
               <a:graphicFrameLocks xmlns:a="http://schemas.openxmlformats.org/drawingml/2006/main" noChangeAspect="1"/>
             </wp:cNvGraphicFramePr>
@@ -5598,10 +5598,10 @@
           <w:noProof/>
         </w:rPr>
         <w:drawing>
-          <wp:inline distT="0" distB="0" distL="0" distR="0" wp14:anchorId="609A97DD" wp14:editId="25C0D6F3">
+          <wp:inline distT="0" distB="0" distL="0" distR="0" wp14:anchorId="1CC5A3EA" wp14:editId="652E15EE">
             <wp:extent cx="5943600" cy="3714750"/>
             <wp:effectExtent l="0" t="0" r="0" b="0"/>
-            <wp:docPr id="2072805686" name="Picture 2072805686"/>
+            <wp:docPr id="1305579004" name="Picture 1305579004"/>
             <wp:cNvGraphicFramePr>
               <a:graphicFrameLocks xmlns:a="http://schemas.openxmlformats.org/drawingml/2006/main" noChangeAspect="1"/>
             </wp:cNvGraphicFramePr>
@@ -5864,10 +5864,10 @@
           <w:noProof/>
         </w:rPr>
         <w:drawing>
-          <wp:inline distT="0" distB="0" distL="0" distR="0" wp14:anchorId="7202DDB3" wp14:editId="7300096B">
+          <wp:inline distT="0" distB="0" distL="0" distR="0" wp14:anchorId="340C4811" wp14:editId="563590A3">
             <wp:extent cx="5943600" cy="3714750"/>
             <wp:effectExtent l="0" t="0" r="0" b="0"/>
-            <wp:docPr id="503366745" name="Picture 503366745"/>
+            <wp:docPr id="1873417283" name="Picture 1873417283"/>
             <wp:cNvGraphicFramePr>
               <a:graphicFrameLocks xmlns:a="http://schemas.openxmlformats.org/drawingml/2006/main" noChangeAspect="1"/>
             </wp:cNvGraphicFramePr>
@@ -6446,10 +6446,10 @@
           <w:noProof/>
         </w:rPr>
         <w:drawing>
-          <wp:inline distT="0" distB="0" distL="0" distR="0" wp14:anchorId="63765590" wp14:editId="4DBD73B7">
+          <wp:inline distT="0" distB="0" distL="0" distR="0" wp14:anchorId="5FFA9C99" wp14:editId="2C567C30">
             <wp:extent cx="5943600" cy="3714750"/>
             <wp:effectExtent l="0" t="0" r="0" b="0"/>
-            <wp:docPr id="1874023799" name="Picture 1874023799"/>
+            <wp:docPr id="547834929" name="Picture 547834929"/>
             <wp:cNvGraphicFramePr>
               <a:graphicFrameLocks xmlns:a="http://schemas.openxmlformats.org/drawingml/2006/main" noChangeAspect="1"/>
             </wp:cNvGraphicFramePr>
@@ -6633,10 +6633,10 @@
         </w:rPr>
         <w:lastRenderedPageBreak/>
         <w:drawing>
-          <wp:inline distT="0" distB="0" distL="0" distR="0" wp14:anchorId="780D1DBA" wp14:editId="2A3A5824">
+          <wp:inline distT="0" distB="0" distL="0" distR="0" wp14:anchorId="0CE718C7" wp14:editId="18AE4DE2">
             <wp:extent cx="5943600" cy="3714750"/>
             <wp:effectExtent l="0" t="0" r="0" b="0"/>
-            <wp:docPr id="260938372" name="Picture 260938372"/>
+            <wp:docPr id="1220475487" name="Picture 1220475487"/>
             <wp:cNvGraphicFramePr>
               <a:graphicFrameLocks xmlns:a="http://schemas.openxmlformats.org/drawingml/2006/main" noChangeAspect="1"/>
             </wp:cNvGraphicFramePr>
@@ -6809,10 +6809,10 @@
         </w:rPr>
         <w:lastRenderedPageBreak/>
         <w:drawing>
-          <wp:inline distT="0" distB="0" distL="0" distR="0" wp14:anchorId="1B542264" wp14:editId="05B80A7B">
+          <wp:inline distT="0" distB="0" distL="0" distR="0" wp14:anchorId="71EE846E" wp14:editId="665B6C0A">
             <wp:extent cx="5943600" cy="3714750"/>
             <wp:effectExtent l="0" t="0" r="0" b="0"/>
-            <wp:docPr id="1359909426" name="Picture 1359909426"/>
+            <wp:docPr id="157625023" name="Picture 157625023"/>
             <wp:cNvGraphicFramePr>
               <a:graphicFrameLocks xmlns:a="http://schemas.openxmlformats.org/drawingml/2006/main" noChangeAspect="1"/>
             </wp:cNvGraphicFramePr>
@@ -7001,10 +7001,10 @@
           <w:noProof/>
         </w:rPr>
         <w:drawing>
-          <wp:inline distT="0" distB="0" distL="0" distR="0" wp14:anchorId="0076D459" wp14:editId="69BD0EA1">
+          <wp:inline distT="0" distB="0" distL="0" distR="0" wp14:anchorId="5C4CB40B" wp14:editId="05A3DFDE">
             <wp:extent cx="5943600" cy="3714750"/>
             <wp:effectExtent l="0" t="0" r="0" b="0"/>
-            <wp:docPr id="1512713189" name="Picture 1512713189"/>
+            <wp:docPr id="1502402205" name="Picture 1502402205"/>
             <wp:cNvGraphicFramePr>
               <a:graphicFrameLocks xmlns:a="http://schemas.openxmlformats.org/drawingml/2006/main" noChangeAspect="1"/>
             </wp:cNvGraphicFramePr>
@@ -7184,10 +7184,10 @@
           <w:noProof/>
         </w:rPr>
         <w:drawing>
-          <wp:inline distT="0" distB="0" distL="0" distR="0" wp14:anchorId="14E72E74" wp14:editId="03EDCFAB">
+          <wp:inline distT="0" distB="0" distL="0" distR="0" wp14:anchorId="7AD00144" wp14:editId="18CD81B2">
             <wp:extent cx="5943600" cy="3714750"/>
             <wp:effectExtent l="0" t="0" r="0" b="0"/>
-            <wp:docPr id="42776953" name="Picture 42776953"/>
+            <wp:docPr id="1493121816" name="Picture 1493121816"/>
             <wp:cNvGraphicFramePr>
               <a:graphicFrameLocks xmlns:a="http://schemas.openxmlformats.org/drawingml/2006/main" noChangeAspect="1"/>
             </wp:cNvGraphicFramePr>
@@ -7686,10 +7686,10 @@
         </w:rPr>
         <w:lastRenderedPageBreak/>
         <w:drawing>
-          <wp:inline distT="0" distB="0" distL="0" distR="0" wp14:anchorId="55447716" wp14:editId="3E996806">
+          <wp:inline distT="0" distB="0" distL="0" distR="0" wp14:anchorId="1EF54409" wp14:editId="423FD3DA">
             <wp:extent cx="5943600" cy="3714750"/>
             <wp:effectExtent l="0" t="0" r="0" b="0"/>
-            <wp:docPr id="91311096" name="Picture 91311096"/>
+            <wp:docPr id="1169612827" name="Picture 1169612827"/>
             <wp:cNvGraphicFramePr>
               <a:graphicFrameLocks xmlns:a="http://schemas.openxmlformats.org/drawingml/2006/main" noChangeAspect="1"/>
             </wp:cNvGraphicFramePr>
@@ -7895,10 +7895,10 @@
         </w:rPr>
         <w:lastRenderedPageBreak/>
         <w:drawing>
-          <wp:inline distT="0" distB="0" distL="0" distR="0" wp14:anchorId="1E3890A3" wp14:editId="7B118A9D">
+          <wp:inline distT="0" distB="0" distL="0" distR="0" wp14:anchorId="25AF3015" wp14:editId="4CD45FF5">
             <wp:extent cx="5943600" cy="3714750"/>
             <wp:effectExtent l="0" t="0" r="0" b="0"/>
-            <wp:docPr id="1486286848" name="Picture 1486286848"/>
+            <wp:docPr id="695756764" name="Picture 695756764"/>
             <wp:cNvGraphicFramePr>
               <a:graphicFrameLocks xmlns:a="http://schemas.openxmlformats.org/drawingml/2006/main" noChangeAspect="1"/>
             </wp:cNvGraphicFramePr>
@@ -8038,10 +8038,10 @@
           <w:noProof/>
         </w:rPr>
         <w:drawing>
-          <wp:inline distT="0" distB="0" distL="0" distR="0" wp14:anchorId="6AFF9B39" wp14:editId="6AF2D303">
+          <wp:inline distT="0" distB="0" distL="0" distR="0" wp14:anchorId="0A721B0A" wp14:editId="56840AB9">
             <wp:extent cx="5943600" cy="3714750"/>
             <wp:effectExtent l="0" t="0" r="0" b="0"/>
-            <wp:docPr id="484496660" name="Picture 484496660"/>
+            <wp:docPr id="819515200" name="Picture 819515200"/>
             <wp:cNvGraphicFramePr>
               <a:graphicFrameLocks xmlns:a="http://schemas.openxmlformats.org/drawingml/2006/main" noChangeAspect="1"/>
             </wp:cNvGraphicFramePr>
@@ -8367,10 +8367,10 @@
           <w:noProof/>
         </w:rPr>
         <w:drawing>
-          <wp:inline distT="0" distB="0" distL="0" distR="0" wp14:anchorId="00961D4B" wp14:editId="19EE7BD3">
+          <wp:inline distT="0" distB="0" distL="0" distR="0" wp14:anchorId="229C4EF9" wp14:editId="618E7248">
             <wp:extent cx="5943600" cy="3714750"/>
             <wp:effectExtent l="0" t="0" r="0" b="0"/>
-            <wp:docPr id="1359884330" name="Picture 1359884330"/>
+            <wp:docPr id="1584195005" name="Picture 1584195005"/>
             <wp:cNvGraphicFramePr>
               <a:graphicFrameLocks xmlns:a="http://schemas.openxmlformats.org/drawingml/2006/main" noChangeAspect="1"/>
             </wp:cNvGraphicFramePr>
@@ -8743,10 +8743,10 @@
           <w:noProof/>
         </w:rPr>
         <w:drawing>
-          <wp:inline distT="0" distB="0" distL="0" distR="0" wp14:anchorId="6D10FC42" wp14:editId="3FAA5491">
+          <wp:inline distT="0" distB="0" distL="0" distR="0" wp14:anchorId="30C32D77" wp14:editId="4AB40AFE">
             <wp:extent cx="5943600" cy="3714750"/>
             <wp:effectExtent l="0" t="0" r="0" b="0"/>
-            <wp:docPr id="1959868892" name="Picture 1959868892"/>
+            <wp:docPr id="1648879059" name="Picture 1648879059"/>
             <wp:cNvGraphicFramePr>
               <a:graphicFrameLocks xmlns:a="http://schemas.openxmlformats.org/drawingml/2006/main" noChangeAspect="1"/>
             </wp:cNvGraphicFramePr>
@@ -8896,10 +8896,10 @@
           <w:noProof/>
         </w:rPr>
         <w:drawing>
-          <wp:inline distT="0" distB="0" distL="0" distR="0" wp14:anchorId="047B2628" wp14:editId="03737A17">
+          <wp:inline distT="0" distB="0" distL="0" distR="0" wp14:anchorId="7816872A" wp14:editId="134C4EBF">
             <wp:extent cx="5943600" cy="3714750"/>
             <wp:effectExtent l="0" t="0" r="0" b="0"/>
-            <wp:docPr id="1421371285" name="Picture 1421371285"/>
+            <wp:docPr id="1592767928" name="Picture 1592767928"/>
             <wp:cNvGraphicFramePr>
               <a:graphicFrameLocks xmlns:a="http://schemas.openxmlformats.org/drawingml/2006/main" noChangeAspect="1"/>
             </wp:cNvGraphicFramePr>
@@ -10734,10 +10734,10 @@
           <w:noProof/>
         </w:rPr>
         <w:drawing>
-          <wp:inline distT="0" distB="0" distL="0" distR="0" wp14:anchorId="001F889F" wp14:editId="54C8DB15">
+          <wp:inline distT="0" distB="0" distL="0" distR="0" wp14:anchorId="7175ABDB" wp14:editId="4A4EF2C9">
             <wp:extent cx="5943600" cy="3714750"/>
             <wp:effectExtent l="0" t="0" r="0" b="0"/>
-            <wp:docPr id="1827435450" name="Picture 1827435450"/>
+            <wp:docPr id="897718221" name="Picture 897718221"/>
             <wp:cNvGraphicFramePr>
               <a:graphicFrameLocks xmlns:a="http://schemas.openxmlformats.org/drawingml/2006/main" noChangeAspect="1"/>
             </wp:cNvGraphicFramePr>
@@ -10956,10 +10956,10 @@
           <w:noProof/>
         </w:rPr>
         <w:drawing>
-          <wp:inline distT="0" distB="0" distL="0" distR="0" wp14:anchorId="38898B9F" wp14:editId="0FBE3692">
+          <wp:inline distT="0" distB="0" distL="0" distR="0" wp14:anchorId="51C4D72B" wp14:editId="077F77C6">
             <wp:extent cx="5943600" cy="3714750"/>
             <wp:effectExtent l="0" t="0" r="0" b="0"/>
-            <wp:docPr id="1460288746" name="Picture 1460288746"/>
+            <wp:docPr id="189428544" name="Picture 189428544"/>
             <wp:cNvGraphicFramePr>
               <a:graphicFrameLocks xmlns:a="http://schemas.openxmlformats.org/drawingml/2006/main" noChangeAspect="1"/>
             </wp:cNvGraphicFramePr>
@@ -11637,10 +11637,10 @@
           <w:noProof/>
         </w:rPr>
         <w:drawing>
-          <wp:inline distT="0" distB="0" distL="0" distR="0" wp14:anchorId="0F40306C" wp14:editId="2C8E473F">
+          <wp:inline distT="0" distB="0" distL="0" distR="0" wp14:anchorId="402290AA" wp14:editId="0914AA45">
             <wp:extent cx="5943600" cy="3714750"/>
             <wp:effectExtent l="0" t="0" r="0" b="0"/>
-            <wp:docPr id="531460612" name="Picture 531460612"/>
+            <wp:docPr id="1490713961" name="Picture 1490713961"/>
             <wp:cNvGraphicFramePr>
               <a:graphicFrameLocks xmlns:a="http://schemas.openxmlformats.org/drawingml/2006/main" noChangeAspect="1"/>
             </wp:cNvGraphicFramePr>
@@ -11828,6 +11828,112 @@
         <w:pStyle w:val="Heading2"/>
       </w:pPr>
       <w:r>
+        <w:t>Network shares (Raspberry Pi server)</w:t>
+      </w:r>
+    </w:p>
+    <w:p>
+      <w:pPr>
+        <w:spacing w:after="120"/>
+      </w:pPr>
+      <w:r>
+        <w:t xml:space="preserve">On the Pi the media lives on a file server, and the server must be connected to it before any folder can be picked. </w:t>
+      </w:r>
+      <w:r>
+        <w:rPr>
+          <w:b/>
+          <w:bCs/>
+        </w:rPr>
+        <w:t>Connect a network share…</w:t>
+      </w:r>
+      <w:r>
+        <w:t xml:space="preserve"> asks for the server's address (an IP address or a name), a username and a password, then lists the shares that server offers. Tick the ones that hold media and press </w:t>
+      </w:r>
+      <w:r>
+        <w:rPr>
+          <w:b/>
+          <w:bCs/>
+        </w:rPr>
+        <w:t>Connect</w:t>
+      </w:r>
+      <w:r>
+        <w:t xml:space="preserve">: each appears as a folder under </w:t>
+      </w:r>
+      <w:r>
+        <w:rPr>
+          <w:rFonts w:ascii="Consolas" w:eastAsia="Consolas" w:hAnsi="Consolas" w:cs="Consolas"/>
+          <w:sz w:val="19"/>
+          <w:szCs w:val="19"/>
+          <w:shd w:val="clear" w:color="auto" w:fill="EEF1F5"/>
+        </w:rPr>
+        <w:t>/mnt/medialedger/</w:t>
+      </w:r>
+      <w:r>
+        <w:t xml:space="preserve">, shown in the table with its status, and as a button at the top of the folder picker. </w:t>
+      </w:r>
+      <w:r>
+        <w:rPr>
+          <w:b/>
+          <w:bCs/>
+        </w:rPr>
+        <w:t>Remove</w:t>
+      </w:r>
+      <w:r>
+        <w:t xml:space="preserve"> disconnects one; nothing on the file server changes. The sign-in is stored on the Pi in a file only root can read, so shares come back after a restart; it is never written to MediaLedger's settings. Connecting and removing ask for your password again. On the Windows desktop app there is nothing to connect: browse straight to the folders, or type a path like </w:t>
+      </w:r>
+      <w:r>
+        <w:rPr>
+          <w:rFonts w:ascii="Consolas" w:eastAsia="Consolas" w:hAnsi="Consolas" w:cs="Consolas"/>
+          <w:sz w:val="19"/>
+          <w:szCs w:val="19"/>
+          <w:shd w:val="clear" w:color="auto" w:fill="EEF1F5"/>
+        </w:rPr>
+        <w:t>\\server\share\Movies</w:t>
+      </w:r>
+      <w:r>
+        <w:t>.</w:t>
+      </w:r>
+    </w:p>
+    <w:p>
+      <w:pPr>
+        <w:spacing w:after="120"/>
+      </w:pPr>
+      <w:r>
+        <w:rPr>
+          <w:b/>
+          <w:bCs/>
+        </w:rPr>
+        <w:lastRenderedPageBreak/>
+        <w:t>The welcome guide</w:t>
+      </w:r>
+      <w:r>
+        <w:t xml:space="preserve"> opens by itself on a new install and from </w:t>
+      </w:r>
+      <w:r>
+        <w:rPr>
+          <w:b/>
+          <w:bCs/>
+        </w:rPr>
+        <w:t>Open the setup guide</w:t>
+      </w:r>
+      <w:r>
+        <w:t xml:space="preserve"> here. It walks through four steps on one page: connect storage, pick the TV, Anime and Movies folders (</w:t>
+      </w:r>
+      <w:r>
+        <w:rPr>
+          <w:b/>
+          <w:bCs/>
+        </w:rPr>
+        <w:t>Find them for me</w:t>
+      </w:r>
+      <w:r>
+        <w:t xml:space="preserve"> looks inside the connected shares for folders with the usual names), check that ffprobe is present and every folder can be read, and start the first scan.</w:t>
+      </w:r>
+    </w:p>
+    <w:p>
+      <w:pPr>
+        <w:pStyle w:val="Heading2"/>
+      </w:pPr>
+      <w:r>
         <w:t>Library roots</w:t>
       </w:r>
     </w:p>
@@ -11911,7 +12017,6 @@
           <w:b/>
           <w:bCs/>
         </w:rPr>
-        <w:lastRenderedPageBreak/>
         <w:t>Re-probe unchanged files</w:t>
       </w:r>
       <w:r>
@@ -12122,6 +12227,7 @@
           <w:b/>
           <w:bCs/>
         </w:rPr>
+        <w:lastRenderedPageBreak/>
         <w:t>Windows Task Scheduler</w:t>
       </w:r>
       <w:r>
@@ -12222,11 +12328,7 @@
         <w:t>Restore…</w:t>
       </w:r>
       <w:r>
-        <w:t xml:space="preserve"> lists the sets in the folder. Pick one and choose whether to bring back the settings and the web accounts as well as the library data. The backup is opened read-only and checked (integrity, schema no newer than this build) before anything happens; then MediaLedger restarts and swaps the files in </w:t>
-      </w:r>
-      <w:r>
-        <w:lastRenderedPageBreak/>
-        <w:t xml:space="preserve">before opening them. The files it replaces are not deleted: they are moved into a </w:t>
+        <w:t xml:space="preserve"> lists the sets in the folder. Pick one and choose whether to bring back the settings and the web accounts as well as the library data. The backup is opened read-only and checked (integrity, schema no newer than this build) before anything happens; then MediaLedger restarts and swaps the files in before opening them. The files it replaces are not deleted: they are moved into a </w:t>
       </w:r>
       <w:r>
         <w:rPr>
@@ -12998,10 +13100,10 @@
           <w:noProof/>
         </w:rPr>
         <w:drawing>
-          <wp:inline distT="0" distB="0" distL="0" distR="0" wp14:anchorId="69501593" wp14:editId="40589280">
+          <wp:inline distT="0" distB="0" distL="0" distR="0" wp14:anchorId="78D4CABE" wp14:editId="1672C546">
             <wp:extent cx="5943600" cy="3714750"/>
             <wp:effectExtent l="0" t="0" r="0" b="0"/>
-            <wp:docPr id="971664077" name="Picture 971664077"/>
+            <wp:docPr id="2066428629" name="Picture 2066428629"/>
             <wp:cNvGraphicFramePr>
               <a:graphicFrameLocks xmlns:a="http://schemas.openxmlformats.org/drawingml/2006/main" noChangeAspect="1"/>
             </wp:cNvGraphicFramePr>
@@ -13575,10 +13677,10 @@
           <w:noProof/>
         </w:rPr>
         <w:drawing>
-          <wp:inline distT="0" distB="0" distL="0" distR="0" wp14:anchorId="20F91A22" wp14:editId="0F6C57D5">
+          <wp:inline distT="0" distB="0" distL="0" distR="0" wp14:anchorId="4C06D7C9" wp14:editId="3D910D31">
             <wp:extent cx="5943600" cy="3714750"/>
             <wp:effectExtent l="0" t="0" r="0" b="0"/>
-            <wp:docPr id="1239727918" name="Picture 1239727918"/>
+            <wp:docPr id="1875510973" name="Picture 1875510973"/>
             <wp:cNvGraphicFramePr>
               <a:graphicFrameLocks xmlns:a="http://schemas.openxmlformats.org/drawingml/2006/main" noChangeAspect="1"/>
             </wp:cNvGraphicFramePr>
@@ -13741,10 +13843,10 @@
           <w:noProof/>
         </w:rPr>
         <w:drawing>
-          <wp:inline distT="0" distB="0" distL="0" distR="0" wp14:anchorId="4A7232D0" wp14:editId="1A142464">
+          <wp:inline distT="0" distB="0" distL="0" distR="0" wp14:anchorId="00B3DC1C" wp14:editId="0F0FC058">
             <wp:extent cx="5943600" cy="3714750"/>
             <wp:effectExtent l="0" t="0" r="0" b="0"/>
-            <wp:docPr id="618946092" name="Picture 618946092"/>
+            <wp:docPr id="1726339232" name="Picture 1726339232"/>
             <wp:cNvGraphicFramePr>
               <a:graphicFrameLocks xmlns:a="http://schemas.openxmlformats.org/drawingml/2006/main" noChangeAspect="1"/>
             </wp:cNvGraphicFramePr>
@@ -14958,10 +15060,10 @@
           <w:noProof/>
         </w:rPr>
         <w:drawing>
-          <wp:inline distT="0" distB="0" distL="0" distR="0" wp14:anchorId="11C4C71B" wp14:editId="451701D1">
+          <wp:inline distT="0" distB="0" distL="0" distR="0" wp14:anchorId="6A529CDA" wp14:editId="7E5834F7">
             <wp:extent cx="5943600" cy="3714750"/>
             <wp:effectExtent l="0" t="0" r="0" b="0"/>
-            <wp:docPr id="982676508" name="Picture 982676508"/>
+            <wp:docPr id="2033201415" name="Picture 2033201415"/>
             <wp:cNvGraphicFramePr>
               <a:graphicFrameLocks xmlns:a="http://schemas.openxmlformats.org/drawingml/2006/main" noChangeAspect="1"/>
             </wp:cNvGraphicFramePr>
@@ -15408,10 +15510,10 @@
           <w:noProof/>
         </w:rPr>
         <w:drawing>
-          <wp:inline distT="0" distB="0" distL="0" distR="0" wp14:anchorId="1EAD92CF" wp14:editId="03E5C78D">
+          <wp:inline distT="0" distB="0" distL="0" distR="0" wp14:anchorId="18F4E11E" wp14:editId="056CF945">
             <wp:extent cx="5943600" cy="3714750"/>
             <wp:effectExtent l="0" t="0" r="0" b="0"/>
-            <wp:docPr id="266938631" name="Picture 266938631"/>
+            <wp:docPr id="621571598" name="Picture 621571598"/>
             <wp:cNvGraphicFramePr>
               <a:graphicFrameLocks xmlns:a="http://schemas.openxmlformats.org/drawingml/2006/main" noChangeAspect="1"/>
             </wp:cNvGraphicFramePr>
@@ -21406,7 +21508,7 @@
         <w:sz w:val="16"/>
         <w:szCs w:val="16"/>
       </w:rPr>
-      <w:t>MediaLedger 2.3.0 · User Manual</w:t>
+      <w:t>MediaLedger 2.4.0 · User Manual</w:t>
     </w:r>
   </w:p>
 </w:hdr>
@@ -21425,10 +21527,10 @@
 <file path=word/numbering.xml><?xml version="1.0" encoding="utf-8"?>
 <w:numbering xmlns:wpc="http://schemas.microsoft.com/office/word/2010/wordprocessingCanvas" xmlns:cx="http://schemas.microsoft.com/office/drawing/2014/chartex" xmlns:cx1="http://schemas.microsoft.com/office/drawing/2015/9/8/chartex" xmlns:cx2="http://schemas.microsoft.com/office/drawing/2015/10/21/chartex" xmlns:cx3="http://schemas.microsoft.com/office/drawing/2016/5/9/chartex" xmlns:cx4="http://schemas.microsoft.com/office/drawing/2016/5/10/chartex" xmlns:cx5="http://schemas.microsoft.com/office/drawing/2016/5/11/chartex" xmlns:cx6="http://schemas.microsoft.com/office/drawing/2016/5/12/chartex" xmlns:cx7="http://schemas.microsoft.com/office/drawing/2016/5/13/chartex" xmlns:cx8="http://schemas.microsoft.com/office/drawing/2016/5/14/chartex" xmlns:mc="http://schemas.openxmlformats.org/markup-compatibility/2006" xmlns:aink="http://schemas.microsoft.com/office/drawing/2016/ink" xmlns:am3d="http://schemas.microsoft.com/office/drawing/2017/model3d" xmlns:o="urn:schemas-microsoft-com:office:office" xmlns:oel="http://schemas.microsoft.com/office/2019/extlst" xmlns:r="http://schemas.openxmlformats.org/officeDocument/2006/relationships" xmlns:m="http://schemas.openxmlformats.org/officeDocument/2006/math" xmlns:v="urn:schemas-microsoft-com:vml" xmlns:wp14="http://schemas.microsoft.com/office/word/2010/wordprocessingDrawing" xmlns:wp="http://schemas.openxmlformats.org/drawingml/2006/wordprocessingDrawing" xmlns:w10="urn:schemas-microsoft-com:office:word" xmlns:w="http://schemas.openxmlformats.org/wordprocessingml/2006/main" xmlns:w14="http://schemas.microsoft.com/office/word/2010/wordml" xmlns:w15="http://schemas.microsoft.com/office/word/2012/wordml" xmlns:w16cex="http://schemas.microsoft.com/office/word/2018/wordml/cex" xmlns:w16cid="http://schemas.microsoft.com/office/word/2016/wordml/cid" xmlns:w16="http://schemas.microsoft.com/office/word/2018/wordml" xmlns:w16du="http://schemas.microsoft.com/office/word/2023/wordml/word16du" xmlns:w16sdtdh="http://schemas.microsoft.com/office/word/2020/wordml/sdtdatahash" xmlns:w16sdtfl="http://schemas.microsoft.com/office/word/2024/wordml/sdtformatlock" xmlns:w16se="http://schemas.microsoft.com/office/word/2015/wordml/symex" xmlns:wpg="http://schemas.microsoft.com/office/word/2010/wordprocessingGroup" xmlns:wpi="http://schemas.microsoft.com/office/word/2010/wordprocessingInk" xmlns:wne="http://schemas.microsoft.com/office/word/2006/wordml" xmlns:wps="http://schemas.microsoft.com/office/word/2010/wordprocessingShape" mc:Ignorable="w14 w15 w16se w16cid w16 w16cex w16sdtdh w16sdtfl w16du wp14">
   <w:abstractNum w:abstractNumId="0" w15:restartNumberingAfterBreak="0">
-    <w:nsid w:val="0DD144C7"/>
+    <w:nsid w:val="0F457E28"/>
     <w:multiLevelType w:val="hybridMultilevel"/>
-    <w:tmpl w:val="939C6C94"/>
-    <w:lvl w:ilvl="0" w:tplc="C70C8BF8">
+    <w:tmpl w:val="0FE67090"/>
+    <w:lvl w:ilvl="0" w:tplc="E446E786">
       <w:start w:val="1"/>
       <w:numFmt w:val="bullet"/>
       <w:lvlText w:val="•"/>
@@ -21437,52 +21539,52 @@
         <w:ind w:left="540" w:hanging="270"/>
       </w:pPr>
     </w:lvl>
-    <w:lvl w:ilvl="1" w:tplc="460002F8">
+    <w:lvl w:ilvl="1" w:tplc="9CB8D44C">
       <w:numFmt w:val="decimal"/>
       <w:lvlText w:val=""/>
       <w:lvlJc w:val="left"/>
     </w:lvl>
-    <w:lvl w:ilvl="2" w:tplc="5BE4A960">
+    <w:lvl w:ilvl="2" w:tplc="11148852">
       <w:numFmt w:val="decimal"/>
       <w:lvlText w:val=""/>
       <w:lvlJc w:val="left"/>
     </w:lvl>
-    <w:lvl w:ilvl="3" w:tplc="4502DC08">
+    <w:lvl w:ilvl="3" w:tplc="29F60AFC">
       <w:numFmt w:val="decimal"/>
       <w:lvlText w:val=""/>
       <w:lvlJc w:val="left"/>
     </w:lvl>
-    <w:lvl w:ilvl="4" w:tplc="DF3A4884">
+    <w:lvl w:ilvl="4" w:tplc="A1B2DBE0">
       <w:numFmt w:val="decimal"/>
       <w:lvlText w:val=""/>
       <w:lvlJc w:val="left"/>
     </w:lvl>
-    <w:lvl w:ilvl="5" w:tplc="5A587D22">
+    <w:lvl w:ilvl="5" w:tplc="B854DE26">
       <w:numFmt w:val="decimal"/>
       <w:lvlText w:val=""/>
       <w:lvlJc w:val="left"/>
     </w:lvl>
-    <w:lvl w:ilvl="6" w:tplc="F1328B2C">
+    <w:lvl w:ilvl="6" w:tplc="F5B0E77C">
       <w:numFmt w:val="decimal"/>
       <w:lvlText w:val=""/>
       <w:lvlJc w:val="left"/>
     </w:lvl>
-    <w:lvl w:ilvl="7" w:tplc="B61849A4">
+    <w:lvl w:ilvl="7" w:tplc="1A6AA062">
       <w:numFmt w:val="decimal"/>
       <w:lvlText w:val=""/>
       <w:lvlJc w:val="left"/>
     </w:lvl>
-    <w:lvl w:ilvl="8" w:tplc="6F0805A2">
+    <w:lvl w:ilvl="8" w:tplc="3B5C993E">
       <w:numFmt w:val="decimal"/>
       <w:lvlText w:val=""/>
       <w:lvlJc w:val="left"/>
     </w:lvl>
   </w:abstractNum>
   <w:abstractNum w:abstractNumId="1" w15:restartNumberingAfterBreak="0">
-    <w:nsid w:val="21917ECA"/>
+    <w:nsid w:val="14861F8C"/>
     <w:multiLevelType w:val="hybridMultilevel"/>
-    <w:tmpl w:val="B61CD460"/>
-    <w:lvl w:ilvl="0" w:tplc="179C1E30">
+    <w:tmpl w:val="F3E41256"/>
+    <w:lvl w:ilvl="0" w:tplc="E4AE9710">
       <w:start w:val="1"/>
       <w:numFmt w:val="decimal"/>
       <w:lvlText w:val="%1."/>
@@ -21491,52 +21593,52 @@
         <w:ind w:left="540" w:hanging="360"/>
       </w:pPr>
     </w:lvl>
-    <w:lvl w:ilvl="1" w:tplc="8A28B3E6">
+    <w:lvl w:ilvl="1" w:tplc="E0687516">
       <w:numFmt w:val="decimal"/>
       <w:lvlText w:val=""/>
       <w:lvlJc w:val="left"/>
     </w:lvl>
-    <w:lvl w:ilvl="2" w:tplc="1F74F096">
+    <w:lvl w:ilvl="2" w:tplc="6AC20A46">
       <w:numFmt w:val="decimal"/>
       <w:lvlText w:val=""/>
       <w:lvlJc w:val="left"/>
     </w:lvl>
-    <w:lvl w:ilvl="3" w:tplc="4C20C5F8">
+    <w:lvl w:ilvl="3" w:tplc="9E42F7E6">
       <w:numFmt w:val="decimal"/>
       <w:lvlText w:val=""/>
       <w:lvlJc w:val="left"/>
     </w:lvl>
-    <w:lvl w:ilvl="4" w:tplc="62F6F67A">
+    <w:lvl w:ilvl="4" w:tplc="D24AE556">
       <w:numFmt w:val="decimal"/>
       <w:lvlText w:val=""/>
       <w:lvlJc w:val="left"/>
     </w:lvl>
-    <w:lvl w:ilvl="5" w:tplc="34C6E87A">
+    <w:lvl w:ilvl="5" w:tplc="A3EE9192">
       <w:numFmt w:val="decimal"/>
       <w:lvlText w:val=""/>
       <w:lvlJc w:val="left"/>
     </w:lvl>
-    <w:lvl w:ilvl="6" w:tplc="3446A90A">
+    <w:lvl w:ilvl="6" w:tplc="37A2A980">
       <w:numFmt w:val="decimal"/>
       <w:lvlText w:val=""/>
       <w:lvlJc w:val="left"/>
     </w:lvl>
-    <w:lvl w:ilvl="7" w:tplc="9758A8F4">
+    <w:lvl w:ilvl="7" w:tplc="284E9280">
       <w:numFmt w:val="decimal"/>
       <w:lvlText w:val=""/>
       <w:lvlJc w:val="left"/>
     </w:lvl>
-    <w:lvl w:ilvl="8" w:tplc="0A3E6CA0">
+    <w:lvl w:ilvl="8" w:tplc="C7B04D8A">
       <w:numFmt w:val="decimal"/>
       <w:lvlText w:val=""/>
       <w:lvlJc w:val="left"/>
     </w:lvl>
   </w:abstractNum>
   <w:abstractNum w:abstractNumId="2" w15:restartNumberingAfterBreak="0">
-    <w:nsid w:val="33CD7A6A"/>
+    <w:nsid w:val="1ECC1E39"/>
     <w:multiLevelType w:val="hybridMultilevel"/>
-    <w:tmpl w:val="94CCE794"/>
-    <w:lvl w:ilvl="0" w:tplc="D9400AA8">
+    <w:tmpl w:val="724C3524"/>
+    <w:lvl w:ilvl="0" w:tplc="FFB42DE2">
       <w:start w:val="1"/>
       <w:numFmt w:val="bullet"/>
       <w:lvlText w:val="●"/>
@@ -21545,7 +21647,7 @@
         <w:ind w:left="720" w:hanging="360"/>
       </w:pPr>
     </w:lvl>
-    <w:lvl w:ilvl="1" w:tplc="15605F20">
+    <w:lvl w:ilvl="1" w:tplc="ACF827CC">
       <w:start w:val="1"/>
       <w:numFmt w:val="bullet"/>
       <w:lvlText w:val="○"/>
@@ -21554,7 +21656,7 @@
         <w:ind w:left="1440" w:hanging="360"/>
       </w:pPr>
     </w:lvl>
-    <w:lvl w:ilvl="2" w:tplc="CC4AB740">
+    <w:lvl w:ilvl="2" w:tplc="0D2C9634">
       <w:start w:val="1"/>
       <w:numFmt w:val="bullet"/>
       <w:lvlText w:val="■"/>
@@ -21563,7 +21665,7 @@
         <w:ind w:left="2160" w:hanging="360"/>
       </w:pPr>
     </w:lvl>
-    <w:lvl w:ilvl="3" w:tplc="93EC35A8">
+    <w:lvl w:ilvl="3" w:tplc="F5265E32">
       <w:start w:val="1"/>
       <w:numFmt w:val="bullet"/>
       <w:lvlText w:val="●"/>
@@ -21572,7 +21674,7 @@
         <w:ind w:left="2880" w:hanging="360"/>
       </w:pPr>
     </w:lvl>
-    <w:lvl w:ilvl="4" w:tplc="DCAAE488">
+    <w:lvl w:ilvl="4" w:tplc="0240AB80">
       <w:start w:val="1"/>
       <w:numFmt w:val="bullet"/>
       <w:lvlText w:val="○"/>
@@ -21581,7 +21683,7 @@
         <w:ind w:left="3600" w:hanging="360"/>
       </w:pPr>
     </w:lvl>
-    <w:lvl w:ilvl="5" w:tplc="D8E43E18">
+    <w:lvl w:ilvl="5" w:tplc="DC400AEC">
       <w:start w:val="1"/>
       <w:numFmt w:val="bullet"/>
       <w:lvlText w:val="■"/>
@@ -21590,7 +21692,7 @@
         <w:ind w:left="4320" w:hanging="360"/>
       </w:pPr>
     </w:lvl>
-    <w:lvl w:ilvl="6" w:tplc="AF1A2E92">
+    <w:lvl w:ilvl="6" w:tplc="6BD402E4">
       <w:start w:val="1"/>
       <w:numFmt w:val="bullet"/>
       <w:lvlText w:val="●"/>
@@ -21599,7 +21701,7 @@
         <w:ind w:left="5040" w:hanging="360"/>
       </w:pPr>
     </w:lvl>
-    <w:lvl w:ilvl="7" w:tplc="FD8A548A">
+    <w:lvl w:ilvl="7" w:tplc="21FC3896">
       <w:start w:val="1"/>
       <w:numFmt w:val="bullet"/>
       <w:lvlText w:val="●"/>
@@ -21608,7 +21710,7 @@
         <w:ind w:left="5760" w:hanging="360"/>
       </w:pPr>
     </w:lvl>
-    <w:lvl w:ilvl="8" w:tplc="CA469D46">
+    <w:lvl w:ilvl="8" w:tplc="59963094">
       <w:start w:val="1"/>
       <w:numFmt w:val="bullet"/>
       <w:lvlText w:val="●"/>
@@ -21618,67 +21720,67 @@
       </w:pPr>
     </w:lvl>
   </w:abstractNum>
-  <w:num w:numId="1" w16cid:durableId="442652116">
+  <w:num w:numId="1" w16cid:durableId="15736242">
     <w:abstractNumId w:val="2"/>
     <w:lvlOverride w:ilvl="0">
       <w:startOverride w:val="1"/>
     </w:lvlOverride>
   </w:num>
-  <w:num w:numId="2" w16cid:durableId="628320922">
+  <w:num w:numId="2" w16cid:durableId="2062632837">
     <w:abstractNumId w:val="0"/>
     <w:lvlOverride w:ilvl="0">
       <w:startOverride w:val="1"/>
     </w:lvlOverride>
   </w:num>
-  <w:num w:numId="3" w16cid:durableId="1781492010">
+  <w:num w:numId="3" w16cid:durableId="1860000063">
     <w:abstractNumId w:val="1"/>
     <w:lvlOverride w:ilvl="0">
       <w:startOverride w:val="1"/>
     </w:lvlOverride>
   </w:num>
-  <w:num w:numId="4" w16cid:durableId="1077440478">
+  <w:num w:numId="4" w16cid:durableId="407776778">
     <w:abstractNumId w:val="1"/>
     <w:lvlOverride w:ilvl="0">
       <w:startOverride w:val="1"/>
     </w:lvlOverride>
   </w:num>
-  <w:num w:numId="5" w16cid:durableId="1433015055">
+  <w:num w:numId="5" w16cid:durableId="1421295846">
     <w:abstractNumId w:val="1"/>
     <w:lvlOverride w:ilvl="0">
       <w:startOverride w:val="1"/>
     </w:lvlOverride>
   </w:num>
-  <w:num w:numId="6" w16cid:durableId="647365395">
+  <w:num w:numId="6" w16cid:durableId="359362017">
     <w:abstractNumId w:val="1"/>
     <w:lvlOverride w:ilvl="0">
       <w:startOverride w:val="1"/>
     </w:lvlOverride>
   </w:num>
-  <w:num w:numId="7" w16cid:durableId="864637263">
+  <w:num w:numId="7" w16cid:durableId="1808934737">
     <w:abstractNumId w:val="1"/>
     <w:lvlOverride w:ilvl="0">
       <w:startOverride w:val="1"/>
     </w:lvlOverride>
   </w:num>
-  <w:num w:numId="8" w16cid:durableId="332269612">
+  <w:num w:numId="8" w16cid:durableId="1703556346">
     <w:abstractNumId w:val="1"/>
     <w:lvlOverride w:ilvl="0">
       <w:startOverride w:val="1"/>
     </w:lvlOverride>
   </w:num>
-  <w:num w:numId="9" w16cid:durableId="1568220546">
+  <w:num w:numId="9" w16cid:durableId="1217083948">
     <w:abstractNumId w:val="1"/>
     <w:lvlOverride w:ilvl="0">
       <w:startOverride w:val="1"/>
     </w:lvlOverride>
   </w:num>
-  <w:num w:numId="10" w16cid:durableId="404491839">
+  <w:num w:numId="10" w16cid:durableId="1332290402">
     <w:abstractNumId w:val="1"/>
     <w:lvlOverride w:ilvl="0">
       <w:startOverride w:val="1"/>
     </w:lvlOverride>
   </w:num>
-  <w:num w:numId="11" w16cid:durableId="1659380051">
+  <w:num w:numId="11" w16cid:durableId="2096247477">
     <w:abstractNumId w:val="1"/>
     <w:lvlOverride w:ilvl="0">
       <w:startOverride w:val="1"/>
@@ -22298,7 +22400,7 @@
     <w:link w:val="HeaderChar"/>
     <w:uiPriority w:val="99"/>
     <w:unhideWhenUsed/>
-    <w:rsid w:val="00AF2175"/>
+    <w:rsid w:val="00131840"/>
     <w:pPr>
       <w:tabs>
         <w:tab w:val="center" w:pos="4680"/>
@@ -22311,7 +22413,7 @@
     <w:basedOn w:val="DefaultParagraphFont"/>
     <w:link w:val="Header"/>
     <w:uiPriority w:val="99"/>
-    <w:rsid w:val="00AF2175"/>
+    <w:rsid w:val="00131840"/>
   </w:style>
   <w:style w:type="paragraph" w:styleId="Footer">
     <w:name w:val="footer"/>
@@ -22319,7 +22421,7 @@
     <w:link w:val="FooterChar"/>
     <w:uiPriority w:val="99"/>
     <w:unhideWhenUsed/>
-    <w:rsid w:val="00AF2175"/>
+    <w:rsid w:val="00131840"/>
     <w:pPr>
       <w:tabs>
         <w:tab w:val="center" w:pos="4680"/>
@@ -22332,7 +22434,7 @@
     <w:basedOn w:val="DefaultParagraphFont"/>
     <w:link w:val="Footer"/>
     <w:uiPriority w:val="99"/>
-    <w:rsid w:val="00AF2175"/>
+    <w:rsid w:val="00131840"/>
   </w:style>
 </w:styles>
 </file>

</xml_diff>

<commit_message>
Release 2.4.1: pick one library on the Missing page, and a larger button to fold the sidebar
</commit_message>
<xml_diff>
--- a/docs/MediaLedger-Manual.docx
+++ b/docs/MediaLedger-Manual.docx
@@ -42,7 +42,7 @@
           <w:sz w:val="24"/>
           <w:szCs w:val="24"/>
         </w:rPr>
-        <w:t>Version 2.4.0</w:t>
+        <w:t>Version 2.4.1</w:t>
       </w:r>
     </w:p>
     <w:p>
@@ -2477,7 +2477,7 @@
           <w:noProof/>
         </w:rPr>
         <w:drawing>
-          <wp:inline distT="0" distB="0" distL="0" distR="0" wp14:anchorId="0ABB631D" wp14:editId="51D5FC31">
+          <wp:inline distT="0" distB="0" distL="0" distR="0" wp14:anchorId="3F095B22" wp14:editId="64FA0FF3">
             <wp:extent cx="5943600" cy="3714750"/>
             <wp:effectExtent l="0" t="0" r="0" b="0"/>
             <wp:docPr id="1" name="Picture 1"/>
@@ -3699,10 +3699,10 @@
           <w:noProof/>
         </w:rPr>
         <w:drawing>
-          <wp:inline distT="0" distB="0" distL="0" distR="0" wp14:anchorId="1938C788" wp14:editId="324B7D2E">
+          <wp:inline distT="0" distB="0" distL="0" distR="0" wp14:anchorId="6842CCFE" wp14:editId="65BF25CE">
             <wp:extent cx="5943600" cy="3714750"/>
             <wp:effectExtent l="0" t="0" r="0" b="0"/>
-            <wp:docPr id="1115225829" name="Picture 1115225829"/>
+            <wp:docPr id="1591236544" name="Picture 1591236544"/>
             <wp:cNvGraphicFramePr>
               <a:graphicFrameLocks xmlns:a="http://schemas.openxmlformats.org/drawingml/2006/main" noChangeAspect="1"/>
             </wp:cNvGraphicFramePr>
@@ -4385,10 +4385,10 @@
           <w:noProof/>
         </w:rPr>
         <w:drawing>
-          <wp:inline distT="0" distB="0" distL="0" distR="0" wp14:anchorId="150E2036" wp14:editId="59F66A91">
+          <wp:inline distT="0" distB="0" distL="0" distR="0" wp14:anchorId="711A4180" wp14:editId="174FBA66">
             <wp:extent cx="5943600" cy="3714750"/>
             <wp:effectExtent l="0" t="0" r="0" b="0"/>
-            <wp:docPr id="936712649" name="Picture 936712649"/>
+            <wp:docPr id="1525910939" name="Picture 1525910939"/>
             <wp:cNvGraphicFramePr>
               <a:graphicFrameLocks xmlns:a="http://schemas.openxmlformats.org/drawingml/2006/main" noChangeAspect="1"/>
             </wp:cNvGraphicFramePr>
@@ -5074,10 +5074,10 @@
           <w:noProof/>
         </w:rPr>
         <w:drawing>
-          <wp:inline distT="0" distB="0" distL="0" distR="0" wp14:anchorId="5D632A4B" wp14:editId="405A757C">
+          <wp:inline distT="0" distB="0" distL="0" distR="0" wp14:anchorId="68AE87EF" wp14:editId="0AA1D476">
             <wp:extent cx="5943600" cy="3714750"/>
             <wp:effectExtent l="0" t="0" r="0" b="0"/>
-            <wp:docPr id="737283444" name="Picture 737283444"/>
+            <wp:docPr id="520797260" name="Picture 520797260"/>
             <wp:cNvGraphicFramePr>
               <a:graphicFrameLocks xmlns:a="http://schemas.openxmlformats.org/drawingml/2006/main" noChangeAspect="1"/>
             </wp:cNvGraphicFramePr>
@@ -5397,10 +5397,10 @@
           <w:noProof/>
         </w:rPr>
         <w:drawing>
-          <wp:inline distT="0" distB="0" distL="0" distR="0" wp14:anchorId="6959E1A6" wp14:editId="383281B6">
+          <wp:inline distT="0" distB="0" distL="0" distR="0" wp14:anchorId="7D607746" wp14:editId="78CCB269">
             <wp:extent cx="5943600" cy="3714750"/>
             <wp:effectExtent l="0" t="0" r="0" b="0"/>
-            <wp:docPr id="1567946198" name="Picture 1567946198"/>
+            <wp:docPr id="1634315996" name="Picture 1634315996"/>
             <wp:cNvGraphicFramePr>
               <a:graphicFrameLocks xmlns:a="http://schemas.openxmlformats.org/drawingml/2006/main" noChangeAspect="1"/>
             </wp:cNvGraphicFramePr>
@@ -5505,10 +5505,10 @@
         </w:rPr>
         <w:lastRenderedPageBreak/>
         <w:drawing>
-          <wp:inline distT="0" distB="0" distL="0" distR="0" wp14:anchorId="04A6E5E2" wp14:editId="11CDBC83">
+          <wp:inline distT="0" distB="0" distL="0" distR="0" wp14:anchorId="5FE55B41" wp14:editId="7CEAC937">
             <wp:extent cx="5943600" cy="3714750"/>
             <wp:effectExtent l="0" t="0" r="0" b="0"/>
-            <wp:docPr id="1385214821" name="Picture 1385214821"/>
+            <wp:docPr id="1759012500" name="Picture 1759012500"/>
             <wp:cNvGraphicFramePr>
               <a:graphicFrameLocks xmlns:a="http://schemas.openxmlformats.org/drawingml/2006/main" noChangeAspect="1"/>
             </wp:cNvGraphicFramePr>
@@ -5598,10 +5598,10 @@
           <w:noProof/>
         </w:rPr>
         <w:drawing>
-          <wp:inline distT="0" distB="0" distL="0" distR="0" wp14:anchorId="1CC5A3EA" wp14:editId="652E15EE">
+          <wp:inline distT="0" distB="0" distL="0" distR="0" wp14:anchorId="563645CE" wp14:editId="7B20CF5E">
             <wp:extent cx="5943600" cy="3714750"/>
             <wp:effectExtent l="0" t="0" r="0" b="0"/>
-            <wp:docPr id="1305579004" name="Picture 1305579004"/>
+            <wp:docPr id="686380910" name="Picture 686380910"/>
             <wp:cNvGraphicFramePr>
               <a:graphicFrameLocks xmlns:a="http://schemas.openxmlformats.org/drawingml/2006/main" noChangeAspect="1"/>
             </wp:cNvGraphicFramePr>
@@ -5864,10 +5864,10 @@
           <w:noProof/>
         </w:rPr>
         <w:drawing>
-          <wp:inline distT="0" distB="0" distL="0" distR="0" wp14:anchorId="340C4811" wp14:editId="563590A3">
+          <wp:inline distT="0" distB="0" distL="0" distR="0" wp14:anchorId="34C039B1" wp14:editId="4D720E8C">
             <wp:extent cx="5943600" cy="3714750"/>
             <wp:effectExtent l="0" t="0" r="0" b="0"/>
-            <wp:docPr id="1873417283" name="Picture 1873417283"/>
+            <wp:docPr id="2044216604" name="Picture 2044216604"/>
             <wp:cNvGraphicFramePr>
               <a:graphicFrameLocks xmlns:a="http://schemas.openxmlformats.org/drawingml/2006/main" noChangeAspect="1"/>
             </wp:cNvGraphicFramePr>
@@ -5924,6 +5924,61 @@
         <w:spacing w:after="120"/>
       </w:pPr>
       <w:r>
+        <w:rPr>
+          <w:b/>
+          <w:bCs/>
+        </w:rPr>
+        <w:t>One library at a time.</w:t>
+      </w:r>
+      <w:r>
+        <w:t xml:space="preserve"> The buttons at the top of the page, </w:t>
+      </w:r>
+      <w:r>
+        <w:rPr>
+          <w:b/>
+          <w:bCs/>
+        </w:rPr>
+        <w:t>All libraries</w:t>
+      </w:r>
+      <w:r>
+        <w:t xml:space="preserve">, </w:t>
+      </w:r>
+      <w:r>
+        <w:rPr>
+          <w:b/>
+          <w:bCs/>
+        </w:rPr>
+        <w:t>TV</w:t>
+      </w:r>
+      <w:r>
+        <w:t xml:space="preserve"> and </w:t>
+      </w:r>
+      <w:r>
+        <w:rPr>
+          <w:b/>
+          <w:bCs/>
+        </w:rPr>
+        <w:t>Anime</w:t>
+      </w:r>
+      <w:r>
+        <w:t xml:space="preserve">, narrow the whole page to one library: the tiles, the two airing cards and the table. Each button shows how many of its series have gaps. </w:t>
+      </w:r>
+      <w:r>
+        <w:rPr>
+          <w:b/>
+          <w:bCs/>
+        </w:rPr>
+        <w:t>Only series with gaps</w:t>
+      </w:r>
+      <w:r>
+        <w:t xml:space="preserve"> hides the complete and unmatched series. Both choices are remembered on the device.</w:t>
+      </w:r>
+    </w:p>
+    <w:p>
+      <w:pPr>
+        <w:spacing w:after="120"/>
+      </w:pPr>
+      <w:r>
         <w:t>After each scan MediaLedger looks up every series it has not seen before on TVmaze (TV) or AniList (anime) and stores the number of episodes in each season. Both services are free and need no key; lookups run at about one series per second in the background, and airing series are re-checked every two weeks. Comparing those counts with what is on disk, per season, gives an exact list of what you lack.</w:t>
       </w:r>
     </w:p>
@@ -6237,7 +6292,15 @@
                 <w:sz w:val="19"/>
                 <w:szCs w:val="19"/>
               </w:rPr>
-              <w:t>A badge shown when a season on disk is numbered far beyond its expected length (for example One Piece folders numbered 62–77). That season is skipped rather than reported as missing.</w:t>
+              <w:t xml:space="preserve">A badge shown when a season on disk is numbered far beyond its expected length (for example One Piece </w:t>
+            </w:r>
+            <w:r>
+              <w:rPr>
+                <w:sz w:val="19"/>
+                <w:szCs w:val="19"/>
+              </w:rPr>
+              <w:lastRenderedPageBreak/>
+              <w:t>folders numbered 62–77). That season is skipped rather than reported as missing.</w:t>
             </w:r>
           </w:p>
         </w:tc>
@@ -6248,6 +6311,7 @@
         <w:pStyle w:val="Heading2"/>
       </w:pPr>
       <w:r>
+        <w:lastRenderedPageBreak/>
         <w:t>9.2 Airing next</w:t>
       </w:r>
     </w:p>
@@ -6256,7 +6320,6 @@
         <w:spacing w:after="120"/>
       </w:pPr>
       <w:r>
-        <w:lastRenderedPageBreak/>
         <w:t xml:space="preserve">Two panels above the table use the same online match. </w:t>
       </w:r>
       <w:r>
@@ -6446,10 +6509,10 @@
           <w:noProof/>
         </w:rPr>
         <w:drawing>
-          <wp:inline distT="0" distB="0" distL="0" distR="0" wp14:anchorId="5FFA9C99" wp14:editId="2C567C30">
+          <wp:inline distT="0" distB="0" distL="0" distR="0" wp14:anchorId="2BA4E322" wp14:editId="6FAA53C2">
             <wp:extent cx="5943600" cy="3714750"/>
             <wp:effectExtent l="0" t="0" r="0" b="0"/>
-            <wp:docPr id="547834929" name="Picture 547834929"/>
+            <wp:docPr id="1506098121" name="Picture 1506098121"/>
             <wp:cNvGraphicFramePr>
               <a:graphicFrameLocks xmlns:a="http://schemas.openxmlformats.org/drawingml/2006/main" noChangeAspect="1"/>
             </wp:cNvGraphicFramePr>
@@ -6633,10 +6696,10 @@
         </w:rPr>
         <w:lastRenderedPageBreak/>
         <w:drawing>
-          <wp:inline distT="0" distB="0" distL="0" distR="0" wp14:anchorId="0CE718C7" wp14:editId="18AE4DE2">
+          <wp:inline distT="0" distB="0" distL="0" distR="0" wp14:anchorId="745C3375" wp14:editId="102F049F">
             <wp:extent cx="5943600" cy="3714750"/>
             <wp:effectExtent l="0" t="0" r="0" b="0"/>
-            <wp:docPr id="1220475487" name="Picture 1220475487"/>
+            <wp:docPr id="1796454423" name="Picture 1796454423"/>
             <wp:cNvGraphicFramePr>
               <a:graphicFrameLocks xmlns:a="http://schemas.openxmlformats.org/drawingml/2006/main" noChangeAspect="1"/>
             </wp:cNvGraphicFramePr>
@@ -6809,10 +6872,10 @@
         </w:rPr>
         <w:lastRenderedPageBreak/>
         <w:drawing>
-          <wp:inline distT="0" distB="0" distL="0" distR="0" wp14:anchorId="71EE846E" wp14:editId="665B6C0A">
+          <wp:inline distT="0" distB="0" distL="0" distR="0" wp14:anchorId="76D0F7A3" wp14:editId="49B92B0A">
             <wp:extent cx="5943600" cy="3714750"/>
             <wp:effectExtent l="0" t="0" r="0" b="0"/>
-            <wp:docPr id="157625023" name="Picture 157625023"/>
+            <wp:docPr id="1454715411" name="Picture 1454715411"/>
             <wp:cNvGraphicFramePr>
               <a:graphicFrameLocks xmlns:a="http://schemas.openxmlformats.org/drawingml/2006/main" noChangeAspect="1"/>
             </wp:cNvGraphicFramePr>
@@ -7001,10 +7064,10 @@
           <w:noProof/>
         </w:rPr>
         <w:drawing>
-          <wp:inline distT="0" distB="0" distL="0" distR="0" wp14:anchorId="5C4CB40B" wp14:editId="05A3DFDE">
+          <wp:inline distT="0" distB="0" distL="0" distR="0" wp14:anchorId="5FB4FE2A" wp14:editId="3D8781CD">
             <wp:extent cx="5943600" cy="3714750"/>
             <wp:effectExtent l="0" t="0" r="0" b="0"/>
-            <wp:docPr id="1502402205" name="Picture 1502402205"/>
+            <wp:docPr id="1242099391" name="Picture 1242099391"/>
             <wp:cNvGraphicFramePr>
               <a:graphicFrameLocks xmlns:a="http://schemas.openxmlformats.org/drawingml/2006/main" noChangeAspect="1"/>
             </wp:cNvGraphicFramePr>
@@ -7184,10 +7247,10 @@
           <w:noProof/>
         </w:rPr>
         <w:drawing>
-          <wp:inline distT="0" distB="0" distL="0" distR="0" wp14:anchorId="7AD00144" wp14:editId="18CD81B2">
+          <wp:inline distT="0" distB="0" distL="0" distR="0" wp14:anchorId="128B6892" wp14:editId="09376D61">
             <wp:extent cx="5943600" cy="3714750"/>
             <wp:effectExtent l="0" t="0" r="0" b="0"/>
-            <wp:docPr id="1493121816" name="Picture 1493121816"/>
+            <wp:docPr id="530665770" name="Picture 530665770"/>
             <wp:cNvGraphicFramePr>
               <a:graphicFrameLocks xmlns:a="http://schemas.openxmlformats.org/drawingml/2006/main" noChangeAspect="1"/>
             </wp:cNvGraphicFramePr>
@@ -7686,10 +7749,10 @@
         </w:rPr>
         <w:lastRenderedPageBreak/>
         <w:drawing>
-          <wp:inline distT="0" distB="0" distL="0" distR="0" wp14:anchorId="1EF54409" wp14:editId="423FD3DA">
+          <wp:inline distT="0" distB="0" distL="0" distR="0" wp14:anchorId="2E6BC887" wp14:editId="77F8B5E9">
             <wp:extent cx="5943600" cy="3714750"/>
             <wp:effectExtent l="0" t="0" r="0" b="0"/>
-            <wp:docPr id="1169612827" name="Picture 1169612827"/>
+            <wp:docPr id="1820959218" name="Picture 1820959218"/>
             <wp:cNvGraphicFramePr>
               <a:graphicFrameLocks xmlns:a="http://schemas.openxmlformats.org/drawingml/2006/main" noChangeAspect="1"/>
             </wp:cNvGraphicFramePr>
@@ -7895,10 +7958,10 @@
         </w:rPr>
         <w:lastRenderedPageBreak/>
         <w:drawing>
-          <wp:inline distT="0" distB="0" distL="0" distR="0" wp14:anchorId="25AF3015" wp14:editId="4CD45FF5">
+          <wp:inline distT="0" distB="0" distL="0" distR="0" wp14:anchorId="1B67A7CE" wp14:editId="729D3C8F">
             <wp:extent cx="5943600" cy="3714750"/>
             <wp:effectExtent l="0" t="0" r="0" b="0"/>
-            <wp:docPr id="695756764" name="Picture 695756764"/>
+            <wp:docPr id="132738617" name="Picture 132738617"/>
             <wp:cNvGraphicFramePr>
               <a:graphicFrameLocks xmlns:a="http://schemas.openxmlformats.org/drawingml/2006/main" noChangeAspect="1"/>
             </wp:cNvGraphicFramePr>
@@ -8038,10 +8101,10 @@
           <w:noProof/>
         </w:rPr>
         <w:drawing>
-          <wp:inline distT="0" distB="0" distL="0" distR="0" wp14:anchorId="0A721B0A" wp14:editId="56840AB9">
+          <wp:inline distT="0" distB="0" distL="0" distR="0" wp14:anchorId="15293908" wp14:editId="697D9DC7">
             <wp:extent cx="5943600" cy="3714750"/>
             <wp:effectExtent l="0" t="0" r="0" b="0"/>
-            <wp:docPr id="819515200" name="Picture 819515200"/>
+            <wp:docPr id="189574985" name="Picture 189574985"/>
             <wp:cNvGraphicFramePr>
               <a:graphicFrameLocks xmlns:a="http://schemas.openxmlformats.org/drawingml/2006/main" noChangeAspect="1"/>
             </wp:cNvGraphicFramePr>
@@ -8367,10 +8430,10 @@
           <w:noProof/>
         </w:rPr>
         <w:drawing>
-          <wp:inline distT="0" distB="0" distL="0" distR="0" wp14:anchorId="229C4EF9" wp14:editId="618E7248">
+          <wp:inline distT="0" distB="0" distL="0" distR="0" wp14:anchorId="131ACC23" wp14:editId="06162353">
             <wp:extent cx="5943600" cy="3714750"/>
             <wp:effectExtent l="0" t="0" r="0" b="0"/>
-            <wp:docPr id="1584195005" name="Picture 1584195005"/>
+            <wp:docPr id="788371510" name="Picture 788371510"/>
             <wp:cNvGraphicFramePr>
               <a:graphicFrameLocks xmlns:a="http://schemas.openxmlformats.org/drawingml/2006/main" noChangeAspect="1"/>
             </wp:cNvGraphicFramePr>
@@ -8743,10 +8806,10 @@
           <w:noProof/>
         </w:rPr>
         <w:drawing>
-          <wp:inline distT="0" distB="0" distL="0" distR="0" wp14:anchorId="30C32D77" wp14:editId="4AB40AFE">
+          <wp:inline distT="0" distB="0" distL="0" distR="0" wp14:anchorId="1A55DB01" wp14:editId="6ABF8383">
             <wp:extent cx="5943600" cy="3714750"/>
             <wp:effectExtent l="0" t="0" r="0" b="0"/>
-            <wp:docPr id="1648879059" name="Picture 1648879059"/>
+            <wp:docPr id="1181819189" name="Picture 1181819189"/>
             <wp:cNvGraphicFramePr>
               <a:graphicFrameLocks xmlns:a="http://schemas.openxmlformats.org/drawingml/2006/main" noChangeAspect="1"/>
             </wp:cNvGraphicFramePr>
@@ -8896,10 +8959,10 @@
           <w:noProof/>
         </w:rPr>
         <w:drawing>
-          <wp:inline distT="0" distB="0" distL="0" distR="0" wp14:anchorId="7816872A" wp14:editId="134C4EBF">
+          <wp:inline distT="0" distB="0" distL="0" distR="0" wp14:anchorId="502523BD" wp14:editId="3BD8D9C2">
             <wp:extent cx="5943600" cy="3714750"/>
             <wp:effectExtent l="0" t="0" r="0" b="0"/>
-            <wp:docPr id="1592767928" name="Picture 1592767928"/>
+            <wp:docPr id="146259480" name="Picture 146259480"/>
             <wp:cNvGraphicFramePr>
               <a:graphicFrameLocks xmlns:a="http://schemas.openxmlformats.org/drawingml/2006/main" noChangeAspect="1"/>
             </wp:cNvGraphicFramePr>
@@ -10734,10 +10797,10 @@
           <w:noProof/>
         </w:rPr>
         <w:drawing>
-          <wp:inline distT="0" distB="0" distL="0" distR="0" wp14:anchorId="7175ABDB" wp14:editId="4A4EF2C9">
+          <wp:inline distT="0" distB="0" distL="0" distR="0" wp14:anchorId="0926C7FD" wp14:editId="2FD2E697">
             <wp:extent cx="5943600" cy="3714750"/>
             <wp:effectExtent l="0" t="0" r="0" b="0"/>
-            <wp:docPr id="897718221" name="Picture 897718221"/>
+            <wp:docPr id="1833264020" name="Picture 1833264020"/>
             <wp:cNvGraphicFramePr>
               <a:graphicFrameLocks xmlns:a="http://schemas.openxmlformats.org/drawingml/2006/main" noChangeAspect="1"/>
             </wp:cNvGraphicFramePr>
@@ -10956,10 +11019,10 @@
           <w:noProof/>
         </w:rPr>
         <w:drawing>
-          <wp:inline distT="0" distB="0" distL="0" distR="0" wp14:anchorId="51C4D72B" wp14:editId="077F77C6">
+          <wp:inline distT="0" distB="0" distL="0" distR="0" wp14:anchorId="48E4F2BE" wp14:editId="12412C3B">
             <wp:extent cx="5943600" cy="3714750"/>
             <wp:effectExtent l="0" t="0" r="0" b="0"/>
-            <wp:docPr id="189428544" name="Picture 189428544"/>
+            <wp:docPr id="247705817" name="Picture 247705817"/>
             <wp:cNvGraphicFramePr>
               <a:graphicFrameLocks xmlns:a="http://schemas.openxmlformats.org/drawingml/2006/main" noChangeAspect="1"/>
             </wp:cNvGraphicFramePr>
@@ -11637,10 +11700,10 @@
           <w:noProof/>
         </w:rPr>
         <w:drawing>
-          <wp:inline distT="0" distB="0" distL="0" distR="0" wp14:anchorId="402290AA" wp14:editId="0914AA45">
+          <wp:inline distT="0" distB="0" distL="0" distR="0" wp14:anchorId="694A98AA" wp14:editId="6DCFABAA">
             <wp:extent cx="5943600" cy="3714750"/>
             <wp:effectExtent l="0" t="0" r="0" b="0"/>
-            <wp:docPr id="1490713961" name="Picture 1490713961"/>
+            <wp:docPr id="2014289090" name="Picture 2014289090"/>
             <wp:cNvGraphicFramePr>
               <a:graphicFrameLocks xmlns:a="http://schemas.openxmlformats.org/drawingml/2006/main" noChangeAspect="1"/>
             </wp:cNvGraphicFramePr>
@@ -13100,10 +13163,10 @@
           <w:noProof/>
         </w:rPr>
         <w:drawing>
-          <wp:inline distT="0" distB="0" distL="0" distR="0" wp14:anchorId="78D4CABE" wp14:editId="1672C546">
+          <wp:inline distT="0" distB="0" distL="0" distR="0" wp14:anchorId="52F986E7" wp14:editId="49B9265B">
             <wp:extent cx="5943600" cy="3714750"/>
             <wp:effectExtent l="0" t="0" r="0" b="0"/>
-            <wp:docPr id="2066428629" name="Picture 2066428629"/>
+            <wp:docPr id="9279820" name="Picture 9279820"/>
             <wp:cNvGraphicFramePr>
               <a:graphicFrameLocks xmlns:a="http://schemas.openxmlformats.org/drawingml/2006/main" noChangeAspect="1"/>
             </wp:cNvGraphicFramePr>
@@ -13677,10 +13740,10 @@
           <w:noProof/>
         </w:rPr>
         <w:drawing>
-          <wp:inline distT="0" distB="0" distL="0" distR="0" wp14:anchorId="4C06D7C9" wp14:editId="3D910D31">
+          <wp:inline distT="0" distB="0" distL="0" distR="0" wp14:anchorId="5F01541D" wp14:editId="5104BB52">
             <wp:extent cx="5943600" cy="3714750"/>
             <wp:effectExtent l="0" t="0" r="0" b="0"/>
-            <wp:docPr id="1875510973" name="Picture 1875510973"/>
+            <wp:docPr id="588688689" name="Picture 588688689"/>
             <wp:cNvGraphicFramePr>
               <a:graphicFrameLocks xmlns:a="http://schemas.openxmlformats.org/drawingml/2006/main" noChangeAspect="1"/>
             </wp:cNvGraphicFramePr>
@@ -13843,10 +13906,10 @@
           <w:noProof/>
         </w:rPr>
         <w:drawing>
-          <wp:inline distT="0" distB="0" distL="0" distR="0" wp14:anchorId="00B3DC1C" wp14:editId="0F0FC058">
+          <wp:inline distT="0" distB="0" distL="0" distR="0" wp14:anchorId="3D930A03" wp14:editId="4CF3EB08">
             <wp:extent cx="5943600" cy="3714750"/>
             <wp:effectExtent l="0" t="0" r="0" b="0"/>
-            <wp:docPr id="1726339232" name="Picture 1726339232"/>
+            <wp:docPr id="2119022082" name="Picture 2119022082"/>
             <wp:cNvGraphicFramePr>
               <a:graphicFrameLocks xmlns:a="http://schemas.openxmlformats.org/drawingml/2006/main" noChangeAspect="1"/>
             </wp:cNvGraphicFramePr>
@@ -15060,10 +15123,10 @@
           <w:noProof/>
         </w:rPr>
         <w:drawing>
-          <wp:inline distT="0" distB="0" distL="0" distR="0" wp14:anchorId="6A529CDA" wp14:editId="7E5834F7">
+          <wp:inline distT="0" distB="0" distL="0" distR="0" wp14:anchorId="448C78DC" wp14:editId="5C05596D">
             <wp:extent cx="5943600" cy="3714750"/>
             <wp:effectExtent l="0" t="0" r="0" b="0"/>
-            <wp:docPr id="2033201415" name="Picture 2033201415"/>
+            <wp:docPr id="1985317190" name="Picture 1985317190"/>
             <wp:cNvGraphicFramePr>
               <a:graphicFrameLocks xmlns:a="http://schemas.openxmlformats.org/drawingml/2006/main" noChangeAspect="1"/>
             </wp:cNvGraphicFramePr>
@@ -15510,10 +15573,10 @@
           <w:noProof/>
         </w:rPr>
         <w:drawing>
-          <wp:inline distT="0" distB="0" distL="0" distR="0" wp14:anchorId="18F4E11E" wp14:editId="056CF945">
+          <wp:inline distT="0" distB="0" distL="0" distR="0" wp14:anchorId="54448BB4" wp14:editId="64B061D0">
             <wp:extent cx="5943600" cy="3714750"/>
             <wp:effectExtent l="0" t="0" r="0" b="0"/>
-            <wp:docPr id="621571598" name="Picture 621571598"/>
+            <wp:docPr id="1952375224" name="Picture 1952375224"/>
             <wp:cNvGraphicFramePr>
               <a:graphicFrameLocks xmlns:a="http://schemas.openxmlformats.org/drawingml/2006/main" noChangeAspect="1"/>
             </wp:cNvGraphicFramePr>
@@ -21508,7 +21571,7 @@
         <w:sz w:val="16"/>
         <w:szCs w:val="16"/>
       </w:rPr>
-      <w:t>MediaLedger 2.4.0 · User Manual</w:t>
+      <w:t>MediaLedger 2.4.1 · User Manual</w:t>
     </w:r>
   </w:p>
 </w:hdr>
@@ -21527,10 +21590,10 @@
 <file path=word/numbering.xml><?xml version="1.0" encoding="utf-8"?>
 <w:numbering xmlns:wpc="http://schemas.microsoft.com/office/word/2010/wordprocessingCanvas" xmlns:cx="http://schemas.microsoft.com/office/drawing/2014/chartex" xmlns:cx1="http://schemas.microsoft.com/office/drawing/2015/9/8/chartex" xmlns:cx2="http://schemas.microsoft.com/office/drawing/2015/10/21/chartex" xmlns:cx3="http://schemas.microsoft.com/office/drawing/2016/5/9/chartex" xmlns:cx4="http://schemas.microsoft.com/office/drawing/2016/5/10/chartex" xmlns:cx5="http://schemas.microsoft.com/office/drawing/2016/5/11/chartex" xmlns:cx6="http://schemas.microsoft.com/office/drawing/2016/5/12/chartex" xmlns:cx7="http://schemas.microsoft.com/office/drawing/2016/5/13/chartex" xmlns:cx8="http://schemas.microsoft.com/office/drawing/2016/5/14/chartex" xmlns:mc="http://schemas.openxmlformats.org/markup-compatibility/2006" xmlns:aink="http://schemas.microsoft.com/office/drawing/2016/ink" xmlns:am3d="http://schemas.microsoft.com/office/drawing/2017/model3d" xmlns:o="urn:schemas-microsoft-com:office:office" xmlns:oel="http://schemas.microsoft.com/office/2019/extlst" xmlns:r="http://schemas.openxmlformats.org/officeDocument/2006/relationships" xmlns:m="http://schemas.openxmlformats.org/officeDocument/2006/math" xmlns:v="urn:schemas-microsoft-com:vml" xmlns:wp14="http://schemas.microsoft.com/office/word/2010/wordprocessingDrawing" xmlns:wp="http://schemas.openxmlformats.org/drawingml/2006/wordprocessingDrawing" xmlns:w10="urn:schemas-microsoft-com:office:word" xmlns:w="http://schemas.openxmlformats.org/wordprocessingml/2006/main" xmlns:w14="http://schemas.microsoft.com/office/word/2010/wordml" xmlns:w15="http://schemas.microsoft.com/office/word/2012/wordml" xmlns:w16cex="http://schemas.microsoft.com/office/word/2018/wordml/cex" xmlns:w16cid="http://schemas.microsoft.com/office/word/2016/wordml/cid" xmlns:w16="http://schemas.microsoft.com/office/word/2018/wordml" xmlns:w16du="http://schemas.microsoft.com/office/word/2023/wordml/word16du" xmlns:w16sdtdh="http://schemas.microsoft.com/office/word/2020/wordml/sdtdatahash" xmlns:w16sdtfl="http://schemas.microsoft.com/office/word/2024/wordml/sdtformatlock" xmlns:w16se="http://schemas.microsoft.com/office/word/2015/wordml/symex" xmlns:wpg="http://schemas.microsoft.com/office/word/2010/wordprocessingGroup" xmlns:wpi="http://schemas.microsoft.com/office/word/2010/wordprocessingInk" xmlns:wne="http://schemas.microsoft.com/office/word/2006/wordml" xmlns:wps="http://schemas.microsoft.com/office/word/2010/wordprocessingShape" mc:Ignorable="w14 w15 w16se w16cid w16 w16cex w16sdtdh w16sdtfl w16du wp14">
   <w:abstractNum w:abstractNumId="0" w15:restartNumberingAfterBreak="0">
-    <w:nsid w:val="0F457E28"/>
+    <w:nsid w:val="179D1F36"/>
     <w:multiLevelType w:val="hybridMultilevel"/>
-    <w:tmpl w:val="0FE67090"/>
-    <w:lvl w:ilvl="0" w:tplc="E446E786">
+    <w:tmpl w:val="1AA0DC10"/>
+    <w:lvl w:ilvl="0" w:tplc="D3A29FEE">
       <w:start w:val="1"/>
       <w:numFmt w:val="bullet"/>
       <w:lvlText w:val="•"/>
@@ -21539,52 +21602,52 @@
         <w:ind w:left="540" w:hanging="270"/>
       </w:pPr>
     </w:lvl>
-    <w:lvl w:ilvl="1" w:tplc="9CB8D44C">
+    <w:lvl w:ilvl="1" w:tplc="0B4E08AE">
       <w:numFmt w:val="decimal"/>
       <w:lvlText w:val=""/>
       <w:lvlJc w:val="left"/>
     </w:lvl>
-    <w:lvl w:ilvl="2" w:tplc="11148852">
+    <w:lvl w:ilvl="2" w:tplc="7A708A8C">
       <w:numFmt w:val="decimal"/>
       <w:lvlText w:val=""/>
       <w:lvlJc w:val="left"/>
     </w:lvl>
-    <w:lvl w:ilvl="3" w:tplc="29F60AFC">
+    <w:lvl w:ilvl="3" w:tplc="BC3CEFFE">
       <w:numFmt w:val="decimal"/>
       <w:lvlText w:val=""/>
       <w:lvlJc w:val="left"/>
     </w:lvl>
-    <w:lvl w:ilvl="4" w:tplc="A1B2DBE0">
+    <w:lvl w:ilvl="4" w:tplc="870665D6">
       <w:numFmt w:val="decimal"/>
       <w:lvlText w:val=""/>
       <w:lvlJc w:val="left"/>
     </w:lvl>
-    <w:lvl w:ilvl="5" w:tplc="B854DE26">
+    <w:lvl w:ilvl="5" w:tplc="3156FD2A">
       <w:numFmt w:val="decimal"/>
       <w:lvlText w:val=""/>
       <w:lvlJc w:val="left"/>
     </w:lvl>
-    <w:lvl w:ilvl="6" w:tplc="F5B0E77C">
+    <w:lvl w:ilvl="6" w:tplc="BB16B73E">
       <w:numFmt w:val="decimal"/>
       <w:lvlText w:val=""/>
       <w:lvlJc w:val="left"/>
     </w:lvl>
-    <w:lvl w:ilvl="7" w:tplc="1A6AA062">
+    <w:lvl w:ilvl="7" w:tplc="7E0C3900">
       <w:numFmt w:val="decimal"/>
       <w:lvlText w:val=""/>
       <w:lvlJc w:val="left"/>
     </w:lvl>
-    <w:lvl w:ilvl="8" w:tplc="3B5C993E">
+    <w:lvl w:ilvl="8" w:tplc="0CE4C7AE">
       <w:numFmt w:val="decimal"/>
       <w:lvlText w:val=""/>
       <w:lvlJc w:val="left"/>
     </w:lvl>
   </w:abstractNum>
   <w:abstractNum w:abstractNumId="1" w15:restartNumberingAfterBreak="0">
-    <w:nsid w:val="14861F8C"/>
+    <w:nsid w:val="2FC25664"/>
     <w:multiLevelType w:val="hybridMultilevel"/>
-    <w:tmpl w:val="F3E41256"/>
-    <w:lvl w:ilvl="0" w:tplc="E4AE9710">
+    <w:tmpl w:val="FA42467E"/>
+    <w:lvl w:ilvl="0" w:tplc="E3E428D2">
       <w:start w:val="1"/>
       <w:numFmt w:val="decimal"/>
       <w:lvlText w:val="%1."/>
@@ -21593,52 +21656,52 @@
         <w:ind w:left="540" w:hanging="360"/>
       </w:pPr>
     </w:lvl>
-    <w:lvl w:ilvl="1" w:tplc="E0687516">
+    <w:lvl w:ilvl="1" w:tplc="4316259A">
       <w:numFmt w:val="decimal"/>
       <w:lvlText w:val=""/>
       <w:lvlJc w:val="left"/>
     </w:lvl>
-    <w:lvl w:ilvl="2" w:tplc="6AC20A46">
+    <w:lvl w:ilvl="2" w:tplc="ECDC3288">
       <w:numFmt w:val="decimal"/>
       <w:lvlText w:val=""/>
       <w:lvlJc w:val="left"/>
     </w:lvl>
-    <w:lvl w:ilvl="3" w:tplc="9E42F7E6">
+    <w:lvl w:ilvl="3" w:tplc="D76A82D0">
       <w:numFmt w:val="decimal"/>
       <w:lvlText w:val=""/>
       <w:lvlJc w:val="left"/>
     </w:lvl>
-    <w:lvl w:ilvl="4" w:tplc="D24AE556">
+    <w:lvl w:ilvl="4" w:tplc="F322EC26">
       <w:numFmt w:val="decimal"/>
       <w:lvlText w:val=""/>
       <w:lvlJc w:val="left"/>
     </w:lvl>
-    <w:lvl w:ilvl="5" w:tplc="A3EE9192">
+    <w:lvl w:ilvl="5" w:tplc="371E0112">
       <w:numFmt w:val="decimal"/>
       <w:lvlText w:val=""/>
       <w:lvlJc w:val="left"/>
     </w:lvl>
-    <w:lvl w:ilvl="6" w:tplc="37A2A980">
+    <w:lvl w:ilvl="6" w:tplc="87960676">
       <w:numFmt w:val="decimal"/>
       <w:lvlText w:val=""/>
       <w:lvlJc w:val="left"/>
     </w:lvl>
-    <w:lvl w:ilvl="7" w:tplc="284E9280">
+    <w:lvl w:ilvl="7" w:tplc="5A18D4C8">
       <w:numFmt w:val="decimal"/>
       <w:lvlText w:val=""/>
       <w:lvlJc w:val="left"/>
     </w:lvl>
-    <w:lvl w:ilvl="8" w:tplc="C7B04D8A">
+    <w:lvl w:ilvl="8" w:tplc="80721CB6">
       <w:numFmt w:val="decimal"/>
       <w:lvlText w:val=""/>
       <w:lvlJc w:val="left"/>
     </w:lvl>
   </w:abstractNum>
   <w:abstractNum w:abstractNumId="2" w15:restartNumberingAfterBreak="0">
-    <w:nsid w:val="1ECC1E39"/>
+    <w:nsid w:val="48506F87"/>
     <w:multiLevelType w:val="hybridMultilevel"/>
-    <w:tmpl w:val="724C3524"/>
-    <w:lvl w:ilvl="0" w:tplc="FFB42DE2">
+    <w:tmpl w:val="E550D318"/>
+    <w:lvl w:ilvl="0" w:tplc="BD8C2DBE">
       <w:start w:val="1"/>
       <w:numFmt w:val="bullet"/>
       <w:lvlText w:val="●"/>
@@ -21647,7 +21710,7 @@
         <w:ind w:left="720" w:hanging="360"/>
       </w:pPr>
     </w:lvl>
-    <w:lvl w:ilvl="1" w:tplc="ACF827CC">
+    <w:lvl w:ilvl="1" w:tplc="2422B1C6">
       <w:start w:val="1"/>
       <w:numFmt w:val="bullet"/>
       <w:lvlText w:val="○"/>
@@ -21656,7 +21719,7 @@
         <w:ind w:left="1440" w:hanging="360"/>
       </w:pPr>
     </w:lvl>
-    <w:lvl w:ilvl="2" w:tplc="0D2C9634">
+    <w:lvl w:ilvl="2" w:tplc="72F004FA">
       <w:start w:val="1"/>
       <w:numFmt w:val="bullet"/>
       <w:lvlText w:val="■"/>
@@ -21665,7 +21728,7 @@
         <w:ind w:left="2160" w:hanging="360"/>
       </w:pPr>
     </w:lvl>
-    <w:lvl w:ilvl="3" w:tplc="F5265E32">
+    <w:lvl w:ilvl="3" w:tplc="377CD9C8">
       <w:start w:val="1"/>
       <w:numFmt w:val="bullet"/>
       <w:lvlText w:val="●"/>
@@ -21674,7 +21737,7 @@
         <w:ind w:left="2880" w:hanging="360"/>
       </w:pPr>
     </w:lvl>
-    <w:lvl w:ilvl="4" w:tplc="0240AB80">
+    <w:lvl w:ilvl="4" w:tplc="89C01818">
       <w:start w:val="1"/>
       <w:numFmt w:val="bullet"/>
       <w:lvlText w:val="○"/>
@@ -21683,7 +21746,7 @@
         <w:ind w:left="3600" w:hanging="360"/>
       </w:pPr>
     </w:lvl>
-    <w:lvl w:ilvl="5" w:tplc="DC400AEC">
+    <w:lvl w:ilvl="5" w:tplc="BED480B4">
       <w:start w:val="1"/>
       <w:numFmt w:val="bullet"/>
       <w:lvlText w:val="■"/>
@@ -21692,7 +21755,7 @@
         <w:ind w:left="4320" w:hanging="360"/>
       </w:pPr>
     </w:lvl>
-    <w:lvl w:ilvl="6" w:tplc="6BD402E4">
+    <w:lvl w:ilvl="6" w:tplc="0C1CEE72">
       <w:start w:val="1"/>
       <w:numFmt w:val="bullet"/>
       <w:lvlText w:val="●"/>
@@ -21701,7 +21764,7 @@
         <w:ind w:left="5040" w:hanging="360"/>
       </w:pPr>
     </w:lvl>
-    <w:lvl w:ilvl="7" w:tplc="21FC3896">
+    <w:lvl w:ilvl="7" w:tplc="5090FEA2">
       <w:start w:val="1"/>
       <w:numFmt w:val="bullet"/>
       <w:lvlText w:val="●"/>
@@ -21710,7 +21773,7 @@
         <w:ind w:left="5760" w:hanging="360"/>
       </w:pPr>
     </w:lvl>
-    <w:lvl w:ilvl="8" w:tplc="59963094">
+    <w:lvl w:ilvl="8" w:tplc="32240A04">
       <w:start w:val="1"/>
       <w:numFmt w:val="bullet"/>
       <w:lvlText w:val="●"/>
@@ -21720,67 +21783,67 @@
       </w:pPr>
     </w:lvl>
   </w:abstractNum>
-  <w:num w:numId="1" w16cid:durableId="15736242">
+  <w:num w:numId="1" w16cid:durableId="1968003124">
     <w:abstractNumId w:val="2"/>
     <w:lvlOverride w:ilvl="0">
       <w:startOverride w:val="1"/>
     </w:lvlOverride>
   </w:num>
-  <w:num w:numId="2" w16cid:durableId="2062632837">
+  <w:num w:numId="2" w16cid:durableId="1326589029">
     <w:abstractNumId w:val="0"/>
     <w:lvlOverride w:ilvl="0">
       <w:startOverride w:val="1"/>
     </w:lvlOverride>
   </w:num>
-  <w:num w:numId="3" w16cid:durableId="1860000063">
+  <w:num w:numId="3" w16cid:durableId="1954164147">
     <w:abstractNumId w:val="1"/>
     <w:lvlOverride w:ilvl="0">
       <w:startOverride w:val="1"/>
     </w:lvlOverride>
   </w:num>
-  <w:num w:numId="4" w16cid:durableId="407776778">
+  <w:num w:numId="4" w16cid:durableId="1654606016">
     <w:abstractNumId w:val="1"/>
     <w:lvlOverride w:ilvl="0">
       <w:startOverride w:val="1"/>
     </w:lvlOverride>
   </w:num>
-  <w:num w:numId="5" w16cid:durableId="1421295846">
+  <w:num w:numId="5" w16cid:durableId="1374306498">
     <w:abstractNumId w:val="1"/>
     <w:lvlOverride w:ilvl="0">
       <w:startOverride w:val="1"/>
     </w:lvlOverride>
   </w:num>
-  <w:num w:numId="6" w16cid:durableId="359362017">
+  <w:num w:numId="6" w16cid:durableId="306394758">
     <w:abstractNumId w:val="1"/>
     <w:lvlOverride w:ilvl="0">
       <w:startOverride w:val="1"/>
     </w:lvlOverride>
   </w:num>
-  <w:num w:numId="7" w16cid:durableId="1808934737">
+  <w:num w:numId="7" w16cid:durableId="1918051894">
     <w:abstractNumId w:val="1"/>
     <w:lvlOverride w:ilvl="0">
       <w:startOverride w:val="1"/>
     </w:lvlOverride>
   </w:num>
-  <w:num w:numId="8" w16cid:durableId="1703556346">
+  <w:num w:numId="8" w16cid:durableId="585656067">
     <w:abstractNumId w:val="1"/>
     <w:lvlOverride w:ilvl="0">
       <w:startOverride w:val="1"/>
     </w:lvlOverride>
   </w:num>
-  <w:num w:numId="9" w16cid:durableId="1217083948">
+  <w:num w:numId="9" w16cid:durableId="1718047097">
     <w:abstractNumId w:val="1"/>
     <w:lvlOverride w:ilvl="0">
       <w:startOverride w:val="1"/>
     </w:lvlOverride>
   </w:num>
-  <w:num w:numId="10" w16cid:durableId="1332290402">
+  <w:num w:numId="10" w16cid:durableId="1714815904">
     <w:abstractNumId w:val="1"/>
     <w:lvlOverride w:ilvl="0">
       <w:startOverride w:val="1"/>
     </w:lvlOverride>
   </w:num>
-  <w:num w:numId="11" w16cid:durableId="2096247477">
+  <w:num w:numId="11" w16cid:durableId="1112821193">
     <w:abstractNumId w:val="1"/>
     <w:lvlOverride w:ilvl="0">
       <w:startOverride w:val="1"/>
@@ -22400,7 +22463,7 @@
     <w:link w:val="HeaderChar"/>
     <w:uiPriority w:val="99"/>
     <w:unhideWhenUsed/>
-    <w:rsid w:val="00131840"/>
+    <w:rsid w:val="00796592"/>
     <w:pPr>
       <w:tabs>
         <w:tab w:val="center" w:pos="4680"/>
@@ -22413,7 +22476,7 @@
     <w:basedOn w:val="DefaultParagraphFont"/>
     <w:link w:val="Header"/>
     <w:uiPriority w:val="99"/>
-    <w:rsid w:val="00131840"/>
+    <w:rsid w:val="00796592"/>
   </w:style>
   <w:style w:type="paragraph" w:styleId="Footer">
     <w:name w:val="footer"/>
@@ -22421,7 +22484,7 @@
     <w:link w:val="FooterChar"/>
     <w:uiPriority w:val="99"/>
     <w:unhideWhenUsed/>
-    <w:rsid w:val="00131840"/>
+    <w:rsid w:val="00796592"/>
     <w:pPr>
       <w:tabs>
         <w:tab w:val="center" w:pos="4680"/>
@@ -22434,7 +22497,7 @@
     <w:basedOn w:val="DefaultParagraphFont"/>
     <w:link w:val="Footer"/>
     <w:uiPriority w:val="99"/>
-    <w:rsid w:val="00131840"/>
+    <w:rsid w:val="00796592"/>
   </w:style>
 </w:styles>
 </file>

</xml_diff>